<commit_message>
GA-RX/Kanal talebi eklendi; talep sayisi 22'ye cikti
Tablo B: Taslak 12 (BTK+Adalet Bak.) eklendi; matrise GA-RX/Kanal satiri;
Taslak 9/10/11 baslik stili + eksik muhatap satirlari; GA-1 dayanak duzeltmesi.
Analiz S6 talep tablosuna GA-RX/Kanal satiri (22 talep, yeniden numaralandi).
Envanter: ilgili satir kodu GA-RX/Kanal olarak hizalandi.
README, index.html: "21 talep" -> "22 talep". CHANGELOG guncellendi.

Co-Authored-By: Claude Opus 4.8 <noreply@anthropic.com>
</commit_message>
<xml_diff>
--- a/Amator_Telsizcilik_Tablo_A_Mevzuat_Analizi_v1.0.docx
+++ b/Amator_Telsizcilik_Tablo_A_Mevzuat_Analizi_v1.0.docx
@@ -10715,13 +10715,6 @@
           </w:tcPr>
           <w:p>
             <w:r>
-              <w:rPr>
-                <w:b/>
-                <w:bCs/>
-                <w:color w:val="000000"/>
-                <w:sz w:val="18"/>
-                <w:szCs w:val="18"/>
-              </w:rPr>
               <w:t>1</w:t>
             </w:r>
           </w:p>
@@ -10887,13 +10880,6 @@
           </w:tcPr>
           <w:p>
             <w:r>
-              <w:rPr>
-                <w:b/>
-                <w:bCs/>
-                <w:color w:val="000000"/>
-                <w:sz w:val="18"/>
-                <w:szCs w:val="18"/>
-              </w:rPr>
               <w:t>2</w:t>
             </w:r>
           </w:p>
@@ -11059,13 +11045,6 @@
           </w:tcPr>
           <w:p>
             <w:r>
-              <w:rPr>
-                <w:b/>
-                <w:bCs/>
-                <w:color w:val="000000"/>
-                <w:sz w:val="18"/>
-                <w:szCs w:val="18"/>
-              </w:rPr>
               <w:t>3</w:t>
             </w:r>
           </w:p>
@@ -11231,13 +11210,6 @@
           </w:tcPr>
           <w:p>
             <w:r>
-              <w:rPr>
-                <w:b/>
-                <w:bCs/>
-                <w:color w:val="000000"/>
-                <w:sz w:val="18"/>
-                <w:szCs w:val="18"/>
-              </w:rPr>
               <w:t>4</w:t>
             </w:r>
           </w:p>
@@ -11403,13 +11375,6 @@
           </w:tcPr>
           <w:p>
             <w:r>
-              <w:rPr>
-                <w:b/>
-                <w:bCs/>
-                <w:color w:val="000000"/>
-                <w:sz w:val="18"/>
-                <w:szCs w:val="18"/>
-              </w:rPr>
               <w:t>5</w:t>
             </w:r>
           </w:p>
@@ -11433,12 +11398,7 @@
           </w:tcPr>
           <w:p>
             <w:r>
-              <w:rPr>
-                <w:color w:val="000000"/>
-                <w:sz w:val="18"/>
-                <w:szCs w:val="18"/>
-              </w:rPr>
-              <w:t>GA-DIG</w:t>
+              <w:t>GA-RX/Kanal</w:t>
             </w:r>
           </w:p>
         </w:tc>
@@ -11461,12 +11421,7 @@
           </w:tcPr>
           <w:p>
             <w:r>
-              <w:rPr>
-                <w:color w:val="000000"/>
-                <w:sz w:val="18"/>
-                <w:szCs w:val="18"/>
-              </w:rPr>
-              <w:t>TAD 2021 güncelleme: FT8/Winlink/DMR/SDR</w:t>
+              <w:t>Kanal hafızası frekans kaydı — teknik açıklama ve delil takdiri</w:t>
             </w:r>
           </w:p>
         </w:tc>
@@ -11489,12 +11444,7 @@
           </w:tcPr>
           <w:p>
             <w:r>
-              <w:rPr>
-                <w:color w:val="000000"/>
-                <w:sz w:val="18"/>
-                <w:szCs w:val="18"/>
-              </w:rPr>
-              <w:t>BTK</w:t>
+              <w:t>BTK + Adalet Bak.</w:t>
             </w:r>
           </w:p>
         </w:tc>
@@ -11517,12 +11467,7 @@
           </w:tcPr>
           <w:p>
             <w:r>
-              <w:rPr>
-                <w:color w:val="000000"/>
-                <w:sz w:val="18"/>
-                <w:szCs w:val="18"/>
-              </w:rPr>
-              <w:t>Yüksek</w:t>
+              <w:t>Orta</w:t>
             </w:r>
           </w:p>
         </w:tc>
@@ -11545,12 +11490,7 @@
           </w:tcPr>
           <w:p>
             <w:r>
-              <w:rPr>
-                <w:color w:val="000000"/>
-                <w:sz w:val="18"/>
-                <w:szCs w:val="18"/>
-              </w:rPr>
-              <w:t>Dijital kullanıcıları</w:t>
+              <w:t>Tüm amatörler</w:t>
             </w:r>
           </w:p>
         </w:tc>
@@ -11575,27 +11515,48 @@
           </w:tcPr>
           <w:p>
             <w:r>
-              <w:rPr>
-                <w:b/>
-                <w:bCs/>
+              <w:t>6</w:t>
+            </w:r>
+          </w:p>
+        </w:tc>
+        <w:tc>
+          <w:tcPr>
+            <w:tcW w:w="1222" w:type="dxa"/>
+            <w:tcBorders>
+              <w:top w:val="single" w:sz="1" w:space="0" w:color="AAAAAA"/>
+              <w:left w:val="single" w:sz="1" w:space="0" w:color="AAAAAA"/>
+              <w:bottom w:val="single" w:sz="1" w:space="0" w:color="AAAAAA"/>
+              <w:right w:val="single" w:sz="1" w:space="0" w:color="AAAAAA"/>
+            </w:tcBorders>
+            <w:shd w:val="clear" w:color="auto" w:fill="FFF2CC"/>
+            <w:tcMar>
+              <w:top w:w="80" w:type="dxa"/>
+              <w:left w:w="120" w:type="dxa"/>
+              <w:bottom w:w="80" w:type="dxa"/>
+              <w:right w:w="120" w:type="dxa"/>
+            </w:tcMar>
+          </w:tcPr>
+          <w:p>
+            <w:r>
+              <w:rPr>
                 <w:color w:val="000000"/>
                 <w:sz w:val="18"/>
                 <w:szCs w:val="18"/>
               </w:rPr>
-              <w:t>6</w:t>
-            </w:r>
-          </w:p>
-        </w:tc>
-        <w:tc>
-          <w:tcPr>
-            <w:tcW w:w="1222" w:type="dxa"/>
-            <w:tcBorders>
-              <w:top w:val="single" w:sz="1" w:space="0" w:color="AAAAAA"/>
-              <w:left w:val="single" w:sz="1" w:space="0" w:color="AAAAAA"/>
-              <w:bottom w:val="single" w:sz="1" w:space="0" w:color="AAAAAA"/>
-              <w:right w:val="single" w:sz="1" w:space="0" w:color="AAAAAA"/>
-            </w:tcBorders>
-            <w:shd w:val="clear" w:color="auto" w:fill="FFF2CC"/>
+              <w:t>GA-DIG</w:t>
+            </w:r>
+          </w:p>
+        </w:tc>
+        <w:tc>
+          <w:tcPr>
+            <w:tcW w:w="2835" w:type="dxa"/>
+            <w:tcBorders>
+              <w:top w:val="single" w:sz="1" w:space="0" w:color="AAAAAA"/>
+              <w:left w:val="single" w:sz="1" w:space="0" w:color="AAAAAA"/>
+              <w:bottom w:val="single" w:sz="1" w:space="0" w:color="AAAAAA"/>
+              <w:right w:val="single" w:sz="1" w:space="0" w:color="AAAAAA"/>
+            </w:tcBorders>
+            <w:shd w:val="clear" w:color="auto" w:fill="FFFFFF"/>
             <w:tcMar>
               <w:top w:w="80" w:type="dxa"/>
               <w:left w:w="120" w:type="dxa"/>
@@ -11610,13 +11571,13 @@
                 <w:sz w:val="18"/>
                 <w:szCs w:val="18"/>
               </w:rPr>
-              <w:t>GA-6</w:t>
-            </w:r>
-          </w:p>
-        </w:tc>
-        <w:tc>
-          <w:tcPr>
-            <w:tcW w:w="2835" w:type="dxa"/>
+              <w:t>TAD 2021 güncelleme: FT8/Winlink/DMR/SDR</w:t>
+            </w:r>
+          </w:p>
+        </w:tc>
+        <w:tc>
+          <w:tcPr>
+            <w:tcW w:w="1593" w:type="dxa"/>
             <w:tcBorders>
               <w:top w:val="single" w:sz="1" w:space="0" w:color="AAAAAA"/>
               <w:left w:val="single" w:sz="1" w:space="0" w:color="AAAAAA"/>
@@ -11638,13 +11599,13 @@
                 <w:sz w:val="18"/>
                 <w:szCs w:val="18"/>
               </w:rPr>
-              <w:t>Anten kurulum güvencesi (KMK uyum)</w:t>
-            </w:r>
-          </w:p>
-        </w:tc>
-        <w:tc>
-          <w:tcPr>
-            <w:tcW w:w="1593" w:type="dxa"/>
+              <w:t>BTK</w:t>
+            </w:r>
+          </w:p>
+        </w:tc>
+        <w:tc>
+          <w:tcPr>
+            <w:tcW w:w="1377" w:type="dxa"/>
             <w:tcBorders>
               <w:top w:val="single" w:sz="1" w:space="0" w:color="AAAAAA"/>
               <w:left w:val="single" w:sz="1" w:space="0" w:color="AAAAAA"/>
@@ -11666,13 +11627,13 @@
                 <w:sz w:val="18"/>
                 <w:szCs w:val="18"/>
               </w:rPr>
-              <w:t>Çevre Bak./BTK</w:t>
-            </w:r>
-          </w:p>
-        </w:tc>
-        <w:tc>
-          <w:tcPr>
-            <w:tcW w:w="1377" w:type="dxa"/>
+              <w:t>Yüksek</w:t>
+            </w:r>
+          </w:p>
+        </w:tc>
+        <w:tc>
+          <w:tcPr>
+            <w:tcW w:w="1510" w:type="dxa"/>
             <w:tcBorders>
               <w:top w:val="single" w:sz="1" w:space="0" w:color="AAAAAA"/>
               <w:left w:val="single" w:sz="1" w:space="0" w:color="AAAAAA"/>
@@ -11694,35 +11655,7 @@
                 <w:sz w:val="18"/>
                 <w:szCs w:val="18"/>
               </w:rPr>
-              <w:t>Yüksek</w:t>
-            </w:r>
-          </w:p>
-        </w:tc>
-        <w:tc>
-          <w:tcPr>
-            <w:tcW w:w="1510" w:type="dxa"/>
-            <w:tcBorders>
-              <w:top w:val="single" w:sz="1" w:space="0" w:color="AAAAAA"/>
-              <w:left w:val="single" w:sz="1" w:space="0" w:color="AAAAAA"/>
-              <w:bottom w:val="single" w:sz="1" w:space="0" w:color="AAAAAA"/>
-              <w:right w:val="single" w:sz="1" w:space="0" w:color="AAAAAA"/>
-            </w:tcBorders>
-            <w:shd w:val="clear" w:color="auto" w:fill="FFFFFF"/>
-            <w:tcMar>
-              <w:top w:w="80" w:type="dxa"/>
-              <w:left w:w="120" w:type="dxa"/>
-              <w:bottom w:w="80" w:type="dxa"/>
-              <w:right w:w="120" w:type="dxa"/>
-            </w:tcMar>
-          </w:tcPr>
-          <w:p>
-            <w:r>
-              <w:rPr>
-                <w:color w:val="000000"/>
-                <w:sz w:val="18"/>
-                <w:szCs w:val="18"/>
-              </w:rPr>
-              <w:t>Sabit istasyonlar</w:t>
+              <w:t>Dijital kullanıcıları</w:t>
             </w:r>
           </w:p>
         </w:tc>
@@ -11737,37 +11670,58 @@
               <w:bottom w:val="single" w:sz="1" w:space="0" w:color="AAAAAA"/>
               <w:right w:val="single" w:sz="1" w:space="0" w:color="AAAAAA"/>
             </w:tcBorders>
-            <w:shd w:val="clear" w:color="auto" w:fill="E2EFDA"/>
-            <w:tcMar>
-              <w:top w:w="80" w:type="dxa"/>
-              <w:left w:w="120" w:type="dxa"/>
-              <w:bottom w:w="80" w:type="dxa"/>
-              <w:right w:w="120" w:type="dxa"/>
-            </w:tcMar>
-          </w:tcPr>
-          <w:p>
-            <w:r>
-              <w:rPr>
-                <w:b/>
-                <w:bCs/>
+            <w:shd w:val="clear" w:color="auto" w:fill="FFF2CC"/>
+            <w:tcMar>
+              <w:top w:w="80" w:type="dxa"/>
+              <w:left w:w="120" w:type="dxa"/>
+              <w:bottom w:w="80" w:type="dxa"/>
+              <w:right w:w="120" w:type="dxa"/>
+            </w:tcMar>
+          </w:tcPr>
+          <w:p>
+            <w:r>
+              <w:t>7</w:t>
+            </w:r>
+          </w:p>
+        </w:tc>
+        <w:tc>
+          <w:tcPr>
+            <w:tcW w:w="1222" w:type="dxa"/>
+            <w:tcBorders>
+              <w:top w:val="single" w:sz="1" w:space="0" w:color="AAAAAA"/>
+              <w:left w:val="single" w:sz="1" w:space="0" w:color="AAAAAA"/>
+              <w:bottom w:val="single" w:sz="1" w:space="0" w:color="AAAAAA"/>
+              <w:right w:val="single" w:sz="1" w:space="0" w:color="AAAAAA"/>
+            </w:tcBorders>
+            <w:shd w:val="clear" w:color="auto" w:fill="FFF2CC"/>
+            <w:tcMar>
+              <w:top w:w="80" w:type="dxa"/>
+              <w:left w:w="120" w:type="dxa"/>
+              <w:bottom w:w="80" w:type="dxa"/>
+              <w:right w:w="120" w:type="dxa"/>
+            </w:tcMar>
+          </w:tcPr>
+          <w:p>
+            <w:r>
+              <w:rPr>
                 <w:color w:val="000000"/>
                 <w:sz w:val="18"/>
                 <w:szCs w:val="18"/>
               </w:rPr>
-              <w:t>7</w:t>
-            </w:r>
-          </w:p>
-        </w:tc>
-        <w:tc>
-          <w:tcPr>
-            <w:tcW w:w="1222" w:type="dxa"/>
-            <w:tcBorders>
-              <w:top w:val="single" w:sz="1" w:space="0" w:color="AAAAAA"/>
-              <w:left w:val="single" w:sz="1" w:space="0" w:color="AAAAAA"/>
-              <w:bottom w:val="single" w:sz="1" w:space="0" w:color="AAAAAA"/>
-              <w:right w:val="single" w:sz="1" w:space="0" w:color="AAAAAA"/>
-            </w:tcBorders>
-            <w:shd w:val="clear" w:color="auto" w:fill="E2EFDA"/>
+              <w:t>GA-6</w:t>
+            </w:r>
+          </w:p>
+        </w:tc>
+        <w:tc>
+          <w:tcPr>
+            <w:tcW w:w="2835" w:type="dxa"/>
+            <w:tcBorders>
+              <w:top w:val="single" w:sz="1" w:space="0" w:color="AAAAAA"/>
+              <w:left w:val="single" w:sz="1" w:space="0" w:color="AAAAAA"/>
+              <w:bottom w:val="single" w:sz="1" w:space="0" w:color="AAAAAA"/>
+              <w:right w:val="single" w:sz="1" w:space="0" w:color="AAAAAA"/>
+            </w:tcBorders>
+            <w:shd w:val="clear" w:color="auto" w:fill="FFFFFF"/>
             <w:tcMar>
               <w:top w:w="80" w:type="dxa"/>
               <w:left w:w="120" w:type="dxa"/>
@@ -11782,13 +11736,13 @@
                 <w:sz w:val="18"/>
                 <w:szCs w:val="18"/>
               </w:rPr>
-              <w:t>GA-CROSS</w:t>
-            </w:r>
-          </w:p>
-        </w:tc>
-        <w:tc>
-          <w:tcPr>
-            <w:tcW w:w="2835" w:type="dxa"/>
+              <w:t>Anten kurulum güvencesi (KMK uyum)</w:t>
+            </w:r>
+          </w:p>
+        </w:tc>
+        <w:tc>
+          <w:tcPr>
+            <w:tcW w:w="1593" w:type="dxa"/>
             <w:tcBorders>
               <w:top w:val="single" w:sz="1" w:space="0" w:color="AAAAAA"/>
               <w:left w:val="single" w:sz="1" w:space="0" w:color="AAAAAA"/>
@@ -11810,13 +11764,13 @@
                 <w:sz w:val="18"/>
                 <w:szCs w:val="18"/>
               </w:rPr>
-              <w:t>Bireysel role ve APRS yasallaştırılması</w:t>
-            </w:r>
-          </w:p>
-        </w:tc>
-        <w:tc>
-          <w:tcPr>
-            <w:tcW w:w="1593" w:type="dxa"/>
+              <w:t>Çevre Bak./BTK</w:t>
+            </w:r>
+          </w:p>
+        </w:tc>
+        <w:tc>
+          <w:tcPr>
+            <w:tcW w:w="1377" w:type="dxa"/>
             <w:tcBorders>
               <w:top w:val="single" w:sz="1" w:space="0" w:color="AAAAAA"/>
               <w:left w:val="single" w:sz="1" w:space="0" w:color="AAAAAA"/>
@@ -11838,13 +11792,13 @@
                 <w:sz w:val="18"/>
                 <w:szCs w:val="18"/>
               </w:rPr>
-              <w:t>BTK/KEGM</w:t>
-            </w:r>
-          </w:p>
-        </w:tc>
-        <w:tc>
-          <w:tcPr>
-            <w:tcW w:w="1377" w:type="dxa"/>
+              <w:t>Yüksek</w:t>
+            </w:r>
+          </w:p>
+        </w:tc>
+        <w:tc>
+          <w:tcPr>
+            <w:tcW w:w="1510" w:type="dxa"/>
             <w:tcBorders>
               <w:top w:val="single" w:sz="1" w:space="0" w:color="AAAAAA"/>
               <w:left w:val="single" w:sz="1" w:space="0" w:color="AAAAAA"/>
@@ -11866,35 +11820,7 @@
                 <w:sz w:val="18"/>
                 <w:szCs w:val="18"/>
               </w:rPr>
-              <w:t>Orta</w:t>
-            </w:r>
-          </w:p>
-        </w:tc>
-        <w:tc>
-          <w:tcPr>
-            <w:tcW w:w="1510" w:type="dxa"/>
-            <w:tcBorders>
-              <w:top w:val="single" w:sz="1" w:space="0" w:color="AAAAAA"/>
-              <w:left w:val="single" w:sz="1" w:space="0" w:color="AAAAAA"/>
-              <w:bottom w:val="single" w:sz="1" w:space="0" w:color="AAAAAA"/>
-              <w:right w:val="single" w:sz="1" w:space="0" w:color="AAAAAA"/>
-            </w:tcBorders>
-            <w:shd w:val="clear" w:color="auto" w:fill="FFFFFF"/>
-            <w:tcMar>
-              <w:top w:w="80" w:type="dxa"/>
-              <w:left w:w="120" w:type="dxa"/>
-              <w:bottom w:w="80" w:type="dxa"/>
-              <w:right w:w="120" w:type="dxa"/>
-            </w:tcMar>
-          </w:tcPr>
-          <w:p>
-            <w:r>
-              <w:rPr>
-                <w:color w:val="000000"/>
-                <w:sz w:val="18"/>
-                <w:szCs w:val="18"/>
-              </w:rPr>
-              <w:t>Role/APRS kullan.</w:t>
+              <w:t>Sabit istasyonlar</w:t>
             </w:r>
           </w:p>
         </w:tc>
@@ -11919,27 +11845,48 @@
           </w:tcPr>
           <w:p>
             <w:r>
-              <w:rPr>
-                <w:b/>
-                <w:bCs/>
+              <w:t>8</w:t>
+            </w:r>
+          </w:p>
+        </w:tc>
+        <w:tc>
+          <w:tcPr>
+            <w:tcW w:w="1222" w:type="dxa"/>
+            <w:tcBorders>
+              <w:top w:val="single" w:sz="1" w:space="0" w:color="AAAAAA"/>
+              <w:left w:val="single" w:sz="1" w:space="0" w:color="AAAAAA"/>
+              <w:bottom w:val="single" w:sz="1" w:space="0" w:color="AAAAAA"/>
+              <w:right w:val="single" w:sz="1" w:space="0" w:color="AAAAAA"/>
+            </w:tcBorders>
+            <w:shd w:val="clear" w:color="auto" w:fill="E2EFDA"/>
+            <w:tcMar>
+              <w:top w:w="80" w:type="dxa"/>
+              <w:left w:w="120" w:type="dxa"/>
+              <w:bottom w:w="80" w:type="dxa"/>
+              <w:right w:w="120" w:type="dxa"/>
+            </w:tcMar>
+          </w:tcPr>
+          <w:p>
+            <w:r>
+              <w:rPr>
                 <w:color w:val="000000"/>
                 <w:sz w:val="18"/>
                 <w:szCs w:val="18"/>
               </w:rPr>
-              <w:t>8</w:t>
-            </w:r>
-          </w:p>
-        </w:tc>
-        <w:tc>
-          <w:tcPr>
-            <w:tcW w:w="1222" w:type="dxa"/>
-            <w:tcBorders>
-              <w:top w:val="single" w:sz="1" w:space="0" w:color="AAAAAA"/>
-              <w:left w:val="single" w:sz="1" w:space="0" w:color="AAAAAA"/>
-              <w:bottom w:val="single" w:sz="1" w:space="0" w:color="AAAAAA"/>
-              <w:right w:val="single" w:sz="1" w:space="0" w:color="AAAAAA"/>
-            </w:tcBorders>
-            <w:shd w:val="clear" w:color="auto" w:fill="E2EFDA"/>
+              <w:t>GA-CROSS</w:t>
+            </w:r>
+          </w:p>
+        </w:tc>
+        <w:tc>
+          <w:tcPr>
+            <w:tcW w:w="2835" w:type="dxa"/>
+            <w:tcBorders>
+              <w:top w:val="single" w:sz="1" w:space="0" w:color="AAAAAA"/>
+              <w:left w:val="single" w:sz="1" w:space="0" w:color="AAAAAA"/>
+              <w:bottom w:val="single" w:sz="1" w:space="0" w:color="AAAAAA"/>
+              <w:right w:val="single" w:sz="1" w:space="0" w:color="AAAAAA"/>
+            </w:tcBorders>
+            <w:shd w:val="clear" w:color="auto" w:fill="FFFFFF"/>
             <w:tcMar>
               <w:top w:w="80" w:type="dxa"/>
               <w:left w:w="120" w:type="dxa"/>
@@ -11954,13 +11901,13 @@
                 <w:sz w:val="18"/>
                 <w:szCs w:val="18"/>
               </w:rPr>
-              <w:t>GA-NODE</w:t>
-            </w:r>
-          </w:p>
-        </w:tc>
-        <w:tc>
-          <w:tcPr>
-            <w:tcW w:w="2835" w:type="dxa"/>
+              <w:t>Bireysel role ve APRS yasallaştırılması</w:t>
+            </w:r>
+          </w:p>
+        </w:tc>
+        <w:tc>
+          <w:tcPr>
+            <w:tcW w:w="1593" w:type="dxa"/>
             <w:tcBorders>
               <w:top w:val="single" w:sz="1" w:space="0" w:color="AAAAAA"/>
               <w:left w:val="single" w:sz="1" w:space="0" w:color="AAAAAA"/>
@@ -11982,13 +11929,13 @@
                 <w:sz w:val="18"/>
                 <w:szCs w:val="18"/>
               </w:rPr>
-              <w:t>EchoLink/WebSDR — RTUK/BTK ortak teyit</w:t>
-            </w:r>
-          </w:p>
-        </w:tc>
-        <w:tc>
-          <w:tcPr>
-            <w:tcW w:w="1593" w:type="dxa"/>
+              <w:t>BTK/KEGM</w:t>
+            </w:r>
+          </w:p>
+        </w:tc>
+        <w:tc>
+          <w:tcPr>
+            <w:tcW w:w="1377" w:type="dxa"/>
             <w:tcBorders>
               <w:top w:val="single" w:sz="1" w:space="0" w:color="AAAAAA"/>
               <w:left w:val="single" w:sz="1" w:space="0" w:color="AAAAAA"/>
@@ -12010,13 +11957,13 @@
                 <w:sz w:val="18"/>
                 <w:szCs w:val="18"/>
               </w:rPr>
-              <w:t>BTK+RTUK</w:t>
-            </w:r>
-          </w:p>
-        </w:tc>
-        <w:tc>
-          <w:tcPr>
-            <w:tcW w:w="1377" w:type="dxa"/>
+              <w:t>Orta</w:t>
+            </w:r>
+          </w:p>
+        </w:tc>
+        <w:tc>
+          <w:tcPr>
+            <w:tcW w:w="1510" w:type="dxa"/>
             <w:tcBorders>
               <w:top w:val="single" w:sz="1" w:space="0" w:color="AAAAAA"/>
               <w:left w:val="single" w:sz="1" w:space="0" w:color="AAAAAA"/>
@@ -12038,35 +11985,7 @@
                 <w:sz w:val="18"/>
                 <w:szCs w:val="18"/>
               </w:rPr>
-              <w:t>Orta</w:t>
-            </w:r>
-          </w:p>
-        </w:tc>
-        <w:tc>
-          <w:tcPr>
-            <w:tcW w:w="1510" w:type="dxa"/>
-            <w:tcBorders>
-              <w:top w:val="single" w:sz="1" w:space="0" w:color="AAAAAA"/>
-              <w:left w:val="single" w:sz="1" w:space="0" w:color="AAAAAA"/>
-              <w:bottom w:val="single" w:sz="1" w:space="0" w:color="AAAAAA"/>
-              <w:right w:val="single" w:sz="1" w:space="0" w:color="AAAAAA"/>
-            </w:tcBorders>
-            <w:shd w:val="clear" w:color="auto" w:fill="FFFFFF"/>
-            <w:tcMar>
-              <w:top w:w="80" w:type="dxa"/>
-              <w:left w:w="120" w:type="dxa"/>
-              <w:bottom w:w="80" w:type="dxa"/>
-              <w:right w:w="120" w:type="dxa"/>
-            </w:tcMar>
-          </w:tcPr>
-          <w:p>
-            <w:r>
-              <w:rPr>
-                <w:color w:val="000000"/>
-                <w:sz w:val="18"/>
-                <w:szCs w:val="18"/>
-              </w:rPr>
-              <w:t>Node işleticileri</w:t>
+              <w:t>Role/APRS kullan.</w:t>
             </w:r>
           </w:p>
         </w:tc>
@@ -12091,27 +12010,48 @@
           </w:tcPr>
           <w:p>
             <w:r>
-              <w:rPr>
-                <w:b/>
-                <w:bCs/>
+              <w:t>9</w:t>
+            </w:r>
+          </w:p>
+        </w:tc>
+        <w:tc>
+          <w:tcPr>
+            <w:tcW w:w="1222" w:type="dxa"/>
+            <w:tcBorders>
+              <w:top w:val="single" w:sz="1" w:space="0" w:color="AAAAAA"/>
+              <w:left w:val="single" w:sz="1" w:space="0" w:color="AAAAAA"/>
+              <w:bottom w:val="single" w:sz="1" w:space="0" w:color="AAAAAA"/>
+              <w:right w:val="single" w:sz="1" w:space="0" w:color="AAAAAA"/>
+            </w:tcBorders>
+            <w:shd w:val="clear" w:color="auto" w:fill="E2EFDA"/>
+            <w:tcMar>
+              <w:top w:w="80" w:type="dxa"/>
+              <w:left w:w="120" w:type="dxa"/>
+              <w:bottom w:w="80" w:type="dxa"/>
+              <w:right w:w="120" w:type="dxa"/>
+            </w:tcMar>
+          </w:tcPr>
+          <w:p>
+            <w:r>
+              <w:rPr>
                 <w:color w:val="000000"/>
                 <w:sz w:val="18"/>
                 <w:szCs w:val="18"/>
               </w:rPr>
-              <w:t>9</w:t>
-            </w:r>
-          </w:p>
-        </w:tc>
-        <w:tc>
-          <w:tcPr>
-            <w:tcW w:w="1222" w:type="dxa"/>
-            <w:tcBorders>
-              <w:top w:val="single" w:sz="1" w:space="0" w:color="AAAAAA"/>
-              <w:left w:val="single" w:sz="1" w:space="0" w:color="AAAAAA"/>
-              <w:bottom w:val="single" w:sz="1" w:space="0" w:color="AAAAAA"/>
-              <w:right w:val="single" w:sz="1" w:space="0" w:color="AAAAAA"/>
-            </w:tcBorders>
-            <w:shd w:val="clear" w:color="auto" w:fill="E2EFDA"/>
+              <w:t>GA-NODE</w:t>
+            </w:r>
+          </w:p>
+        </w:tc>
+        <w:tc>
+          <w:tcPr>
+            <w:tcW w:w="2835" w:type="dxa"/>
+            <w:tcBorders>
+              <w:top w:val="single" w:sz="1" w:space="0" w:color="AAAAAA"/>
+              <w:left w:val="single" w:sz="1" w:space="0" w:color="AAAAAA"/>
+              <w:bottom w:val="single" w:sz="1" w:space="0" w:color="AAAAAA"/>
+              <w:right w:val="single" w:sz="1" w:space="0" w:color="AAAAAA"/>
+            </w:tcBorders>
+            <w:shd w:val="clear" w:color="auto" w:fill="FFFFFF"/>
             <w:tcMar>
               <w:top w:w="80" w:type="dxa"/>
               <w:left w:w="120" w:type="dxa"/>
@@ -12126,13 +12066,13 @@
                 <w:sz w:val="18"/>
                 <w:szCs w:val="18"/>
               </w:rPr>
-              <w:t>GA-ENFORC</w:t>
-            </w:r>
-          </w:p>
-        </w:tc>
-        <w:tc>
-          <w:tcPr>
-            <w:tcW w:w="2835" w:type="dxa"/>
+              <w:t>EchoLink/WebSDR — RTUK/BTK ortak teyit</w:t>
+            </w:r>
+          </w:p>
+        </w:tc>
+        <w:tc>
+          <w:tcPr>
+            <w:tcW w:w="1593" w:type="dxa"/>
             <w:tcBorders>
               <w:top w:val="single" w:sz="1" w:space="0" w:color="AAAAAA"/>
               <w:left w:val="single" w:sz="1" w:space="0" w:color="AAAAAA"/>
@@ -12154,13 +12094,13 @@
                 <w:sz w:val="18"/>
                 <w:szCs w:val="18"/>
               </w:rPr>
-              <w:t>BTK girişim tespit kapasitesi + role rehberi</w:t>
-            </w:r>
-          </w:p>
-        </w:tc>
-        <w:tc>
-          <w:tcPr>
-            <w:tcW w:w="1593" w:type="dxa"/>
+              <w:t>BTK+RTUK</w:t>
+            </w:r>
+          </w:p>
+        </w:tc>
+        <w:tc>
+          <w:tcPr>
+            <w:tcW w:w="1377" w:type="dxa"/>
             <w:tcBorders>
               <w:top w:val="single" w:sz="1" w:space="0" w:color="AAAAAA"/>
               <w:left w:val="single" w:sz="1" w:space="0" w:color="AAAAAA"/>
@@ -12182,13 +12122,13 @@
                 <w:sz w:val="18"/>
                 <w:szCs w:val="18"/>
               </w:rPr>
-              <w:t>BTK</w:t>
-            </w:r>
-          </w:p>
-        </w:tc>
-        <w:tc>
-          <w:tcPr>
-            <w:tcW w:w="1377" w:type="dxa"/>
+              <w:t>Orta</w:t>
+            </w:r>
+          </w:p>
+        </w:tc>
+        <w:tc>
+          <w:tcPr>
+            <w:tcW w:w="1510" w:type="dxa"/>
             <w:tcBorders>
               <w:top w:val="single" w:sz="1" w:space="0" w:color="AAAAAA"/>
               <w:left w:val="single" w:sz="1" w:space="0" w:color="AAAAAA"/>
@@ -12210,35 +12150,7 @@
                 <w:sz w:val="18"/>
                 <w:szCs w:val="18"/>
               </w:rPr>
-              <w:t>Orta</w:t>
-            </w:r>
-          </w:p>
-        </w:tc>
-        <w:tc>
-          <w:tcPr>
-            <w:tcW w:w="1510" w:type="dxa"/>
-            <w:tcBorders>
-              <w:top w:val="single" w:sz="1" w:space="0" w:color="AAAAAA"/>
-              <w:left w:val="single" w:sz="1" w:space="0" w:color="AAAAAA"/>
-              <w:bottom w:val="single" w:sz="1" w:space="0" w:color="AAAAAA"/>
-              <w:right w:val="single" w:sz="1" w:space="0" w:color="AAAAAA"/>
-            </w:tcBorders>
-            <w:shd w:val="clear" w:color="auto" w:fill="FFFFFF"/>
-            <w:tcMar>
-              <w:top w:w="80" w:type="dxa"/>
-              <w:left w:w="120" w:type="dxa"/>
-              <w:bottom w:w="80" w:type="dxa"/>
-              <w:right w:w="120" w:type="dxa"/>
-            </w:tcMar>
-          </w:tcPr>
-          <w:p>
-            <w:r>
-              <w:rPr>
-                <w:color w:val="000000"/>
-                <w:sz w:val="18"/>
-                <w:szCs w:val="18"/>
-              </w:rPr>
-              <w:t>Tüm topluluk</w:t>
+              <w:t>Node işleticileri</w:t>
             </w:r>
           </w:p>
         </w:tc>
@@ -12263,27 +12175,48 @@
           </w:tcPr>
           <w:p>
             <w:r>
-              <w:rPr>
-                <w:b/>
-                <w:bCs/>
+              <w:t>10</w:t>
+            </w:r>
+          </w:p>
+        </w:tc>
+        <w:tc>
+          <w:tcPr>
+            <w:tcW w:w="1222" w:type="dxa"/>
+            <w:tcBorders>
+              <w:top w:val="single" w:sz="1" w:space="0" w:color="AAAAAA"/>
+              <w:left w:val="single" w:sz="1" w:space="0" w:color="AAAAAA"/>
+              <w:bottom w:val="single" w:sz="1" w:space="0" w:color="AAAAAA"/>
+              <w:right w:val="single" w:sz="1" w:space="0" w:color="AAAAAA"/>
+            </w:tcBorders>
+            <w:shd w:val="clear" w:color="auto" w:fill="E2EFDA"/>
+            <w:tcMar>
+              <w:top w:w="80" w:type="dxa"/>
+              <w:left w:w="120" w:type="dxa"/>
+              <w:bottom w:w="80" w:type="dxa"/>
+              <w:right w:w="120" w:type="dxa"/>
+            </w:tcMar>
+          </w:tcPr>
+          <w:p>
+            <w:r>
+              <w:rPr>
                 <w:color w:val="000000"/>
                 <w:sz w:val="18"/>
                 <w:szCs w:val="18"/>
               </w:rPr>
-              <w:t>10</w:t>
-            </w:r>
-          </w:p>
-        </w:tc>
-        <w:tc>
-          <w:tcPr>
-            <w:tcW w:w="1222" w:type="dxa"/>
-            <w:tcBorders>
-              <w:top w:val="single" w:sz="1" w:space="0" w:color="AAAAAA"/>
-              <w:left w:val="single" w:sz="1" w:space="0" w:color="AAAAAA"/>
-              <w:bottom w:val="single" w:sz="1" w:space="0" w:color="AAAAAA"/>
-              <w:right w:val="single" w:sz="1" w:space="0" w:color="AAAAAA"/>
-            </w:tcBorders>
-            <w:shd w:val="clear" w:color="auto" w:fill="E2EFDA"/>
+              <w:t>GA-ENFORC</w:t>
+            </w:r>
+          </w:p>
+        </w:tc>
+        <w:tc>
+          <w:tcPr>
+            <w:tcW w:w="2835" w:type="dxa"/>
+            <w:tcBorders>
+              <w:top w:val="single" w:sz="1" w:space="0" w:color="AAAAAA"/>
+              <w:left w:val="single" w:sz="1" w:space="0" w:color="AAAAAA"/>
+              <w:bottom w:val="single" w:sz="1" w:space="0" w:color="AAAAAA"/>
+              <w:right w:val="single" w:sz="1" w:space="0" w:color="AAAAAA"/>
+            </w:tcBorders>
+            <w:shd w:val="clear" w:color="auto" w:fill="FFFFFF"/>
             <w:tcMar>
               <w:top w:w="80" w:type="dxa"/>
               <w:left w:w="120" w:type="dxa"/>
@@ -12298,13 +12231,13 @@
                 <w:sz w:val="18"/>
                 <w:szCs w:val="18"/>
               </w:rPr>
-              <w:t>GA-4</w:t>
-            </w:r>
-          </w:p>
-        </w:tc>
-        <w:tc>
-          <w:tcPr>
-            <w:tcW w:w="2835" w:type="dxa"/>
+              <w:t>BTK girişim tespit kapasitesi + role rehberi</w:t>
+            </w:r>
+          </w:p>
+        </w:tc>
+        <w:tc>
+          <w:tcPr>
+            <w:tcW w:w="1593" w:type="dxa"/>
             <w:tcBorders>
               <w:top w:val="single" w:sz="1" w:space="0" w:color="AAAAAA"/>
               <w:left w:val="single" w:sz="1" w:space="0" w:color="AAAAAA"/>
@@ -12326,13 +12259,13 @@
                 <w:sz w:val="18"/>
                 <w:szCs w:val="18"/>
               </w:rPr>
-              <w:t>Gümrükte geçici cihaz çıkış prosedürü</w:t>
-            </w:r>
-          </w:p>
-        </w:tc>
-        <w:tc>
-          <w:tcPr>
-            <w:tcW w:w="1593" w:type="dxa"/>
+              <w:t>BTK</w:t>
+            </w:r>
+          </w:p>
+        </w:tc>
+        <w:tc>
+          <w:tcPr>
+            <w:tcW w:w="1377" w:type="dxa"/>
             <w:tcBorders>
               <w:top w:val="single" w:sz="1" w:space="0" w:color="AAAAAA"/>
               <w:left w:val="single" w:sz="1" w:space="0" w:color="AAAAAA"/>
@@ -12354,13 +12287,13 @@
                 <w:sz w:val="18"/>
                 <w:szCs w:val="18"/>
               </w:rPr>
-              <w:t>Gümrük Bak.</w:t>
-            </w:r>
-          </w:p>
-        </w:tc>
-        <w:tc>
-          <w:tcPr>
-            <w:tcW w:w="1377" w:type="dxa"/>
+              <w:t>Orta</w:t>
+            </w:r>
+          </w:p>
+        </w:tc>
+        <w:tc>
+          <w:tcPr>
+            <w:tcW w:w="1510" w:type="dxa"/>
             <w:tcBorders>
               <w:top w:val="single" w:sz="1" w:space="0" w:color="AAAAAA"/>
               <w:left w:val="single" w:sz="1" w:space="0" w:color="AAAAAA"/>
@@ -12382,35 +12315,7 @@
                 <w:sz w:val="18"/>
                 <w:szCs w:val="18"/>
               </w:rPr>
-              <w:t>Düşük-Orta</w:t>
-            </w:r>
-          </w:p>
-        </w:tc>
-        <w:tc>
-          <w:tcPr>
-            <w:tcW w:w="1510" w:type="dxa"/>
-            <w:tcBorders>
-              <w:top w:val="single" w:sz="1" w:space="0" w:color="AAAAAA"/>
-              <w:left w:val="single" w:sz="1" w:space="0" w:color="AAAAAA"/>
-              <w:bottom w:val="single" w:sz="1" w:space="0" w:color="AAAAAA"/>
-              <w:right w:val="single" w:sz="1" w:space="0" w:color="AAAAAA"/>
-            </w:tcBorders>
-            <w:shd w:val="clear" w:color="auto" w:fill="FFFFFF"/>
-            <w:tcMar>
-              <w:top w:w="80" w:type="dxa"/>
-              <w:left w:w="120" w:type="dxa"/>
-              <w:bottom w:w="80" w:type="dxa"/>
-              <w:right w:w="120" w:type="dxa"/>
-            </w:tcMar>
-          </w:tcPr>
-          <w:p>
-            <w:r>
-              <w:rPr>
-                <w:color w:val="000000"/>
-                <w:sz w:val="18"/>
-                <w:szCs w:val="18"/>
-              </w:rPr>
-              <w:t>Seyahat amatörler</w:t>
+              <w:t>Tüm topluluk</w:t>
             </w:r>
           </w:p>
         </w:tc>
@@ -12435,27 +12340,48 @@
           </w:tcPr>
           <w:p>
             <w:r>
-              <w:rPr>
-                <w:b/>
-                <w:bCs/>
+              <w:t>11</w:t>
+            </w:r>
+          </w:p>
+        </w:tc>
+        <w:tc>
+          <w:tcPr>
+            <w:tcW w:w="1222" w:type="dxa"/>
+            <w:tcBorders>
+              <w:top w:val="single" w:sz="1" w:space="0" w:color="AAAAAA"/>
+              <w:left w:val="single" w:sz="1" w:space="0" w:color="AAAAAA"/>
+              <w:bottom w:val="single" w:sz="1" w:space="0" w:color="AAAAAA"/>
+              <w:right w:val="single" w:sz="1" w:space="0" w:color="AAAAAA"/>
+            </w:tcBorders>
+            <w:shd w:val="clear" w:color="auto" w:fill="E2EFDA"/>
+            <w:tcMar>
+              <w:top w:w="80" w:type="dxa"/>
+              <w:left w:w="120" w:type="dxa"/>
+              <w:bottom w:w="80" w:type="dxa"/>
+              <w:right w:w="120" w:type="dxa"/>
+            </w:tcMar>
+          </w:tcPr>
+          <w:p>
+            <w:r>
+              <w:rPr>
                 <w:color w:val="000000"/>
                 <w:sz w:val="18"/>
                 <w:szCs w:val="18"/>
               </w:rPr>
-              <w:t>11</w:t>
-            </w:r>
-          </w:p>
-        </w:tc>
-        <w:tc>
-          <w:tcPr>
-            <w:tcW w:w="1222" w:type="dxa"/>
-            <w:tcBorders>
-              <w:top w:val="single" w:sz="1" w:space="0" w:color="AAAAAA"/>
-              <w:left w:val="single" w:sz="1" w:space="0" w:color="AAAAAA"/>
-              <w:bottom w:val="single" w:sz="1" w:space="0" w:color="AAAAAA"/>
-              <w:right w:val="single" w:sz="1" w:space="0" w:color="AAAAAA"/>
-            </w:tcBorders>
-            <w:shd w:val="clear" w:color="auto" w:fill="E2EFDA"/>
+              <w:t>GA-4</w:t>
+            </w:r>
+          </w:p>
+        </w:tc>
+        <w:tc>
+          <w:tcPr>
+            <w:tcW w:w="2835" w:type="dxa"/>
+            <w:tcBorders>
+              <w:top w:val="single" w:sz="1" w:space="0" w:color="AAAAAA"/>
+              <w:left w:val="single" w:sz="1" w:space="0" w:color="AAAAAA"/>
+              <w:bottom w:val="single" w:sz="1" w:space="0" w:color="AAAAAA"/>
+              <w:right w:val="single" w:sz="1" w:space="0" w:color="AAAAAA"/>
+            </w:tcBorders>
+            <w:shd w:val="clear" w:color="auto" w:fill="FFFFFF"/>
             <w:tcMar>
               <w:top w:w="80" w:type="dxa"/>
               <w:left w:w="120" w:type="dxa"/>
@@ -12470,13 +12396,13 @@
                 <w:sz w:val="18"/>
                 <w:szCs w:val="18"/>
               </w:rPr>
-              <w:t>GA-POC</w:t>
-            </w:r>
-          </w:p>
-        </w:tc>
-        <w:tc>
-          <w:tcPr>
-            <w:tcW w:w="2835" w:type="dxa"/>
+              <w:t>Gümrükte geçici cihaz çıkış prosedürü</w:t>
+            </w:r>
+          </w:p>
+        </w:tc>
+        <w:tc>
+          <w:tcPr>
+            <w:tcW w:w="1593" w:type="dxa"/>
             <w:tcBorders>
               <w:top w:val="single" w:sz="1" w:space="0" w:color="AAAAAA"/>
               <w:left w:val="single" w:sz="1" w:space="0" w:color="AAAAAA"/>
@@ -12498,13 +12424,13 @@
                 <w:sz w:val="18"/>
                 <w:szCs w:val="18"/>
               </w:rPr>
-              <w:t>POC yanıltıcı pazarlama — ticari rehber</w:t>
-            </w:r>
-          </w:p>
-        </w:tc>
-        <w:tc>
-          <w:tcPr>
-            <w:tcW w:w="1593" w:type="dxa"/>
+              <w:t>Gümrük Bak.</w:t>
+            </w:r>
+          </w:p>
+        </w:tc>
+        <w:tc>
+          <w:tcPr>
+            <w:tcW w:w="1377" w:type="dxa"/>
             <w:tcBorders>
               <w:top w:val="single" w:sz="1" w:space="0" w:color="AAAAAA"/>
               <w:left w:val="single" w:sz="1" w:space="0" w:color="AAAAAA"/>
@@ -12526,13 +12452,13 @@
                 <w:sz w:val="18"/>
                 <w:szCs w:val="18"/>
               </w:rPr>
-              <w:t>Ticaret Bak.</w:t>
-            </w:r>
-          </w:p>
-        </w:tc>
-        <w:tc>
-          <w:tcPr>
-            <w:tcW w:w="1377" w:type="dxa"/>
+              <w:t>Düşük-Orta</w:t>
+            </w:r>
+          </w:p>
+        </w:tc>
+        <w:tc>
+          <w:tcPr>
+            <w:tcW w:w="1510" w:type="dxa"/>
             <w:tcBorders>
               <w:top w:val="single" w:sz="1" w:space="0" w:color="AAAAAA"/>
               <w:left w:val="single" w:sz="1" w:space="0" w:color="AAAAAA"/>
@@ -12554,35 +12480,7 @@
                 <w:sz w:val="18"/>
                 <w:szCs w:val="18"/>
               </w:rPr>
-              <w:t>Düşük</w:t>
-            </w:r>
-          </w:p>
-        </w:tc>
-        <w:tc>
-          <w:tcPr>
-            <w:tcW w:w="1510" w:type="dxa"/>
-            <w:tcBorders>
-              <w:top w:val="single" w:sz="1" w:space="0" w:color="AAAAAA"/>
-              <w:left w:val="single" w:sz="1" w:space="0" w:color="AAAAAA"/>
-              <w:bottom w:val="single" w:sz="1" w:space="0" w:color="AAAAAA"/>
-              <w:right w:val="single" w:sz="1" w:space="0" w:color="AAAAAA"/>
-            </w:tcBorders>
-            <w:shd w:val="clear" w:color="auto" w:fill="FFFFFF"/>
-            <w:tcMar>
-              <w:top w:w="80" w:type="dxa"/>
-              <w:left w:w="120" w:type="dxa"/>
-              <w:bottom w:w="80" w:type="dxa"/>
-              <w:right w:w="120" w:type="dxa"/>
-            </w:tcMar>
-          </w:tcPr>
-          <w:p>
-            <w:r>
-              <w:rPr>
-                <w:color w:val="000000"/>
-                <w:sz w:val="18"/>
-                <w:szCs w:val="18"/>
-              </w:rPr>
-              <w:t>Tüketiciler</w:t>
+              <w:t>Seyahat amatörler</w:t>
             </w:r>
           </w:p>
         </w:tc>
@@ -12591,6 +12489,19 @@
         <w:tc>
           <w:tcPr>
             <w:tcW w:w="489" w:type="dxa"/>
+            <w:tcBorders>
+              <w:top w:val="single" w:sz="1" w:space="0" w:color="AAAAAA"/>
+              <w:left w:val="single" w:sz="1" w:space="0" w:color="AAAAAA"/>
+              <w:bottom w:val="single" w:sz="1" w:space="0" w:color="AAAAAA"/>
+              <w:right w:val="single" w:sz="1" w:space="0" w:color="AAAAAA"/>
+            </w:tcBorders>
+            <w:shd w:val="clear" w:color="auto" w:fill="E2EFDA"/>
+            <w:tcMar>
+              <w:top w:w="80" w:type="dxa"/>
+              <w:left w:w="120" w:type="dxa"/>
+              <w:bottom w:w="80" w:type="dxa"/>
+              <w:right w:w="120" w:type="dxa"/>
+            </w:tcMar>
           </w:tcPr>
           <w:p>
             <w:r>
@@ -12601,50 +12512,140 @@
         <w:tc>
           <w:tcPr>
             <w:tcW w:w="1222" w:type="dxa"/>
-          </w:tcPr>
-          <w:p>
-            <w:r>
-              <w:t>GA-BAND-2</w:t>
+            <w:tcBorders>
+              <w:top w:val="single" w:sz="1" w:space="0" w:color="AAAAAA"/>
+              <w:left w:val="single" w:sz="1" w:space="0" w:color="AAAAAA"/>
+              <w:bottom w:val="single" w:sz="1" w:space="0" w:color="AAAAAA"/>
+              <w:right w:val="single" w:sz="1" w:space="0" w:color="AAAAAA"/>
+            </w:tcBorders>
+            <w:shd w:val="clear" w:color="auto" w:fill="E2EFDA"/>
+            <w:tcMar>
+              <w:top w:w="80" w:type="dxa"/>
+              <w:left w:w="120" w:type="dxa"/>
+              <w:bottom w:w="80" w:type="dxa"/>
+              <w:right w:w="120" w:type="dxa"/>
+            </w:tcMar>
+          </w:tcPr>
+          <w:p>
+            <w:r>
+              <w:rPr>
+                <w:color w:val="000000"/>
+                <w:sz w:val="18"/>
+                <w:szCs w:val="18"/>
+              </w:rPr>
+              <w:t>GA-POC</w:t>
             </w:r>
           </w:p>
         </w:tc>
         <w:tc>
           <w:tcPr>
             <w:tcW w:w="2835" w:type="dxa"/>
-          </w:tcPr>
-          <w:p>
-            <w:r>
-              <w:t>70,0-70,5 MHz (4m) ikincil amatör tahsisi</w:t>
+            <w:tcBorders>
+              <w:top w:val="single" w:sz="1" w:space="0" w:color="AAAAAA"/>
+              <w:left w:val="single" w:sz="1" w:space="0" w:color="AAAAAA"/>
+              <w:bottom w:val="single" w:sz="1" w:space="0" w:color="AAAAAA"/>
+              <w:right w:val="single" w:sz="1" w:space="0" w:color="AAAAAA"/>
+            </w:tcBorders>
+            <w:shd w:val="clear" w:color="auto" w:fill="FFFFFF"/>
+            <w:tcMar>
+              <w:top w:w="80" w:type="dxa"/>
+              <w:left w:w="120" w:type="dxa"/>
+              <w:bottom w:w="80" w:type="dxa"/>
+              <w:right w:w="120" w:type="dxa"/>
+            </w:tcMar>
+          </w:tcPr>
+          <w:p>
+            <w:r>
+              <w:rPr>
+                <w:color w:val="000000"/>
+                <w:sz w:val="18"/>
+                <w:szCs w:val="18"/>
+              </w:rPr>
+              <w:t>POC yanıltıcı pazarlama — ticari rehber</w:t>
             </w:r>
           </w:p>
         </w:tc>
         <w:tc>
           <w:tcPr>
             <w:tcW w:w="1593" w:type="dxa"/>
-          </w:tcPr>
-          <w:p>
-            <w:r>
-              <w:t>BTK</w:t>
+            <w:tcBorders>
+              <w:top w:val="single" w:sz="1" w:space="0" w:color="AAAAAA"/>
+              <w:left w:val="single" w:sz="1" w:space="0" w:color="AAAAAA"/>
+              <w:bottom w:val="single" w:sz="1" w:space="0" w:color="AAAAAA"/>
+              <w:right w:val="single" w:sz="1" w:space="0" w:color="AAAAAA"/>
+            </w:tcBorders>
+            <w:shd w:val="clear" w:color="auto" w:fill="FFFFFF"/>
+            <w:tcMar>
+              <w:top w:w="80" w:type="dxa"/>
+              <w:left w:w="120" w:type="dxa"/>
+              <w:bottom w:w="80" w:type="dxa"/>
+              <w:right w:w="120" w:type="dxa"/>
+            </w:tcMar>
+          </w:tcPr>
+          <w:p>
+            <w:r>
+              <w:rPr>
+                <w:color w:val="000000"/>
+                <w:sz w:val="18"/>
+                <w:szCs w:val="18"/>
+              </w:rPr>
+              <w:t>Ticaret Bak.</w:t>
             </w:r>
           </w:p>
         </w:tc>
         <w:tc>
           <w:tcPr>
             <w:tcW w:w="1377" w:type="dxa"/>
-          </w:tcPr>
-          <w:p>
-            <w:r>
-              <w:t>Orta</w:t>
+            <w:tcBorders>
+              <w:top w:val="single" w:sz="1" w:space="0" w:color="AAAAAA"/>
+              <w:left w:val="single" w:sz="1" w:space="0" w:color="AAAAAA"/>
+              <w:bottom w:val="single" w:sz="1" w:space="0" w:color="AAAAAA"/>
+              <w:right w:val="single" w:sz="1" w:space="0" w:color="AAAAAA"/>
+            </w:tcBorders>
+            <w:shd w:val="clear" w:color="auto" w:fill="FFFFFF"/>
+            <w:tcMar>
+              <w:top w:w="80" w:type="dxa"/>
+              <w:left w:w="120" w:type="dxa"/>
+              <w:bottom w:w="80" w:type="dxa"/>
+              <w:right w:w="120" w:type="dxa"/>
+            </w:tcMar>
+          </w:tcPr>
+          <w:p>
+            <w:r>
+              <w:rPr>
+                <w:color w:val="000000"/>
+                <w:sz w:val="18"/>
+                <w:szCs w:val="18"/>
+              </w:rPr>
+              <w:t>Düşük</w:t>
             </w:r>
           </w:p>
         </w:tc>
         <w:tc>
           <w:tcPr>
             <w:tcW w:w="1510" w:type="dxa"/>
-          </w:tcPr>
-          <w:p>
-            <w:r>
-              <w:t>VHF operatörleri</w:t>
+            <w:tcBorders>
+              <w:top w:val="single" w:sz="1" w:space="0" w:color="AAAAAA"/>
+              <w:left w:val="single" w:sz="1" w:space="0" w:color="AAAAAA"/>
+              <w:bottom w:val="single" w:sz="1" w:space="0" w:color="AAAAAA"/>
+              <w:right w:val="single" w:sz="1" w:space="0" w:color="AAAAAA"/>
+            </w:tcBorders>
+            <w:shd w:val="clear" w:color="auto" w:fill="FFFFFF"/>
+            <w:tcMar>
+              <w:top w:w="80" w:type="dxa"/>
+              <w:left w:w="120" w:type="dxa"/>
+              <w:bottom w:w="80" w:type="dxa"/>
+              <w:right w:w="120" w:type="dxa"/>
+            </w:tcMar>
+          </w:tcPr>
+          <w:p>
+            <w:r>
+              <w:rPr>
+                <w:color w:val="000000"/>
+                <w:sz w:val="18"/>
+                <w:szCs w:val="18"/>
+              </w:rPr>
+              <w:t>Tüketiciler</w:t>
             </w:r>
           </w:p>
         </w:tc>
@@ -12666,7 +12667,7 @@
           </w:tcPr>
           <w:p>
             <w:r>
-              <w:t>GA-BAND-3</w:t>
+              <w:t>GA-BAND-2</w:t>
             </w:r>
           </w:p>
         </w:tc>
@@ -12676,7 +12677,7 @@
           </w:tcPr>
           <w:p>
             <w:r>
-              <w:t>Mikrodalga bantları için TAD teknik şartları</w:t>
+              <w:t>70,0-70,5 MHz (4m) ikincil amatör tahsisi</w:t>
             </w:r>
           </w:p>
         </w:tc>
@@ -12706,7 +12707,7 @@
           </w:tcPr>
           <w:p>
             <w:r>
-              <w:t>Mikrodalga/ATV</w:t>
+              <w:t>VHF operatörleri</w:t>
             </w:r>
           </w:p>
         </w:tc>
@@ -12728,7 +12729,7 @@
           </w:tcPr>
           <w:p>
             <w:r>
-              <w:t>GA-ARAC</w:t>
+              <w:t>GA-BAND-3</w:t>
             </w:r>
           </w:p>
         </w:tc>
@@ -12738,7 +12739,7 @@
           </w:tcPr>
           <w:p>
             <w:r>
-              <w:t>Mobil istasyon montaj ve kullanım kılavuzu</w:t>
+              <w:t>Mikrodalga bantları için TAD teknik şartları</w:t>
             </w:r>
           </w:p>
         </w:tc>
@@ -12758,7 +12759,7 @@
           </w:tcPr>
           <w:p>
             <w:r>
-              <w:t>Düşük-Orta</w:t>
+              <w:t>Orta</w:t>
             </w:r>
           </w:p>
         </w:tc>
@@ -12768,7 +12769,7 @@
           </w:tcPr>
           <w:p>
             <w:r>
-              <w:t>Mobil operatörler</w:t>
+              <w:t>Mikrodalga/ATV</w:t>
             </w:r>
           </w:p>
         </w:tc>
@@ -12790,7 +12791,7 @@
           </w:tcPr>
           <w:p>
             <w:r>
-              <w:t>GA-POTA</w:t>
+              <w:t>GA-ARAC</w:t>
             </w:r>
           </w:p>
         </w:tc>
@@ -12800,7 +12801,7 @@
           </w:tcPr>
           <w:p>
             <w:r>
-              <w:t>POTA arazi izinleri 'hangi kurum' kılavuzu</w:t>
+              <w:t>Mobil istasyon montaj ve kullanım kılavuzu</w:t>
             </w:r>
           </w:p>
         </w:tc>
@@ -12810,7 +12811,7 @@
           </w:tcPr>
           <w:p>
             <w:r>
-              <w:t>Tarım-Orman/ÇŞİB</w:t>
+              <w:t>BTK</w:t>
             </w:r>
           </w:p>
         </w:tc>
@@ -12830,7 +12831,7 @@
           </w:tcPr>
           <w:p>
             <w:r>
-              <w:t>Saha aktivasyonu</w:t>
+              <w:t>Mobil operatörler</w:t>
             </w:r>
           </w:p>
         </w:tc>
@@ -12852,7 +12853,7 @@
           </w:tcPr>
           <w:p>
             <w:r>
-              <w:t>GA-AREDN</w:t>
+              <w:t>GA-POTA</w:t>
             </w:r>
           </w:p>
         </w:tc>
@@ -12862,7 +12863,7 @@
           </w:tcPr>
           <w:p>
             <w:r>
-              <w:t>2,4/5,8 GHz TAD + 'kendi imalı cihaz' tanımı</w:t>
+              <w:t>POTA arazi izinleri 'hangi kurum' kılavuzu</w:t>
             </w:r>
           </w:p>
         </w:tc>
@@ -12872,7 +12873,7 @@
           </w:tcPr>
           <w:p>
             <w:r>
-              <w:t>BTK/KEGM</w:t>
+              <w:t>Tarım-Orman/ÇŞİB</w:t>
             </w:r>
           </w:p>
         </w:tc>
@@ -12882,7 +12883,7 @@
           </w:tcPr>
           <w:p>
             <w:r>
-              <w:t>Düşük</w:t>
+              <w:t>Düşük-Orta</w:t>
             </w:r>
           </w:p>
         </w:tc>
@@ -12892,7 +12893,7 @@
           </w:tcPr>
           <w:p>
             <w:r>
-              <w:t>Mesh kullanıcıları</w:t>
+              <w:t>Saha aktivasyonu</w:t>
             </w:r>
           </w:p>
         </w:tc>
@@ -12914,7 +12915,7 @@
           </w:tcPr>
           <w:p>
             <w:r>
-              <w:t>GA-LORA</w:t>
+              <w:t>GA-AREDN</w:t>
             </w:r>
           </w:p>
         </w:tc>
@@ -12924,7 +12925,7 @@
           </w:tcPr>
           <w:p>
             <w:r>
-              <w:t>433 MHz SRD-amatör sınırı; 915 MHz uyarısı</w:t>
+              <w:t>2,4/5,8 GHz TAD + 'kendi imalı cihaz' tanımı</w:t>
             </w:r>
           </w:p>
         </w:tc>
@@ -12934,7 +12935,7 @@
           </w:tcPr>
           <w:p>
             <w:r>
-              <w:t>BTK</w:t>
+              <w:t>BTK/KEGM</w:t>
             </w:r>
           </w:p>
         </w:tc>
@@ -12944,7 +12945,7 @@
           </w:tcPr>
           <w:p>
             <w:r>
-              <w:t>Orta</w:t>
+              <w:t>Düşük</w:t>
             </w:r>
           </w:p>
         </w:tc>
@@ -12954,7 +12955,7 @@
           </w:tcPr>
           <w:p>
             <w:r>
-              <w:t>LoRa/Meshtastic</w:t>
+              <w:t>Mesh kullanıcıları</w:t>
             </w:r>
           </w:p>
         </w:tc>
@@ -12976,7 +12977,7 @@
           </w:tcPr>
           <w:p>
             <w:r>
-              <w:t>GA-SK</w:t>
+              <w:t>GA-LORA</w:t>
             </w:r>
           </w:p>
         </w:tc>
@@ -12986,7 +12987,7 @@
           </w:tcPr>
           <w:p>
             <w:r>
-              <w:t>Silent Key / çağrı işareti yaşam döngüsü</w:t>
+              <w:t>433 MHz SRD-amatör sınırı; 915 MHz uyarısı</w:t>
             </w:r>
           </w:p>
         </w:tc>
@@ -12996,7 +12997,7 @@
           </w:tcPr>
           <w:p>
             <w:r>
-              <w:t>KEGM</w:t>
+              <w:t>BTK</w:t>
             </w:r>
           </w:p>
         </w:tc>
@@ -13016,7 +13017,7 @@
           </w:tcPr>
           <w:p>
             <w:r>
-              <w:t>Tüm camia</w:t>
+              <w:t>LoRa/Meshtastic</w:t>
             </w:r>
           </w:p>
         </w:tc>
@@ -13038,7 +13039,7 @@
           </w:tcPr>
           <w:p>
             <w:r>
-              <w:t>GA-CALL</w:t>
+              <w:t>GA-SK</w:t>
             </w:r>
           </w:p>
         </w:tc>
@@ -13048,7 +13049,7 @@
           </w:tcPr>
           <w:p>
             <w:r>
-              <w:t>Bölge değişiminde çağrı işareti taşınabilirliği</w:t>
+              <w:t>Silent Key / çağrı işareti yaşam döngüsü</w:t>
             </w:r>
           </w:p>
         </w:tc>
@@ -13078,7 +13079,7 @@
           </w:tcPr>
           <w:p>
             <w:r>
-              <w:t>Taşınan operatörler</w:t>
+              <w:t>Tüm camia</w:t>
             </w:r>
           </w:p>
         </w:tc>
@@ -13100,7 +13101,7 @@
           </w:tcPr>
           <w:p>
             <w:r>
-              <w:t>GA-CIHAZ</w:t>
+              <w:t>GA-CALL</w:t>
             </w:r>
           </w:p>
         </w:tc>
@@ -13110,7 +13111,7 @@
           </w:tcPr>
           <w:p>
             <w:r>
-              <w:t>Cihaz uygunluğu, satışta belge kontrolü, devir kaydı</w:t>
+              <w:t>Bölge değişiminde çağrı işareti taşınabilirliği</w:t>
             </w:r>
           </w:p>
         </w:tc>
@@ -13120,7 +13121,7 @@
           </w:tcPr>
           <w:p>
             <w:r>
-              <w:t>BTK + Ticaret Bak.</w:t>
+              <w:t>KEGM</w:t>
             </w:r>
           </w:p>
         </w:tc>
@@ -13130,7 +13131,7 @@
           </w:tcPr>
           <w:p>
             <w:r>
-              <w:t>Yüksek</w:t>
+              <w:t>Orta</w:t>
             </w:r>
           </w:p>
         </w:tc>
@@ -13140,7 +13141,7 @@
           </w:tcPr>
           <w:p>
             <w:r>
-              <w:t>Tüm camia + kamu</w:t>
+              <w:t>Taşınan operatörler</w:t>
             </w:r>
           </w:p>
         </w:tc>
@@ -13153,6 +13154,68 @@
           <w:p>
             <w:r>
               <w:t>21</w:t>
+            </w:r>
+          </w:p>
+        </w:tc>
+        <w:tc>
+          <w:tcPr>
+            <w:tcW w:w="1222" w:type="dxa"/>
+          </w:tcPr>
+          <w:p>
+            <w:r>
+              <w:t>GA-CIHAZ</w:t>
+            </w:r>
+          </w:p>
+        </w:tc>
+        <w:tc>
+          <w:tcPr>
+            <w:tcW w:w="2835" w:type="dxa"/>
+          </w:tcPr>
+          <w:p>
+            <w:r>
+              <w:t>Cihaz uygunluğu, satışta belge kontrolü, devir kaydı</w:t>
+            </w:r>
+          </w:p>
+        </w:tc>
+        <w:tc>
+          <w:tcPr>
+            <w:tcW w:w="1593" w:type="dxa"/>
+          </w:tcPr>
+          <w:p>
+            <w:r>
+              <w:t>BTK + Ticaret Bak.</w:t>
+            </w:r>
+          </w:p>
+        </w:tc>
+        <w:tc>
+          <w:tcPr>
+            <w:tcW w:w="1377" w:type="dxa"/>
+          </w:tcPr>
+          <w:p>
+            <w:r>
+              <w:t>Yüksek</w:t>
+            </w:r>
+          </w:p>
+        </w:tc>
+        <w:tc>
+          <w:tcPr>
+            <w:tcW w:w="1510" w:type="dxa"/>
+          </w:tcPr>
+          <w:p>
+            <w:r>
+              <w:t>Tüm camia + kamu</w:t>
+            </w:r>
+          </w:p>
+        </w:tc>
+      </w:tr>
+      <w:tr>
+        <w:tc>
+          <w:tcPr>
+            <w:tcW w:w="489" w:type="dxa"/>
+          </w:tcPr>
+          <w:p>
+            <w:r>
+              <w:t>22</w:t>
             </w:r>
           </w:p>
         </w:tc>

</xml_diff>

<commit_message>
GA-SK duzeltmesi: KEGM Yonetmeligi Md.7 birincil kaynak dogrulamasi
Md.7/1 (10 yillik bekletme) ve Md.7/2 (vefat/vesayette sartli varis/vasi
tahsisi) ayrimi netlestirildi. "Vesayet yolu tanimsiz/dayanaksiz" onculu
yanlisti - Md.7/2 bu yolu tanimliyor ama dar kapsamli (sure sonrasi akibet
belirsiz, esdeger belge sarti, ayni bolge ikamet sarti, KEGM takdiri).

Analiz (S3+S5), Envanter, Tablo B (Taslak 9) ve Oy Pusulasi'nda GA-SK
metni bu bulguya gore yeniden yazildi.

Co-Authored-By: Claude Opus 4.8 <noreply@anthropic.com>
</commit_message>
<xml_diff>
--- a/Amator_Telsizcilik_Tablo_A_Mevzuat_Analizi_v1.0.docx
+++ b/Amator_Telsizcilik_Tablo_A_Mevzuat_Analizi_v1.0.docx
@@ -8354,22 +8354,18 @@
         <w:rPr>
           <w:b/>
         </w:rPr>
-        <w:t xml:space="preserve">Sorun: </w:t>
-      </w:r>
-      <w:r>
-        <w:t>KEGM Sınav ve Belgelendirme Yönetmeliği belge iptalinde (vefat dâhil) çağrı işaretini 10 yıl pasif tutar ve başkasına vermez/devredilemez. SK'nin resmî tanımı, 10 yıl sonrası akıbet ve aileye/kulübe 'in memoriam' vesayet yolu tanımsızdır. 'Babadan oğla geçme' fiilî bir talep olup mevcut hukuki dayanağı yoktur.</w:t>
-      </w:r>
+        <w:t>Sorun: KEGM Sınav ve Belgelendirme Yönetmeliği Md.7, iki ayrı hüküm içerir: Md.7/1 — belgenin yenilenmemesi, organizasyon feshi, bölge değişikliği, KEGM iptali veya sahibinin vazgeçmesi hâllerinde çağrı işareti 10 yıl yeniden tahsis edilmez (vefat bu fıkrada sayılmaz). Md.7/2 — vefat veya vesayet hâlinde ayrı ve daha esnek bir hüküm işler: belgenin geçerlilik süresi içinde olmak, aynı bölgede ikamet etmek ve eşdeğer belgeye sahip olmak kaydıyla, hak sahipliğini belgeleyen varis/vasiye çağrı işareti tahsis EDİLEBİLİR. Yani vesayet yolu, camiada yaygın 'tanımsız/hukuki dayanaksız' algısının aksine tanımlıdır; ancak dardır: (a) yalnızca orijinal belgenin 10 yıllık süresi içinde işler, süre sonrası akıbet mevzuatta açık değildir; (b) varis/vasinin zaten eşdeğer sınıfta belge sahibi olması gerekir — belgesiz aile üyeleri kapsam dışıdır; (c) aynı bölgede ikamet şartı coğrafi engel olabilir; (d) tahsis KEGM takdirindedir ('edilebilir'), güvenceli değildir.</w:t>
+      </w:r>
+      <w:r/>
     </w:p>
     <w:p>
       <w:r>
         <w:rPr>
           <w:b/>
         </w:rPr>
-        <w:t xml:space="preserve">TR Mevzuatı: </w:t>
-      </w:r>
-      <w:r>
-        <w:t>KEGM Sınav ve Belgelendirme Yönetmeliği (RG 27482): iptal sonrası çağrı işareti 10 yıl yeniden tahsis edilmez; devredilemez.</w:t>
-      </w:r>
+        <w:t>TR Mevzuatı: KEGM Sınav ve Belgelendirme Yönetmeliği (RG 27482) Md.7/1 (10 yıl bekletme; vefat hariç) ve Md.7/2 (vefat/vesayette şartlı varis/vasi tahsisi).</w:t>
+      </w:r>
+      <w:r/>
     </w:p>
     <w:p>
       <w:r>
@@ -8398,11 +8394,9 @@
         <w:rPr>
           <w:b/>
         </w:rPr>
-        <w:t xml:space="preserve">Öneri / Talep: </w:t>
-      </w:r>
-      <w:r>
-        <w:t>KEGM'den bekletme süresi (koru/uzat/kısalt/kaldır) ve vesayet (devredilemez / şartlı aile-kulüp / süre sonu serbest / kalıcı anıt) tercihlerinin usule bağlanması; SK ve çağrı işareti yaşam döngüsünün tanımlanması.</w:t>
-      </w:r>
+        <w:t>Öneri / Talep: KEGM'den: (1) Md.7/2'nin belge süresi sonrası akıbetinin netleştirilmesi; (2) 'eşdeğer belge sahibi olma' şartının aile üyeleri için esnetilip esnetilemeyeceğinin değerlendirilmesi; (3) bu mekanizmanın topluluğa rehberle duyurulması; (4) kalıcı 'anıt' statüsü gibi ek seçeneklerin değerlendirilmesi.</w:t>
+      </w:r>
+      <w:r/>
     </w:p>
     <w:p>
       <w:r>
@@ -10388,7 +10382,7 @@
     </w:p>
     <w:p>
       <w:r>
-        <w:t>Belge iptalinde (vefat dâhil) çağrı işareti 10 yıl pasif tutulur ve devredilemez. 10 yıl sonrası akıbet ile aileye/kulübe 'in memoriam' tahsis usulü tanımsızdır; 'babadan oğla geçme' hukuki dayanaktan yoksundur. Usulün tanımlanması KEGM'den talep edilmektedir (Tablo B, Taslak 9).</w:t>
+        <w:t>Camiada yaygın algının aksine bu tanımsız değil: KEGM Yönetmeliği Md.7/2, vefat/vesayet hâlinde çağrı işaretinin — belgenin geçerlilik süresi içinde, aynı bölgede ikamet eden ve eşdeğer belgeye sahip bir varis/vasiye, hak sahipliği belgelenerek — tahsis edilebileceğini düzenler. Ancak dar bir mekanizmadır: süre sonrası akıbet açık değildir ve varisin zaten kendi belgesine sahip olması şartı çoğu aileyi kapsam dışı bırakır. Usulün netleştirilmesi KEGM'den talep edilmektedir (Tablo B, Taslak 9).</w:t>
       </w:r>
     </w:p>
     <w:p>
@@ -10473,7 +10467,7 @@
         <w:spacing w:before="80" w:after="120"/>
       </w:pPr>
       <w:r>
-        <w:t>Gri alanlar ve IARU eksiklikleri tamamlandı. Her talep için gerekçe, dayanak, muhatap kurum ve örnek başvuru taslağı Tablo B'de hazırlanmıştır (19 talep). Aşağıdaki tablo 21 talebin tümünü özetler; gerekçeler, dayanaklar ve örnek başvuru taslakları Tablo B'dedir.</w:t>
+        <w:t>Gri alanlar ve IARU eksiklikleri tamamlandı. Her talep için gerekçe, dayanak, muhatap kurum ve örnek başvuru taslağı Tablo B'de hazırlanmıştır (22 talep). Aşağıdaki tablo 22 talebin tümünü özetler; gerekçeler, dayanaklar ve örnek başvuru taslakları Tablo B'dedir.</w:t>
       </w:r>
     </w:p>
     <w:p>

</xml_diff>

<commit_message>
Analiz: 11 gri alan bolumu renkli kutulu tablo bicimine cevrildi
Icerik degismedi; GA-BAND-1/2/3, GA-ARAC, GA-POTA, GA-AREDN, GA-LORA,
GA-SK, GA-CALL, GA-CIHAZ, GA-EMCOMM artik diger 11 gri alanla (GA-1...
GA-ENFORC) ayni gorsel bicimde. Word COM ile PDF'e aktarilip 20 sayfa
tam gorsel olarak dogrulandi.
</commit_message>
<xml_diff>
--- a/Amator_Telsizcilik_Tablo_A_Mevzuat_Analizi_v1.0.docx
+++ b/Amator_Telsizcilik_Tablo_A_Mevzuat_Analizi_v1.0.docx
@@ -7968,47 +7968,356 @@
         <w:t>Sorun: KEGM Sınav Yönetmeliği (RG 27482) A, B ve C sınıflarını tanımlar; ancak her sınıfın yetkili frekans bantları ve maksimum güç değerleri kapsamlı, tek bir resmi belgede yayımlanmış değildir. FTM Yönetmeliği Tablo 25 ve TAD 2021, bant bazında sınıf kısıtlamalarini dağıtık şekilde içerir. Önemli tespitler: (a) 50-52 MHz yalnızca A ve B sınıfı için açıktir — C sınıfı kendi istasyonunda 50 MHz'i bağımsız kullanamaz. (b) B sınıfı amatör belgesine sahip telsizciler 'eğitim ve özendirme' amacı ile kendi imalı (homebrew) cihaz ile 7000-7100 kHz ve 28000-29700 kHz bantlarında 5W ile faaliyet gösterebilir (FTM Tablo 25). (c) C sınıfı 144 ve 430 MHz bantlarında, el telsizinde en fazla 5W FM ile sınırlıdır. (d) 2022 FTM Taslağı Md.22 §10: B ve C, A sınıfı istasyon/kulüp gözetiminde tüm amatör bantlara erişebilir; bu hüküm halen yürürlükte değildir (taslak).</w:t>
       </w:r>
     </w:p>
-    <w:p>
-      <w:pPr>
-        <w:spacing w:before="60" w:after="100"/>
-      </w:pPr>
-      <w:r>
-        <w:t>TR Mevzuatı: BTK FTM Teknik Ölçütler (RG 30608, 27.11.2018) Tablo 25: Sınıf bazlı yetki satırları. 50-52 MHz: 'A ve B' (C sınıfı dahil değil). 144-146 MHz ve 430-440 MHz: 'A, B ve C' (C sınıfı el telsizinde en fazla 5W FM). 1240 MHz ve mikrodalga: 'A ve B'. HF bantları: genel olarak A sınıfı; istisnalar — 7000-7100 kHz ve 28000-29700 kHz: B sınıfı, kendi imalı cihaz, en fazla 5W, eğitim ve özendirme amacı (FTM Tablo 25). BTK TAD 2021 TAD08-01-04: 50-52 MHz, A ve B Sınıfı, 75W p.e.p. KEGM Sınav Yönetmeliği Md.18: B sınıfı yetki içerik atfı 'Özel Telsiz Sistemleri Yönetmeliği EK-4 Tablo-1'e' yapılmıştır (bu belge BTK arşivlerinde; resmi mevzuatta güncellenmesi gerekir). 2022 FTM Güncelleme Taslağı Md.22 §10: B ve C sınıfının kulüp/eğitim kurumu/A sınıfı istasyon gözetiminde tüm bantlara erişimi (henüz yürürlükte değil).</w:t>
-      </w:r>
-    </w:p>
-    <w:p>
-      <w:pPr>
-        <w:spacing w:before="60" w:after="100"/>
-      </w:pPr>
-      <w:r>
-        <w:t>IARU / CEPT: CEPT T/R 61-01 (Şubat 2024 rev.): Tier 1 (HF dahil tam yetki) / Tier 2 (VHF/UHF sınırlı) ayrımı resmi tablo; TR T/R 61-01'e taraftır; ancak iç mevzuatta Tier 1/Tier 2 ayrımına karşılık gelen sınıf-yetki tablosu kamuya açık biçimde yayımlanmamıştır. ECC Recommendation (05)06: Novice/Standart iki katmanlı lisans çerçevesi. IARU R1 Bandplan: Sınıf bazlı sub-band önerileri (örneğin CW/SSB alt bantları). Kaynak: docdb.cept.org, iaru-r1.org.</w:t>
-      </w:r>
-    </w:p>
-    <w:p>
-      <w:pPr>
-        <w:spacing w:before="60" w:after="100"/>
-      </w:pPr>
+    <w:tbl>
+      <w:tblPr>
+        <w:tblW w:w="9026" w:type="dxa"/>
+        <w:tblInd w:w="110" w:type="dxa"/>
+        <w:tblBorders>
+          <w:top w:val="single" w:sz="4" w:space="0" w:color="auto"/>
+          <w:left w:val="single" w:sz="4" w:space="0" w:color="auto"/>
+          <w:bottom w:val="single" w:sz="4" w:space="0" w:color="auto"/>
+          <w:right w:val="single" w:sz="4" w:space="0" w:color="auto"/>
+          <w:insideH w:val="single" w:sz="4" w:space="0" w:color="auto"/>
+          <w:insideV w:val="single" w:sz="4" w:space="0" w:color="auto"/>
+        </w:tblBorders>
+        <w:tblCellMar>
+          <w:left w:w="10" w:type="dxa"/>
+          <w:right w:w="10" w:type="dxa"/>
+        </w:tblCellMar>
+        <w:tblLook w:val="0000"/>
+      </w:tblPr>
+      <w:tblGrid>
+        <w:gridCol w:w="1400"/>
+        <w:gridCol w:w="7626"/>
+      </w:tblGrid>
+      <w:tr>
+        <w:tc>
+          <w:tcPr>
+            <w:tcW w:w="1400" w:type="dxa"/>
+            <w:tcBorders>
+              <w:top w:val="single" w:sz="1" w:space="0" w:color="2E75B6"/>
+              <w:left w:val="single" w:sz="1" w:space="0" w:color="2E75B6"/>
+              <w:bottom w:val="single" w:sz="1" w:space="0" w:color="2E75B6"/>
+              <w:right w:val="single" w:sz="1" w:space="0" w:color="2E75B6"/>
+            </w:tcBorders>
+            <w:shd w:val="clear" w:color="auto" w:fill="2E75B6"/>
+            <w:tcMar>
+              <w:top w:w="80" w:type="dxa"/>
+              <w:left w:w="120" w:type="dxa"/>
+              <w:bottom w:w="80" w:type="dxa"/>
+              <w:right w:w="120" w:type="dxa"/>
+            </w:tcMar>
+            <w:vAlign w:val="center"/>
+          </w:tcPr>
+          <w:p>
+            <w:r>
+              <w:rPr>
+                <w:b/>
+                <w:bCs/>
+                <w:color w:val="FFFFFF"/>
+                <w:sz w:val="17"/>
+                <w:szCs w:val="17"/>
+              </w:rPr>
+              <w:t>TR Mevzuatı</w:t>
+            </w:r>
+          </w:p>
+        </w:tc>
+        <w:tc>
+          <w:tcPr>
+            <w:tcW w:w="7626" w:type="dxa"/>
+            <w:tcBorders>
+              <w:top w:val="single" w:sz="1" w:space="0" w:color="2E75B6"/>
+              <w:left w:val="single" w:sz="1" w:space="0" w:color="2E75B6"/>
+              <w:bottom w:val="single" w:sz="1" w:space="0" w:color="2E75B6"/>
+              <w:right w:val="single" w:sz="1" w:space="0" w:color="2E75B6"/>
+            </w:tcBorders>
+            <w:shd w:val="clear" w:color="auto" w:fill="D6E4F0"/>
+            <w:tcMar>
+              <w:top w:w="80" w:type="dxa"/>
+              <w:left w:w="160" w:type="dxa"/>
+              <w:bottom w:w="80" w:type="dxa"/>
+              <w:right w:w="120" w:type="dxa"/>
+            </w:tcMar>
+          </w:tcPr>
+          <w:p>
+            <w:r>
+              <w:rPr>
+                <w:i/>
+                <w:iCs/>
+                <w:sz w:val="18"/>
+                <w:szCs w:val="18"/>
+              </w:rPr>
+              <w:t>BTK FTM Teknik Ölçütler (RG 30608, 27.11.2018) Tablo 25: Sınıf bazlı yetki satırları. 50-52 MHz: 'A ve B' (C sınıfı dahil değil). 144-146 MHz ve 430-440 MHz: 'A, B ve C' (C sınıfı el telsizinde en fazla 5W FM). 1240 MHz ve mikrodalga: 'A ve B'. HF bantları: genel olarak A sınıfı; istisnalar — 7000-7100 kHz ve 28000-29700 kHz: B sınıfı, kendi imalı cihaz, en fazla 5W, eğitim ve özendirme amacı (FTM Tablo 25). BTK TAD 2021 TAD08-01-04: 50-52 MHz, A ve B Sınıfı, 75W p.e.p. KEGM Sınav Yönetmeliği Md.18: B sınıfı yetki içerik atfı 'Özel Telsiz Sistemleri Yönetmeliği EK-4 Tablo-1'e' yapılmıştır (bu belge BTK arşivlerinde; resmi mevzuatta güncellenmesi gerekir). 2022 FTM Güncelleme Taslağı Md.22 §10: B ve C sınıfının kulüp/eğitim kurumu/A sınıfı istasyon gözetiminde tüm bantlara erişimi (henüz yürürlükte değil).</w:t>
+            </w:r>
+          </w:p>
+        </w:tc>
+      </w:tr>
+    </w:tbl>
+    <w:tbl>
+      <w:tblPr>
+        <w:tblW w:w="9026" w:type="dxa"/>
+        <w:tblInd w:w="110" w:type="dxa"/>
+        <w:tblBorders>
+          <w:top w:val="single" w:sz="4" w:space="0" w:color="auto"/>
+          <w:left w:val="single" w:sz="4" w:space="0" w:color="auto"/>
+          <w:bottom w:val="single" w:sz="4" w:space="0" w:color="auto"/>
+          <w:right w:val="single" w:sz="4" w:space="0" w:color="auto"/>
+          <w:insideH w:val="single" w:sz="4" w:space="0" w:color="auto"/>
+          <w:insideV w:val="single" w:sz="4" w:space="0" w:color="auto"/>
+        </w:tblBorders>
+        <w:tblCellMar>
+          <w:left w:w="10" w:type="dxa"/>
+          <w:right w:w="10" w:type="dxa"/>
+        </w:tblCellMar>
+        <w:tblLook w:val="0000"/>
+      </w:tblPr>
+      <w:tblGrid>
+        <w:gridCol w:w="1400"/>
+        <w:gridCol w:w="7626"/>
+      </w:tblGrid>
+      <w:tr>
+        <w:tc>
+          <w:tcPr>
+            <w:tcW w:w="1400" w:type="dxa"/>
+            <w:tcBorders>
+              <w:top w:val="single" w:sz="1" w:space="0" w:color="2E75B6"/>
+              <w:left w:val="single" w:sz="1" w:space="0" w:color="2E75B6"/>
+              <w:bottom w:val="single" w:sz="1" w:space="0" w:color="2E75B6"/>
+              <w:right w:val="single" w:sz="1" w:space="0" w:color="2E75B6"/>
+            </w:tcBorders>
+            <w:shd w:val="clear" w:color="auto" w:fill="2E75B6"/>
+            <w:tcMar>
+              <w:top w:w="80" w:type="dxa"/>
+              <w:left w:w="120" w:type="dxa"/>
+              <w:bottom w:w="80" w:type="dxa"/>
+              <w:right w:w="120" w:type="dxa"/>
+            </w:tcMar>
+            <w:vAlign w:val="center"/>
+          </w:tcPr>
+          <w:p>
+            <w:r>
+              <w:rPr>
+                <w:b/>
+                <w:bCs/>
+                <w:color w:val="FFFFFF"/>
+                <w:sz w:val="17"/>
+                <w:szCs w:val="17"/>
+              </w:rPr>
+              <w:t>IARU / CEPT</w:t>
+            </w:r>
+          </w:p>
+        </w:tc>
+        <w:tc>
+          <w:tcPr>
+            <w:tcW w:w="7626" w:type="dxa"/>
+            <w:tcBorders>
+              <w:top w:val="single" w:sz="1" w:space="0" w:color="2E75B6"/>
+              <w:left w:val="single" w:sz="1" w:space="0" w:color="2E75B6"/>
+              <w:bottom w:val="single" w:sz="1" w:space="0" w:color="2E75B6"/>
+              <w:right w:val="single" w:sz="1" w:space="0" w:color="2E75B6"/>
+            </w:tcBorders>
+            <w:shd w:val="clear" w:color="auto" w:fill="E2EFDA"/>
+            <w:tcMar>
+              <w:top w:w="80" w:type="dxa"/>
+              <w:left w:w="160" w:type="dxa"/>
+              <w:bottom w:w="80" w:type="dxa"/>
+              <w:right w:w="120" w:type="dxa"/>
+            </w:tcMar>
+          </w:tcPr>
+          <w:p>
+            <w:r>
+              <w:rPr>
+                <w:i/>
+                <w:iCs/>
+                <w:sz w:val="18"/>
+                <w:szCs w:val="18"/>
+              </w:rPr>
+              <w:t>CEPT T/R 61-01 (Şubat 2024 rev.): Tier 1 (HF dahil tam yetki) / Tier 2 (VHF/UHF sınırlı) ayrımı resmi tablo; TR T/R 61-01'e taraftır; ancak iç mevzuatta Tier 1/Tier 2 ayrımına karşılık gelen sınıf-yetki tablosu kamuya açık biçimde yayımlanmamıştır. ECC Recommendation (05)06: Novice/Standart iki katmanlı lisans çerçevesi. IARU R1 Bandplan: Sınıf bazlı sub-band önerileri (örneğin CW/SSB alt bantları).</w:t>
+            </w:r>
+          </w:p>
+        </w:tc>
+      </w:tr>
+    </w:tbl>
+    <w:tbl>
+      <w:tblPr>
+        <w:tblW w:w="9026" w:type="dxa"/>
+        <w:tblInd w:w="110" w:type="dxa"/>
+        <w:tblBorders>
+          <w:top w:val="single" w:sz="4" w:space="0" w:color="auto"/>
+          <w:left w:val="single" w:sz="4" w:space="0" w:color="auto"/>
+          <w:bottom w:val="single" w:sz="4" w:space="0" w:color="auto"/>
+          <w:right w:val="single" w:sz="4" w:space="0" w:color="auto"/>
+          <w:insideH w:val="single" w:sz="4" w:space="0" w:color="auto"/>
+          <w:insideV w:val="single" w:sz="4" w:space="0" w:color="auto"/>
+        </w:tblBorders>
+        <w:tblCellMar>
+          <w:left w:w="10" w:type="dxa"/>
+          <w:right w:w="10" w:type="dxa"/>
+        </w:tblCellMar>
+        <w:tblLook w:val="0000"/>
+      </w:tblPr>
+      <w:tblGrid>
+        <w:gridCol w:w="1400"/>
+        <w:gridCol w:w="7626"/>
+      </w:tblGrid>
+      <w:tr>
+        <w:tc>
+          <w:tcPr>
+            <w:tcW w:w="1400" w:type="dxa"/>
+            <w:tcBorders>
+              <w:top w:val="single" w:sz="1" w:space="0" w:color="2E75B6"/>
+              <w:left w:val="single" w:sz="1" w:space="0" w:color="2E75B6"/>
+              <w:bottom w:val="single" w:sz="1" w:space="0" w:color="2E75B6"/>
+              <w:right w:val="single" w:sz="1" w:space="0" w:color="2E75B6"/>
+            </w:tcBorders>
+            <w:shd w:val="clear" w:color="auto" w:fill="2E75B6"/>
+            <w:tcMar>
+              <w:top w:w="80" w:type="dxa"/>
+              <w:left w:w="120" w:type="dxa"/>
+              <w:bottom w:w="80" w:type="dxa"/>
+              <w:right w:w="120" w:type="dxa"/>
+            </w:tcMar>
+            <w:vAlign w:val="center"/>
+          </w:tcPr>
+          <w:p>
+            <w:r>
+              <w:rPr>
+                <w:b/>
+                <w:bCs/>
+                <w:color w:val="FFFFFF"/>
+                <w:sz w:val="17"/>
+                <w:szCs w:val="17"/>
+              </w:rPr>
+              <w:t>Diğer Ülkeler</w:t>
+            </w:r>
+          </w:p>
+        </w:tc>
+        <w:tc>
+          <w:tcPr>
+            <w:tcW w:w="7626" w:type="dxa"/>
+            <w:tcBorders>
+              <w:top w:val="single" w:sz="1" w:space="0" w:color="2E75B6"/>
+              <w:left w:val="single" w:sz="1" w:space="0" w:color="2E75B6"/>
+              <w:bottom w:val="single" w:sz="1" w:space="0" w:color="2E75B6"/>
+              <w:right w:val="single" w:sz="1" w:space="0" w:color="2E75B6"/>
+            </w:tcBorders>
+            <w:shd w:val="clear" w:color="auto" w:fill="FFFFFF"/>
+            <w:tcMar>
+              <w:top w:w="80" w:type="dxa"/>
+              <w:left w:w="160" w:type="dxa"/>
+              <w:bottom w:w="80" w:type="dxa"/>
+              <w:right w:w="120" w:type="dxa"/>
+            </w:tcMar>
+          </w:tcPr>
+          <w:p>
+            <w:r>
+              <w:rPr>
+                <w:i/>
+                <w:iCs/>
+                <w:sz w:val="18"/>
+                <w:szCs w:val="18"/>
+              </w:rPr>
+              <w:t>DE (AFuV §2): Sınıf bazlı yetki tablosu tek belgede. GB (Ofcom NoV): Foundation/Intermediate/Full yetkiler PDF tabloda kamuya açık. US (FCC Part 97.301): Technician/General/Extra bant-sınıf tablosu.</w:t>
+            </w:r>
+          </w:p>
+        </w:tc>
+      </w:tr>
+    </w:tbl>
+    <w:tbl>
+      <w:tblPr>
+        <w:tblW w:w="9026" w:type="dxa"/>
+        <w:tblInd w:w="110" w:type="dxa"/>
+        <w:tblBorders>
+          <w:top w:val="single" w:sz="4" w:space="0" w:color="auto"/>
+          <w:left w:val="single" w:sz="4" w:space="0" w:color="auto"/>
+          <w:bottom w:val="single" w:sz="4" w:space="0" w:color="auto"/>
+          <w:right w:val="single" w:sz="4" w:space="0" w:color="auto"/>
+          <w:insideH w:val="single" w:sz="4" w:space="0" w:color="auto"/>
+          <w:insideV w:val="single" w:sz="4" w:space="0" w:color="auto"/>
+        </w:tblBorders>
+        <w:tblCellMar>
+          <w:left w:w="10" w:type="dxa"/>
+          <w:right w:w="10" w:type="dxa"/>
+        </w:tblCellMar>
+        <w:tblLook w:val="0000"/>
+      </w:tblPr>
+      <w:tblGrid>
+        <w:gridCol w:w="1400"/>
+        <w:gridCol w:w="7626"/>
+      </w:tblGrid>
+      <w:tr>
+        <w:tc>
+          <w:tcPr>
+            <w:tcW w:w="1400" w:type="dxa"/>
+            <w:tcBorders>
+              <w:top w:val="single" w:sz="1" w:space="0" w:color="2E75B6"/>
+              <w:left w:val="single" w:sz="1" w:space="0" w:color="2E75B6"/>
+              <w:bottom w:val="single" w:sz="1" w:space="0" w:color="2E75B6"/>
+              <w:right w:val="single" w:sz="1" w:space="0" w:color="2E75B6"/>
+            </w:tcBorders>
+            <w:shd w:val="clear" w:color="auto" w:fill="2E75B6"/>
+            <w:tcMar>
+              <w:top w:w="80" w:type="dxa"/>
+              <w:left w:w="120" w:type="dxa"/>
+              <w:bottom w:w="80" w:type="dxa"/>
+              <w:right w:w="120" w:type="dxa"/>
+            </w:tcMar>
+            <w:vAlign w:val="center"/>
+          </w:tcPr>
+          <w:p>
+            <w:r>
+              <w:rPr>
+                <w:b/>
+                <w:bCs/>
+                <w:color w:val="FFFFFF"/>
+                <w:sz w:val="17"/>
+                <w:szCs w:val="17"/>
+              </w:rPr>
+              <w:t>Öneri / Talep</w:t>
+            </w:r>
+          </w:p>
+        </w:tc>
+        <w:tc>
+          <w:tcPr>
+            <w:tcW w:w="7626" w:type="dxa"/>
+            <w:tcBorders>
+              <w:top w:val="single" w:sz="1" w:space="0" w:color="2E75B6"/>
+              <w:left w:val="single" w:sz="1" w:space="0" w:color="2E75B6"/>
+              <w:bottom w:val="single" w:sz="1" w:space="0" w:color="2E75B6"/>
+              <w:right w:val="single" w:sz="1" w:space="0" w:color="2E75B6"/>
+            </w:tcBorders>
+            <w:shd w:val="clear" w:color="auto" w:fill="FCE4D6"/>
+            <w:tcMar>
+              <w:top w:w="80" w:type="dxa"/>
+              <w:left w:w="160" w:type="dxa"/>
+              <w:bottom w:w="80" w:type="dxa"/>
+              <w:right w:w="120" w:type="dxa"/>
+            </w:tcMar>
+          </w:tcPr>
+          <w:p>
+            <w:r>
+              <w:rPr>
+                <w:i/>
+                <w:iCs/>
+                <w:sz w:val="18"/>
+                <w:szCs w:val="18"/>
+              </w:rPr>
+              <w:t>KEGM + BTK'dan Talep: (1) Her belge sınıfının yetkili bantlarını, max ERP/PEP değerlerini ve özel koşulları (kendi imalatı cihaz, göz altında çalışma vs.) gösteren resmi, kamuya açık tek tablonun yayımlanması. (2) FTM Tablo 25'te B sınıfı 40m/10m homebrew provizyon mevcut olmakla birlikte, bu hakkın duyurulmaması amatörlerin yararlanamamasına yol açmaktadır; KEGM ve amatör telsiz dernek ve kulüpleri tarafından duyuru yapılması. (3) 2022 FTM Taslağı Md.22 §10'daki B/C sınıfı gözetimli erişim düzenlenmesinin yürürlüğe girmesi. (4) Sınıf yetki tablosunun CEPT T/R 61-01 Tier yapısıyla uyumlu hale getirilmesi.</w:t>
+            </w:r>
+          </w:p>
+        </w:tc>
+      </w:tr>
+    </w:tbl>
+    <w:p>
       <w:r>
         <w:rPr>
           <w:b/>
-          <w:color w:val="2E75B6"/>
-          <w:sz w:val="18"/>
         </w:rPr>
-        <w:t>Diğer Ülkeler: DE (AFuV §2): Sınıf bazlı yetki tablosu tek belgede. GB (Ofcom NoV): Foundation/Intermediate/Full yetkiler PDF tabloda kamuya açık. US (FCC Part 97.301): Technician/General/Extra bant-sınıf tablosu.</w:t>
-      </w:r>
-    </w:p>
-    <w:p>
-      <w:pPr>
-        <w:spacing w:before="60" w:after="100"/>
-      </w:pPr>
-      <w:r>
-        <w:t>Öneri / Talep: KEGM + BTK'dan Talep: (1) Her belge sınıfının yetkili bantlarını, max ERP/PEP değerlerini ve özel koşulları (kendi imalatı cihaz, göz altında çalışma vs.) gösteren resmi, kamuya açık tek tablonun yayımlanması. (2) FTM Tablo 25'te B sınıfı 40m/10m homebrew provizyon mevcut olmakla birlikte, bu hakkın duyurulmaması amatörlerin yararlanamamasına yol açmaktadır; KEGM ve amatör telsiz dernek ve kulüpleri tarafından duyuru yapılması. (3) 2022 FTM Taslağı Md.22 §10'daki B/C sınıfı gözetimli erişim düzenlenmesinin yürürlüğe girmesi. (4) Sınıf yetki tablosunun CEPT T/R 61-01 Tier yapısıyla uyumlu hale getirilmesi.</w:t>
-      </w:r>
-    </w:p>
-    <w:p>
-      <w:pPr>
-        <w:spacing w:before="80" w:after="80"/>
-      </w:pPr>
+        <w:t xml:space="preserve">Kaynak: </w:t>
+      </w:r>
+      <w:r>
+        <w:t xml:space="preserve">docdb.cept.org, iaru-r1.org.</w:t>
+      </w:r>
     </w:p>
     <w:p>
       <w:pPr>
@@ -8035,68 +8344,356 @@
         <w:t>Sorun: 70-70.5 MHz bandı CEPT üyelerinin bir kısmında (GB, IE, NL, SK, DK vb.) amatör ikincil tahsislidir. BTK Milli Frekans Planı bu aralıkta amatör tahsis içermemektedir. ITU Region 1 Frekans Tablosunda ülke bazlı esneklik tanınan bir bölgededir.</w:t>
       </w:r>
     </w:p>
-    <w:p>
-      <w:pPr>
-        <w:spacing w:before="60" w:after="100"/>
-      </w:pPr>
+    <w:tbl>
+      <w:tblPr>
+        <w:tblW w:w="9026" w:type="dxa"/>
+        <w:tblInd w:w="110" w:type="dxa"/>
+        <w:tblBorders>
+          <w:top w:val="single" w:sz="4" w:space="0" w:color="auto"/>
+          <w:left w:val="single" w:sz="4" w:space="0" w:color="auto"/>
+          <w:bottom w:val="single" w:sz="4" w:space="0" w:color="auto"/>
+          <w:right w:val="single" w:sz="4" w:space="0" w:color="auto"/>
+          <w:insideH w:val="single" w:sz="4" w:space="0" w:color="auto"/>
+          <w:insideV w:val="single" w:sz="4" w:space="0" w:color="auto"/>
+        </w:tblBorders>
+        <w:tblCellMar>
+          <w:left w:w="10" w:type="dxa"/>
+          <w:right w:w="10" w:type="dxa"/>
+        </w:tblCellMar>
+        <w:tblLook w:val="0000"/>
+      </w:tblPr>
+      <w:tblGrid>
+        <w:gridCol w:w="1400"/>
+        <w:gridCol w:w="7626"/>
+      </w:tblGrid>
+      <w:tr>
+        <w:tc>
+          <w:tcPr>
+            <w:tcW w:w="1400" w:type="dxa"/>
+            <w:tcBorders>
+              <w:top w:val="single" w:sz="1" w:space="0" w:color="2E75B6"/>
+              <w:left w:val="single" w:sz="1" w:space="0" w:color="2E75B6"/>
+              <w:bottom w:val="single" w:sz="1" w:space="0" w:color="2E75B6"/>
+              <w:right w:val="single" w:sz="1" w:space="0" w:color="2E75B6"/>
+            </w:tcBorders>
+            <w:shd w:val="clear" w:color="auto" w:fill="2E75B6"/>
+            <w:tcMar>
+              <w:top w:w="80" w:type="dxa"/>
+              <w:left w:w="120" w:type="dxa"/>
+              <w:bottom w:w="80" w:type="dxa"/>
+              <w:right w:w="120" w:type="dxa"/>
+            </w:tcMar>
+            <w:vAlign w:val="center"/>
+          </w:tcPr>
+          <w:p>
+            <w:r>
+              <w:rPr>
+                <w:b/>
+                <w:bCs/>
+                <w:color w:val="FFFFFF"/>
+                <w:sz w:val="17"/>
+                <w:szCs w:val="17"/>
+              </w:rPr>
+              <w:t>TR Mevzuatı</w:t>
+            </w:r>
+          </w:p>
+        </w:tc>
+        <w:tc>
+          <w:tcPr>
+            <w:tcW w:w="7626" w:type="dxa"/>
+            <w:tcBorders>
+              <w:top w:val="single" w:sz="1" w:space="0" w:color="2E75B6"/>
+              <w:left w:val="single" w:sz="1" w:space="0" w:color="2E75B6"/>
+              <w:bottom w:val="single" w:sz="1" w:space="0" w:color="2E75B6"/>
+              <w:right w:val="single" w:sz="1" w:space="0" w:color="2E75B6"/>
+            </w:tcBorders>
+            <w:shd w:val="clear" w:color="auto" w:fill="D6E4F0"/>
+            <w:tcMar>
+              <w:top w:w="80" w:type="dxa"/>
+              <w:left w:w="160" w:type="dxa"/>
+              <w:bottom w:w="80" w:type="dxa"/>
+              <w:right w:w="120" w:type="dxa"/>
+            </w:tcMar>
+          </w:tcPr>
+          <w:p>
+            <w:r>
+              <w:rPr>
+                <w:i/>
+                <w:iCs/>
+                <w:sz w:val="18"/>
+                <w:szCs w:val="18"/>
+              </w:rPr>
+              <w:t>BTK MFP: 70-70.5 MHz amatör tahsis yok. TAD 2021: 50-52 MHz var, 70 MHz yok.</w:t>
+            </w:r>
+          </w:p>
+        </w:tc>
+      </w:tr>
+    </w:tbl>
+    <w:tbl>
+      <w:tblPr>
+        <w:tblW w:w="9026" w:type="dxa"/>
+        <w:tblInd w:w="110" w:type="dxa"/>
+        <w:tblBorders>
+          <w:top w:val="single" w:sz="4" w:space="0" w:color="auto"/>
+          <w:left w:val="single" w:sz="4" w:space="0" w:color="auto"/>
+          <w:bottom w:val="single" w:sz="4" w:space="0" w:color="auto"/>
+          <w:right w:val="single" w:sz="4" w:space="0" w:color="auto"/>
+          <w:insideH w:val="single" w:sz="4" w:space="0" w:color="auto"/>
+          <w:insideV w:val="single" w:sz="4" w:space="0" w:color="auto"/>
+        </w:tblBorders>
+        <w:tblCellMar>
+          <w:left w:w="10" w:type="dxa"/>
+          <w:right w:w="10" w:type="dxa"/>
+        </w:tblCellMar>
+        <w:tblLook w:val="0000"/>
+      </w:tblPr>
+      <w:tblGrid>
+        <w:gridCol w:w="1400"/>
+        <w:gridCol w:w="7626"/>
+      </w:tblGrid>
+      <w:tr>
+        <w:tc>
+          <w:tcPr>
+            <w:tcW w:w="1400" w:type="dxa"/>
+            <w:tcBorders>
+              <w:top w:val="single" w:sz="1" w:space="0" w:color="2E75B6"/>
+              <w:left w:val="single" w:sz="1" w:space="0" w:color="2E75B6"/>
+              <w:bottom w:val="single" w:sz="1" w:space="0" w:color="2E75B6"/>
+              <w:right w:val="single" w:sz="1" w:space="0" w:color="2E75B6"/>
+            </w:tcBorders>
+            <w:shd w:val="clear" w:color="auto" w:fill="2E75B6"/>
+            <w:tcMar>
+              <w:top w:w="80" w:type="dxa"/>
+              <w:left w:w="120" w:type="dxa"/>
+              <w:bottom w:w="80" w:type="dxa"/>
+              <w:right w:w="120" w:type="dxa"/>
+            </w:tcMar>
+            <w:vAlign w:val="center"/>
+          </w:tcPr>
+          <w:p>
+            <w:r>
+              <w:rPr>
+                <w:b/>
+                <w:bCs/>
+                <w:color w:val="FFFFFF"/>
+                <w:sz w:val="17"/>
+                <w:szCs w:val="17"/>
+              </w:rPr>
+              <w:t>IARU / CEPT</w:t>
+            </w:r>
+          </w:p>
+        </w:tc>
+        <w:tc>
+          <w:tcPr>
+            <w:tcW w:w="7626" w:type="dxa"/>
+            <w:tcBorders>
+              <w:top w:val="single" w:sz="1" w:space="0" w:color="2E75B6"/>
+              <w:left w:val="single" w:sz="1" w:space="0" w:color="2E75B6"/>
+              <w:bottom w:val="single" w:sz="1" w:space="0" w:color="2E75B6"/>
+              <w:right w:val="single" w:sz="1" w:space="0" w:color="2E75B6"/>
+            </w:tcBorders>
+            <w:shd w:val="clear" w:color="auto" w:fill="E2EFDA"/>
+            <w:tcMar>
+              <w:top w:w="80" w:type="dxa"/>
+              <w:left w:w="160" w:type="dxa"/>
+              <w:bottom w:w="80" w:type="dxa"/>
+              <w:right w:w="120" w:type="dxa"/>
+            </w:tcMar>
+          </w:tcPr>
+          <w:p>
+            <w:r>
+              <w:rPr>
+                <w:i/>
+                <w:iCs/>
+                <w:sz w:val="18"/>
+                <w:szCs w:val="18"/>
+              </w:rPr>
+              <w:t>ECA Tablosu (ERC Report 25) dipnotu EU9: CEPT idareleri 69,9-70,5 MHz bandını amatör servise ikincil olarak açabilir (bazı üyeler uyguladı). IARU R1: 70.000-70.500 MHz koordinasyonu aktif.</w:t>
+            </w:r>
+          </w:p>
+        </w:tc>
+      </w:tr>
+    </w:tbl>
+    <w:tbl>
+      <w:tblPr>
+        <w:tblW w:w="9026" w:type="dxa"/>
+        <w:tblInd w:w="110" w:type="dxa"/>
+        <w:tblBorders>
+          <w:top w:val="single" w:sz="4" w:space="0" w:color="auto"/>
+          <w:left w:val="single" w:sz="4" w:space="0" w:color="auto"/>
+          <w:bottom w:val="single" w:sz="4" w:space="0" w:color="auto"/>
+          <w:right w:val="single" w:sz="4" w:space="0" w:color="auto"/>
+          <w:insideH w:val="single" w:sz="4" w:space="0" w:color="auto"/>
+          <w:insideV w:val="single" w:sz="4" w:space="0" w:color="auto"/>
+        </w:tblBorders>
+        <w:tblCellMar>
+          <w:left w:w="10" w:type="dxa"/>
+          <w:right w:w="10" w:type="dxa"/>
+        </w:tblCellMar>
+        <w:tblLook w:val="0000"/>
+      </w:tblPr>
+      <w:tblGrid>
+        <w:gridCol w:w="1400"/>
+        <w:gridCol w:w="7626"/>
+      </w:tblGrid>
+      <w:tr>
+        <w:tc>
+          <w:tcPr>
+            <w:tcW w:w="1400" w:type="dxa"/>
+            <w:tcBorders>
+              <w:top w:val="single" w:sz="1" w:space="0" w:color="2E75B6"/>
+              <w:left w:val="single" w:sz="1" w:space="0" w:color="2E75B6"/>
+              <w:bottom w:val="single" w:sz="1" w:space="0" w:color="2E75B6"/>
+              <w:right w:val="single" w:sz="1" w:space="0" w:color="2E75B6"/>
+            </w:tcBorders>
+            <w:shd w:val="clear" w:color="auto" w:fill="2E75B6"/>
+            <w:tcMar>
+              <w:top w:w="80" w:type="dxa"/>
+              <w:left w:w="120" w:type="dxa"/>
+              <w:bottom w:w="80" w:type="dxa"/>
+              <w:right w:w="120" w:type="dxa"/>
+            </w:tcMar>
+            <w:vAlign w:val="center"/>
+          </w:tcPr>
+          <w:p>
+            <w:r>
+              <w:rPr>
+                <w:b/>
+                <w:bCs/>
+                <w:color w:val="FFFFFF"/>
+                <w:sz w:val="17"/>
+                <w:szCs w:val="17"/>
+              </w:rPr>
+              <w:t>Diğer Ülkeler</w:t>
+            </w:r>
+          </w:p>
+        </w:tc>
+        <w:tc>
+          <w:tcPr>
+            <w:tcW w:w="7626" w:type="dxa"/>
+            <w:tcBorders>
+              <w:top w:val="single" w:sz="1" w:space="0" w:color="2E75B6"/>
+              <w:left w:val="single" w:sz="1" w:space="0" w:color="2E75B6"/>
+              <w:bottom w:val="single" w:sz="1" w:space="0" w:color="2E75B6"/>
+              <w:right w:val="single" w:sz="1" w:space="0" w:color="2E75B6"/>
+            </w:tcBorders>
+            <w:shd w:val="clear" w:color="auto" w:fill="FFFFFF"/>
+            <w:tcMar>
+              <w:top w:w="80" w:type="dxa"/>
+              <w:left w:w="160" w:type="dxa"/>
+              <w:bottom w:w="80" w:type="dxa"/>
+              <w:right w:w="120" w:type="dxa"/>
+            </w:tcMar>
+          </w:tcPr>
+          <w:p>
+            <w:r>
+              <w:rPr>
+                <w:i/>
+                <w:iCs/>
+                <w:sz w:val="18"/>
+                <w:szCs w:val="18"/>
+              </w:rPr>
+              <w:t>GB: 70.0-70.5 MHz Full/Intermediate lisansla serbest. IE, NL, SK, DK: ikincil tahsis aktif. GR (TR komşu): henüz yok. DE, FR: tahsis yok — CEPT üyelerinin tamamında değil, ülke bazlı esneklik var.</w:t>
+            </w:r>
+          </w:p>
+        </w:tc>
+      </w:tr>
+    </w:tbl>
+    <w:tbl>
+      <w:tblPr>
+        <w:tblW w:w="9026" w:type="dxa"/>
+        <w:tblInd w:w="110" w:type="dxa"/>
+        <w:tblBorders>
+          <w:top w:val="single" w:sz="4" w:space="0" w:color="auto"/>
+          <w:left w:val="single" w:sz="4" w:space="0" w:color="auto"/>
+          <w:bottom w:val="single" w:sz="4" w:space="0" w:color="auto"/>
+          <w:right w:val="single" w:sz="4" w:space="0" w:color="auto"/>
+          <w:insideH w:val="single" w:sz="4" w:space="0" w:color="auto"/>
+          <w:insideV w:val="single" w:sz="4" w:space="0" w:color="auto"/>
+        </w:tblBorders>
+        <w:tblCellMar>
+          <w:left w:w="10" w:type="dxa"/>
+          <w:right w:w="10" w:type="dxa"/>
+        </w:tblCellMar>
+        <w:tblLook w:val="0000"/>
+      </w:tblPr>
+      <w:tblGrid>
+        <w:gridCol w:w="1400"/>
+        <w:gridCol w:w="7626"/>
+      </w:tblGrid>
+      <w:tr>
+        <w:tc>
+          <w:tcPr>
+            <w:tcW w:w="1400" w:type="dxa"/>
+            <w:tcBorders>
+              <w:top w:val="single" w:sz="1" w:space="0" w:color="2E75B6"/>
+              <w:left w:val="single" w:sz="1" w:space="0" w:color="2E75B6"/>
+              <w:bottom w:val="single" w:sz="1" w:space="0" w:color="2E75B6"/>
+              <w:right w:val="single" w:sz="1" w:space="0" w:color="2E75B6"/>
+            </w:tcBorders>
+            <w:shd w:val="clear" w:color="auto" w:fill="2E75B6"/>
+            <w:tcMar>
+              <w:top w:w="80" w:type="dxa"/>
+              <w:left w:w="120" w:type="dxa"/>
+              <w:bottom w:w="80" w:type="dxa"/>
+              <w:right w:w="120" w:type="dxa"/>
+            </w:tcMar>
+            <w:vAlign w:val="center"/>
+          </w:tcPr>
+          <w:p>
+            <w:r>
+              <w:rPr>
+                <w:b/>
+                <w:bCs/>
+                <w:color w:val="FFFFFF"/>
+                <w:sz w:val="17"/>
+                <w:szCs w:val="17"/>
+              </w:rPr>
+              <w:t>Öneri / Talep</w:t>
+            </w:r>
+          </w:p>
+        </w:tc>
+        <w:tc>
+          <w:tcPr>
+            <w:tcW w:w="7626" w:type="dxa"/>
+            <w:tcBorders>
+              <w:top w:val="single" w:sz="1" w:space="0" w:color="2E75B6"/>
+              <w:left w:val="single" w:sz="1" w:space="0" w:color="2E75B6"/>
+              <w:bottom w:val="single" w:sz="1" w:space="0" w:color="2E75B6"/>
+              <w:right w:val="single" w:sz="1" w:space="0" w:color="2E75B6"/>
+            </w:tcBorders>
+            <w:shd w:val="clear" w:color="auto" w:fill="FCE4D6"/>
+            <w:tcMar>
+              <w:top w:w="80" w:type="dxa"/>
+              <w:left w:w="160" w:type="dxa"/>
+              <w:bottom w:w="80" w:type="dxa"/>
+              <w:right w:w="120" w:type="dxa"/>
+            </w:tcMar>
+          </w:tcPr>
+          <w:p>
+            <w:r>
+              <w:rPr>
+                <w:i/>
+                <w:iCs/>
+                <w:sz w:val="18"/>
+                <w:szCs w:val="18"/>
+              </w:rPr>
+              <w:t>BTK'dan Talep: 70.0-70.5 MHz bandının BTK MFP'ye ikincil amatör tahsis olarak eklenmesi ve TAD'in güncellenmesi. ECA (ERC Report 25) dipnotu EU9 ve IARU R1 bant koordinasyonu referans alınabilir.</w:t>
+            </w:r>
+          </w:p>
+        </w:tc>
+      </w:tr>
+    </w:tbl>
+    <w:p>
       <w:r>
         <w:rPr>
           <w:b/>
-          <w:color w:val="2E75B6"/>
-          <w:sz w:val="18"/>
         </w:rPr>
-        <w:t xml:space="preserve">TR Mevzuatı: </w:t>
-      </w:r>
-      <w:r>
-        <w:rPr>
-          <w:sz w:val="18"/>
-        </w:rPr>
-        <w:t>BTK MFP: 70-70.5 MHz amatör tahsis yok. TAD 2021: 50-52 MHz var, 70 MHz yok.</w:t>
-      </w:r>
-    </w:p>
-    <w:p>
-      <w:pPr>
-        <w:spacing w:before="60" w:after="100"/>
-      </w:pPr>
-      <w:r>
-        <w:rPr>
-          <w:b/>
-          <w:color w:val="2E75B6"/>
-          <w:sz w:val="18"/>
-        </w:rPr>
-        <w:t>IARU / CEPT: ECA Tablosu (ERC Report 25) dipnotu EU9: CEPT idareleri 69,9-70,5 MHz bandını amatör servise ikincil olarak açabilir (bazı üyeler uyguladı). IARU R1: 70.000-70.500 MHz koordinasyonu aktif. Kaynak: iaru-r1.org/on-the-air/70mhz/</w:t>
-      </w:r>
-    </w:p>
-    <w:p>
-      <w:pPr>
-        <w:spacing w:before="60" w:after="100"/>
-      </w:pPr>
-      <w:r>
-        <w:rPr>
-          <w:b/>
-          <w:color w:val="2E75B6"/>
-          <w:sz w:val="18"/>
-        </w:rPr>
-        <w:t>Diğer Ülkeler: GB: 70.0-70.5 MHz Full/Intermediate lisansla serbest. IE, NL, SK, DK: ikincil tahsis aktif. GR (TR komşu): henüz yok. DE, FR: tahsis yok — CEPT üyelerinin tamamında değil, ülke bazlı esneklik var.</w:t>
-      </w:r>
-    </w:p>
-    <w:p>
-      <w:pPr>
-        <w:spacing w:before="60" w:after="100"/>
-      </w:pPr>
-      <w:r>
-        <w:rPr>
-          <w:b/>
-          <w:color w:val="2E75B6"/>
-          <w:sz w:val="18"/>
-        </w:rPr>
-        <w:t>Öneri / Talep: BTK'dan Talep: 70.0-70.5 MHz bandının BTK MFP'ye ikincil amatör tahsis olarak eklenmesi ve TAD'in güncellenmesi. ECA (ERC Report 25) dipnotu EU9 ve IARU R1 bant koordinasyonu referans alınabilir.</w:t>
-      </w:r>
-    </w:p>
-    <w:p>
-      <w:pPr>
-        <w:spacing w:before="80" w:after="80"/>
-      </w:pPr>
+        <w:t xml:space="preserve">Kaynak: </w:t>
+      </w:r>
+      <w:r>
+        <w:t xml:space="preserve">iaru-r1.org/on-the-air/70mhz/</w:t>
+      </w:r>
     </w:p>
     <w:p>
       <w:pPr>
@@ -8123,62 +8720,357 @@
         <w:t>Sorun: BTK MFP bazı mikrodalga frekanslarını ikincil amatör tahsisli olarak içerir (2400-2450 MHz, 3400-3410 MHz, 5830-5850 MHz, 10.0-10.5 GHz, 24.0-24.05 GHz vb.). Ancak BTK TAD 2021'de bu bantlar için emisyon tipi, maksimum güç ve anten kazanci gibi teknik şartlar tanımlanmamıştır. TAD eksikliği FTM muafiyet zincirinin bu bantları kapsayıp kapsamadığını belirsizleştirir.</w:t>
       </w:r>
     </w:p>
-    <w:p>
-      <w:pPr>
-        <w:spacing w:before="60" w:after="100"/>
-      </w:pPr>
+    <w:tbl>
+      <w:tblPr>
+        <w:tblW w:w="9026" w:type="dxa"/>
+        <w:tblInd w:w="110" w:type="dxa"/>
+        <w:tblBorders>
+          <w:top w:val="single" w:sz="4" w:space="0" w:color="auto"/>
+          <w:left w:val="single" w:sz="4" w:space="0" w:color="auto"/>
+          <w:bottom w:val="single" w:sz="4" w:space="0" w:color="auto"/>
+          <w:right w:val="single" w:sz="4" w:space="0" w:color="auto"/>
+          <w:insideH w:val="single" w:sz="4" w:space="0" w:color="auto"/>
+          <w:insideV w:val="single" w:sz="4" w:space="0" w:color="auto"/>
+        </w:tblBorders>
+        <w:tblCellMar>
+          <w:left w:w="10" w:type="dxa"/>
+          <w:right w:w="10" w:type="dxa"/>
+        </w:tblCellMar>
+        <w:tblLook w:val="0000"/>
+      </w:tblPr>
+      <w:tblGrid>
+        <w:gridCol w:w="1400"/>
+        <w:gridCol w:w="7626"/>
+      </w:tblGrid>
+      <w:tr>
+        <w:tc>
+          <w:tcPr>
+            <w:tcW w:w="1400" w:type="dxa"/>
+            <w:tcBorders>
+              <w:top w:val="single" w:sz="1" w:space="0" w:color="2E75B6"/>
+              <w:left w:val="single" w:sz="1" w:space="0" w:color="2E75B6"/>
+              <w:bottom w:val="single" w:sz="1" w:space="0" w:color="2E75B6"/>
+              <w:right w:val="single" w:sz="1" w:space="0" w:color="2E75B6"/>
+            </w:tcBorders>
+            <w:shd w:val="clear" w:color="auto" w:fill="2E75B6"/>
+            <w:tcMar>
+              <w:top w:w="80" w:type="dxa"/>
+              <w:left w:w="120" w:type="dxa"/>
+              <w:bottom w:w="80" w:type="dxa"/>
+              <w:right w:w="120" w:type="dxa"/>
+            </w:tcMar>
+            <w:vAlign w:val="center"/>
+          </w:tcPr>
+          <w:p>
+            <w:r>
+              <w:rPr>
+                <w:b/>
+                <w:bCs/>
+                <w:color w:val="FFFFFF"/>
+                <w:sz w:val="17"/>
+                <w:szCs w:val="17"/>
+              </w:rPr>
+              <w:t>TR Mevzuatı</w:t>
+            </w:r>
+          </w:p>
+        </w:tc>
+        <w:tc>
+          <w:tcPr>
+            <w:tcW w:w="7626" w:type="dxa"/>
+            <w:tcBorders>
+              <w:top w:val="single" w:sz="1" w:space="0" w:color="2E75B6"/>
+              <w:left w:val="single" w:sz="1" w:space="0" w:color="2E75B6"/>
+              <w:bottom w:val="single" w:sz="1" w:space="0" w:color="2E75B6"/>
+              <w:right w:val="single" w:sz="1" w:space="0" w:color="2E75B6"/>
+            </w:tcBorders>
+            <w:shd w:val="clear" w:color="auto" w:fill="D6E4F0"/>
+            <w:tcMar>
+              <w:top w:w="80" w:type="dxa"/>
+              <w:left w:w="160" w:type="dxa"/>
+              <w:bottom w:w="80" w:type="dxa"/>
+              <w:right w:w="120" w:type="dxa"/>
+            </w:tcMar>
+          </w:tcPr>
+          <w:p>
+            <w:r>
+              <w:rPr>
+                <w:i/>
+                <w:iCs/>
+                <w:sz w:val="18"/>
+                <w:szCs w:val="18"/>
+              </w:rPr>
+              <w:t>BTK TAD 2021 TAD08-01-06: 1240-1300 MHz ve daha yüksek bantlar için sınırlı kapsam; 2.4 GHz ve üzeri için teknik şart belgesi yok. FTM Yönetmeliği Tablo 25: mikrodalga cihaz kriterleri eksik.</w:t>
+            </w:r>
+          </w:p>
+        </w:tc>
+      </w:tr>
+    </w:tbl>
+    <w:tbl>
+      <w:tblPr>
+        <w:tblW w:w="9026" w:type="dxa"/>
+        <w:tblInd w:w="110" w:type="dxa"/>
+        <w:tblBorders>
+          <w:top w:val="single" w:sz="4" w:space="0" w:color="auto"/>
+          <w:left w:val="single" w:sz="4" w:space="0" w:color="auto"/>
+          <w:bottom w:val="single" w:sz="4" w:space="0" w:color="auto"/>
+          <w:right w:val="single" w:sz="4" w:space="0" w:color="auto"/>
+          <w:insideH w:val="single" w:sz="4" w:space="0" w:color="auto"/>
+          <w:insideV w:val="single" w:sz="4" w:space="0" w:color="auto"/>
+        </w:tblBorders>
+        <w:tblCellMar>
+          <w:left w:w="10" w:type="dxa"/>
+          <w:right w:w="10" w:type="dxa"/>
+        </w:tblCellMar>
+        <w:tblLook w:val="0000"/>
+      </w:tblPr>
+      <w:tblGrid>
+        <w:gridCol w:w="1400"/>
+        <w:gridCol w:w="7626"/>
+      </w:tblGrid>
+      <w:tr>
+        <w:tc>
+          <w:tcPr>
+            <w:tcW w:w="1400" w:type="dxa"/>
+            <w:tcBorders>
+              <w:top w:val="single" w:sz="1" w:space="0" w:color="2E75B6"/>
+              <w:left w:val="single" w:sz="1" w:space="0" w:color="2E75B6"/>
+              <w:bottom w:val="single" w:sz="1" w:space="0" w:color="2E75B6"/>
+              <w:right w:val="single" w:sz="1" w:space="0" w:color="2E75B6"/>
+            </w:tcBorders>
+            <w:shd w:val="clear" w:color="auto" w:fill="2E75B6"/>
+            <w:tcMar>
+              <w:top w:w="80" w:type="dxa"/>
+              <w:left w:w="120" w:type="dxa"/>
+              <w:bottom w:w="80" w:type="dxa"/>
+              <w:right w:w="120" w:type="dxa"/>
+            </w:tcMar>
+            <w:vAlign w:val="center"/>
+          </w:tcPr>
+          <w:p>
+            <w:r>
+              <w:rPr>
+                <w:b/>
+                <w:bCs/>
+                <w:color w:val="FFFFFF"/>
+                <w:sz w:val="17"/>
+                <w:szCs w:val="17"/>
+              </w:rPr>
+              <w:t>IARU / CEPT</w:t>
+            </w:r>
+          </w:p>
+        </w:tc>
+        <w:tc>
+          <w:tcPr>
+            <w:tcW w:w="7626" w:type="dxa"/>
+            <w:tcBorders>
+              <w:top w:val="single" w:sz="1" w:space="0" w:color="2E75B6"/>
+              <w:left w:val="single" w:sz="1" w:space="0" w:color="2E75B6"/>
+              <w:bottom w:val="single" w:sz="1" w:space="0" w:color="2E75B6"/>
+              <w:right w:val="single" w:sz="1" w:space="0" w:color="2E75B6"/>
+            </w:tcBorders>
+            <w:shd w:val="clear" w:color="auto" w:fill="E2EFDA"/>
+            <w:tcMar>
+              <w:top w:w="80" w:type="dxa"/>
+              <w:left w:w="160" w:type="dxa"/>
+              <w:bottom w:w="80" w:type="dxa"/>
+              <w:right w:w="120" w:type="dxa"/>
+            </w:tcMar>
+          </w:tcPr>
+          <w:p>
+            <w:r>
+              <w:rPr>
+                <w:i/>
+                <w:iCs/>
+                <w:sz w:val="18"/>
+                <w:szCs w:val="18"/>
+              </w:rPr>
+              <w:t>IARU R1 VHF/UHF/SHF Bandplan: 2320-2450 MHz, 3400-3410 MHz, 5.7 GHz, 10 GHz ve üzeri bantlar için segment ve emisyon önerileri. WRC-19/23: ilgili mikrodalga amatör statüleri korunmuştur.</w:t>
+            </w:r>
+          </w:p>
+        </w:tc>
+      </w:tr>
+    </w:tbl>
+    <w:tbl>
+      <w:tblPr>
+        <w:tblW w:w="9026" w:type="dxa"/>
+        <w:tblInd w:w="110" w:type="dxa"/>
+        <w:tblBorders>
+          <w:top w:val="single" w:sz="4" w:space="0" w:color="auto"/>
+          <w:left w:val="single" w:sz="4" w:space="0" w:color="auto"/>
+          <w:bottom w:val="single" w:sz="4" w:space="0" w:color="auto"/>
+          <w:right w:val="single" w:sz="4" w:space="0" w:color="auto"/>
+          <w:insideH w:val="single" w:sz="4" w:space="0" w:color="auto"/>
+          <w:insideV w:val="single" w:sz="4" w:space="0" w:color="auto"/>
+        </w:tblBorders>
+        <w:tblCellMar>
+          <w:left w:w="10" w:type="dxa"/>
+          <w:right w:w="10" w:type="dxa"/>
+        </w:tblCellMar>
+        <w:tblLook w:val="0000"/>
+      </w:tblPr>
+      <w:tblGrid>
+        <w:gridCol w:w="1400"/>
+        <w:gridCol w:w="7626"/>
+      </w:tblGrid>
+      <w:tr>
+        <w:tc>
+          <w:tcPr>
+            <w:tcW w:w="1400" w:type="dxa"/>
+            <w:tcBorders>
+              <w:top w:val="single" w:sz="1" w:space="0" w:color="2E75B6"/>
+              <w:left w:val="single" w:sz="1" w:space="0" w:color="2E75B6"/>
+              <w:bottom w:val="single" w:sz="1" w:space="0" w:color="2E75B6"/>
+              <w:right w:val="single" w:sz="1" w:space="0" w:color="2E75B6"/>
+            </w:tcBorders>
+            <w:shd w:val="clear" w:color="auto" w:fill="2E75B6"/>
+            <w:tcMar>
+              <w:top w:w="80" w:type="dxa"/>
+              <w:left w:w="120" w:type="dxa"/>
+              <w:bottom w:w="80" w:type="dxa"/>
+              <w:right w:w="120" w:type="dxa"/>
+            </w:tcMar>
+            <w:vAlign w:val="center"/>
+          </w:tcPr>
+          <w:p>
+            <w:r>
+              <w:rPr>
+                <w:b/>
+                <w:bCs/>
+                <w:color w:val="FFFFFF"/>
+                <w:sz w:val="17"/>
+                <w:szCs w:val="17"/>
+              </w:rPr>
+              <w:t>Diğer Ülkeler</w:t>
+            </w:r>
+          </w:p>
+        </w:tc>
+        <w:tc>
+          <w:tcPr>
+            <w:tcW w:w="7626" w:type="dxa"/>
+            <w:tcBorders>
+              <w:top w:val="single" w:sz="1" w:space="0" w:color="2E75B6"/>
+              <w:left w:val="single" w:sz="1" w:space="0" w:color="2E75B6"/>
+              <w:bottom w:val="single" w:sz="1" w:space="0" w:color="2E75B6"/>
+              <w:right w:val="single" w:sz="1" w:space="0" w:color="2E75B6"/>
+            </w:tcBorders>
+            <w:shd w:val="clear" w:color="auto" w:fill="FFFFFF"/>
+            <w:tcMar>
+              <w:top w:w="80" w:type="dxa"/>
+              <w:left w:w="160" w:type="dxa"/>
+              <w:bottom w:w="80" w:type="dxa"/>
+              <w:right w:w="120" w:type="dxa"/>
+            </w:tcMar>
+          </w:tcPr>
+          <w:p>
+            <w:r>
+              <w:rPr>
+                <w:i/>
+                <w:iCs/>
+                <w:sz w:val="18"/>
+                <w:szCs w:val="18"/>
+              </w:rPr>
+              <w:t>DE/GB/US: 2.4 GHz, 3.4 GHz, 10 GHz, 24 GHz amatör lisans kapsamında; ulusal TAD muadili belgelerde teknik şartlar tanımlı. 2.4 GHz en yaygın kullanılan amatör mikrodalga bandıdır (ATV, spread spectrum).</w:t>
+            </w:r>
+          </w:p>
+        </w:tc>
+      </w:tr>
+    </w:tbl>
+    <w:tbl>
+      <w:tblPr>
+        <w:tblW w:w="9026" w:type="dxa"/>
+        <w:tblInd w:w="110" w:type="dxa"/>
+        <w:tblBorders>
+          <w:top w:val="single" w:sz="4" w:space="0" w:color="auto"/>
+          <w:left w:val="single" w:sz="4" w:space="0" w:color="auto"/>
+          <w:bottom w:val="single" w:sz="4" w:space="0" w:color="auto"/>
+          <w:right w:val="single" w:sz="4" w:space="0" w:color="auto"/>
+          <w:insideH w:val="single" w:sz="4" w:space="0" w:color="auto"/>
+          <w:insideV w:val="single" w:sz="4" w:space="0" w:color="auto"/>
+        </w:tblBorders>
+        <w:tblCellMar>
+          <w:left w:w="10" w:type="dxa"/>
+          <w:right w:w="10" w:type="dxa"/>
+        </w:tblCellMar>
+        <w:tblLook w:val="0000"/>
+      </w:tblPr>
+      <w:tblGrid>
+        <w:gridCol w:w="1400"/>
+        <w:gridCol w:w="7626"/>
+      </w:tblGrid>
+      <w:tr>
+        <w:tc>
+          <w:tcPr>
+            <w:tcW w:w="1400" w:type="dxa"/>
+            <w:tcBorders>
+              <w:top w:val="single" w:sz="1" w:space="0" w:color="2E75B6"/>
+              <w:left w:val="single" w:sz="1" w:space="0" w:color="2E75B6"/>
+              <w:bottom w:val="single" w:sz="1" w:space="0" w:color="2E75B6"/>
+              <w:right w:val="single" w:sz="1" w:space="0" w:color="2E75B6"/>
+            </w:tcBorders>
+            <w:shd w:val="clear" w:color="auto" w:fill="2E75B6"/>
+            <w:tcMar>
+              <w:top w:w="80" w:type="dxa"/>
+              <w:left w:w="120" w:type="dxa"/>
+              <w:bottom w:w="80" w:type="dxa"/>
+              <w:right w:w="120" w:type="dxa"/>
+            </w:tcMar>
+            <w:vAlign w:val="center"/>
+          </w:tcPr>
+          <w:p>
+            <w:r>
+              <w:rPr>
+                <w:b/>
+                <w:bCs/>
+                <w:color w:val="FFFFFF"/>
+                <w:sz w:val="17"/>
+                <w:szCs w:val="17"/>
+              </w:rPr>
+              <w:t>Öneri / Talep</w:t>
+            </w:r>
+          </w:p>
+        </w:tc>
+        <w:tc>
+          <w:tcPr>
+            <w:tcW w:w="7626" w:type="dxa"/>
+            <w:tcBorders>
+              <w:top w:val="single" w:sz="1" w:space="0" w:color="2E75B6"/>
+              <w:left w:val="single" w:sz="1" w:space="0" w:color="2E75B6"/>
+              <w:bottom w:val="single" w:sz="1" w:space="0" w:color="2E75B6"/>
+              <w:right w:val="single" w:sz="1" w:space="0" w:color="2E75B6"/>
+            </w:tcBorders>
+            <w:shd w:val="clear" w:color="auto" w:fill="FCE4D6"/>
+            <w:tcMar>
+              <w:top w:w="80" w:type="dxa"/>
+              <w:left w:w="160" w:type="dxa"/>
+              <w:bottom w:w="80" w:type="dxa"/>
+              <w:right w:w="120" w:type="dxa"/>
+            </w:tcMar>
+          </w:tcPr>
+          <w:p>
+            <w:r>
+              <w:rPr>
+                <w:i/>
+                <w:iCs/>
+                <w:sz w:val="18"/>
+                <w:szCs w:val="18"/>
+              </w:rPr>
+              <w:t>BTK'dan Talep: MFP'de ikincil amatör tahsisli mikrodalga bantları için TAD 2021'e ek teknik şart belgesi hazırlanması; FTM Tablo 25'in güncellenmesi. 2.4 GHz için Wi-Fi paydaşlarıyla koordinasyon çerçevesi ayrıca belirlenmeli.</w:t>
+              <w:br/>
+              <w:t>── GA-ARAC: Araçta Amatör Telsiz Kullanımı ──</w:t>
+            </w:r>
+          </w:p>
+        </w:tc>
+      </w:tr>
+    </w:tbl>
+    <w:p>
       <w:r>
         <w:rPr>
           <w:b/>
-          <w:color w:val="2E75B6"/>
-          <w:sz w:val="18"/>
         </w:rPr>
-        <w:t>TR Mevzuatı: BTK TAD 2021 TAD08-01-06: 1240-1300 MHz ve daha yüksek bantlar için sınırlı kapsam; 2.4 GHz ve üzeri için teknik şart belgesi yok. FTM Yönetmeliği Tablo 25: mikrodalga cihaz kriterleri eksik.</w:t>
-      </w:r>
-    </w:p>
-    <w:p>
-      <w:pPr>
-        <w:spacing w:before="60" w:after="100"/>
-      </w:pPr>
-      <w:r>
-        <w:rPr>
-          <w:b/>
-          <w:color w:val="2E75B6"/>
-          <w:sz w:val="18"/>
-        </w:rPr>
-        <w:lastRenderedPageBreak/>
-        <w:t>IARU / CEPT: IARU R1 VHF/UHF/SHF Bandplan: 2320-2450 MHz, 3400-3410 MHz, 5.7 GHz, 10 GHz ve üzeri bantlar için segment ve emisyon önerileri. WRC-19/23: ilgili mikrodalga amatör statüleri korunmuştur. Kaynak: iaru-r1.org (VHF/UHF/SHF Bandplan bölümü)</w:t>
-      </w:r>
-    </w:p>
-    <w:p>
-      <w:pPr>
-        <w:spacing w:before="60" w:after="100"/>
-      </w:pPr>
-      <w:r>
-        <w:rPr>
-          <w:b/>
-          <w:color w:val="2E75B6"/>
-          <w:sz w:val="18"/>
-        </w:rPr>
-        <w:t>Diğer Ülkeler: DE/GB/US: 2.4 GHz, 3.4 GHz, 10 GHz, 24 GHz amatör lisans kapsamında; ulusal TAD muadili belgelerde teknik şartlar tanımlı. 2.4 GHz en yaygın kullanılan amatör mikrodalga bandıdır (ATV, spread spectrum).</w:t>
-      </w:r>
-    </w:p>
-    <w:p>
-      <w:pPr>
-        <w:spacing w:before="60" w:after="100"/>
-      </w:pPr>
-      <w:r>
-        <w:rPr>
-          <w:b/>
-          <w:color w:val="2E75B6"/>
-          <w:sz w:val="18"/>
-        </w:rPr>
-        <w:t>Öneri / Talep: BTK'dan Talep: MFP'de ikincil amatör tahsisli mikrodalga bantları için TAD 2021'e ek teknik şart belgesi hazırlanması; FTM Tablo 25'in güncellenmesi. 2.4 GHz için Wi-Fi paydaşlarıyla koordinasyon çerçevesi ayrıca belirlenmeli.</w:t>
-      </w:r>
-    </w:p>
-    <w:p>
-      <w:r>
-        <w:t>── GA-ARAC: Araçta Amatör Telsiz Kullanımı ──</w:t>
+        <w:t xml:space="preserve">Kaynak: </w:t>
+      </w:r>
+      <w:r>
+        <w:t xml:space="preserve">iaru-r1.org (VHF/UHF/SHF Bandplan bölümü)</w:t>
       </w:r>
     </w:p>
     <w:p>
@@ -8194,32 +9086,348 @@
         <w:t>Sorun: Amatör telsizciler sabit montaj (kırbaç anten) veya el telsizi ile araçlarında amatör telsiz kullanmak istemektedir. Üç ayrı hukuki mesele mevcuttur: (a) Araca anten montajı (kablo delinmesi, montaj, ruhsata işlenme) KTK Md.29 kapsamında araç değişikliği olarak değerlendirilip değerlendirilmeyecegi; (b) Araç kullanırken el telsizi tutmanın trafik mevzuatı açısından durumu; (c) Kurumsal/şirket araçları için is veren izninin gerekip gerektirmediği.</w:t>
       </w:r>
     </w:p>
-    <w:p>
-      <w:r>
-        <w:t>TR Mevzuatı: BTK FTM Teknik Ölçütler Tablo 25: 'Amatör telsiz istasyonu' tanımı açıkça 'sabit, araç ve el telsiz cihazları' ni kapsar; araça montajlı amatör telsiz FTM muafiyeti kapsamındadır, ayrıca kürülüm izni gerekmez. 2918 Sayılı KTK Md.29: Araçta fabrika dışında değişiklik yapılması muayene ve kayda bağlı olabilir; kırbaç anten montajı saç delme/kablo geçirme içeriyorsa bu kapsamda değerlendirilme riski vardır (bununla birlikte muayene uygulamasında rutin olarak takip edilen bir husus değildir). 2918 KTK Md.73/c (ve ilgili içerik): Araç kullanırken el telefonu tutmak yasak; el telsizi aynı kural kapsamında değerlendirilirse (ses iletişimi yapılan el cihazı) sürüş sırasında tutulması idari para cezasina yol açabilir — eller serbest kit (Bluetooth/hoparlör PTT) veya sabit montaj bu riski giderir. Kurumsal araçlar: İş veren yönetmeliğine, iş yerinin iç düzenlemesine ve araç şoför sözleşmesine bağlı.</w:t>
-      </w:r>
-    </w:p>
-    <w:p>
-      <w:r>
-        <w:t>IARU / CEPT: IARU R1 operasyonel rehberinde mobil/araç istasyonu kurulumuna ilişkin tavsiyeler mevcuttur. CEPT T/R 61-01: Ziyaretçi amatör lisansı (azami 3 ay geçici kullanım); T/R 61-02: HAREC (uzun süreli ikamet için sınav eşdeğerliği); araç tescili ile lisans taşıyan arasında eşleşmesi gereken bir düzenleme yoktur. Pratik uluslararası standart: araç anteni için mag-mount veya NMO flanşı yaygındir; kalıcı montaj tercih edilir.</w:t>
-      </w:r>
-    </w:p>
-    <w:p>
-      <w:r>
-        <w:t>Diğer Ülkeler: DE (AFuV): Sabit araç telsizi montajı için araç muayenesinde sınıflandırılmış değişiklik sayılmaz; araç ruhsatina işlenme zorunlu değil. GB (Ofcom): 'Mobile amateur station' lisans şartnamesi kapsamında; sürüş sırasında hands-free yasal zorunluluk. US (FCC Part 97): Mobil istasyon tanımlı, anten montajı araç muayenesine tabi değil. Genel kural: trafik kuralları hands-free yükümlülükleri her ülkede amatörleri de kapsar.</w:t>
-      </w:r>
-    </w:p>
-    <w:p>
-      <w:r>
-        <w:t>Öneri / Pratik Çözüm: (1) Anten montajı için mag-mount veya NMO flanşı tercih edilmeli; saç delme zorunlu ise yetkili araçciya yaptırmak ve araç bakım kaydına işletmek iyi uygulama. (2) Sürüş sırasında el telsizini elle tutmaktan kaçının; PTT pedal veya Bluetooth PTT kullanın. (3) BTK'dan Talep: Mobil amatör istasyon tanımı ve anten montajı konusunda net bir duyuru/kılavuz yayımlanması. Referans: 2918 KTK Md.29, Md.73/c; BTK FTM Teknik Ölçütler Tablo 25 (araçları içerir).</w:t>
-      </w:r>
-    </w:p>
-    <w:p/>
-    <w:p>
-      <w:r>
-        <w:t>── GA-POTA: Park ve Koru Aktivasyonunda Arazi Kullanım İzinleri ──</w:t>
-      </w:r>
-    </w:p>
+    <w:tbl>
+      <w:tblPr>
+        <w:tblW w:w="9026" w:type="dxa"/>
+        <w:tblInd w:w="110" w:type="dxa"/>
+        <w:tblBorders>
+          <w:top w:val="single" w:sz="4" w:space="0" w:color="auto"/>
+          <w:left w:val="single" w:sz="4" w:space="0" w:color="auto"/>
+          <w:bottom w:val="single" w:sz="4" w:space="0" w:color="auto"/>
+          <w:right w:val="single" w:sz="4" w:space="0" w:color="auto"/>
+          <w:insideH w:val="single" w:sz="4" w:space="0" w:color="auto"/>
+          <w:insideV w:val="single" w:sz="4" w:space="0" w:color="auto"/>
+        </w:tblBorders>
+        <w:tblCellMar>
+          <w:left w:w="10" w:type="dxa"/>
+          <w:right w:w="10" w:type="dxa"/>
+        </w:tblCellMar>
+        <w:tblLook w:val="0000"/>
+      </w:tblPr>
+      <w:tblGrid>
+        <w:gridCol w:w="1400"/>
+        <w:gridCol w:w="7626"/>
+      </w:tblGrid>
+      <w:tr>
+        <w:tc>
+          <w:tcPr>
+            <w:tcW w:w="1400" w:type="dxa"/>
+            <w:tcBorders>
+              <w:top w:val="single" w:sz="1" w:space="0" w:color="2E75B6"/>
+              <w:left w:val="single" w:sz="1" w:space="0" w:color="2E75B6"/>
+              <w:bottom w:val="single" w:sz="1" w:space="0" w:color="2E75B6"/>
+              <w:right w:val="single" w:sz="1" w:space="0" w:color="2E75B6"/>
+            </w:tcBorders>
+            <w:shd w:val="clear" w:color="auto" w:fill="2E75B6"/>
+            <w:tcMar>
+              <w:top w:w="80" w:type="dxa"/>
+              <w:left w:w="120" w:type="dxa"/>
+              <w:bottom w:w="80" w:type="dxa"/>
+              <w:right w:w="120" w:type="dxa"/>
+            </w:tcMar>
+            <w:vAlign w:val="center"/>
+          </w:tcPr>
+          <w:p>
+            <w:r>
+              <w:rPr>
+                <w:b/>
+                <w:bCs/>
+                <w:color w:val="FFFFFF"/>
+                <w:sz w:val="17"/>
+                <w:szCs w:val="17"/>
+              </w:rPr>
+              <w:t>TR Mevzuatı</w:t>
+            </w:r>
+          </w:p>
+        </w:tc>
+        <w:tc>
+          <w:tcPr>
+            <w:tcW w:w="7626" w:type="dxa"/>
+            <w:tcBorders>
+              <w:top w:val="single" w:sz="1" w:space="0" w:color="2E75B6"/>
+              <w:left w:val="single" w:sz="1" w:space="0" w:color="2E75B6"/>
+              <w:bottom w:val="single" w:sz="1" w:space="0" w:color="2E75B6"/>
+              <w:right w:val="single" w:sz="1" w:space="0" w:color="2E75B6"/>
+            </w:tcBorders>
+            <w:shd w:val="clear" w:color="auto" w:fill="D6E4F0"/>
+            <w:tcMar>
+              <w:top w:w="80" w:type="dxa"/>
+              <w:left w:w="160" w:type="dxa"/>
+              <w:bottom w:w="80" w:type="dxa"/>
+              <w:right w:w="120" w:type="dxa"/>
+            </w:tcMar>
+          </w:tcPr>
+          <w:p>
+            <w:r>
+              <w:rPr>
+                <w:i/>
+                <w:iCs/>
+                <w:sz w:val="18"/>
+                <w:szCs w:val="18"/>
+              </w:rPr>
+              <w:t>BTK FTM Teknik Ölçütler Tablo 25: 'Amatör telsiz istasyonu' tanımı açıkça 'sabit, araç ve el telsiz cihazları' ni kapsar; araça montajlı amatör telsiz FTM muafiyeti kapsamındadır, ayrıca kürülüm izni gerekmez. 2918 Sayılı KTK Md.29: Araçta fabrika dışında değişiklik yapılması muayene ve kayda bağlı olabilir; kırbaç anten montajı saç delme/kablo geçirme içeriyorsa bu kapsamda değerlendirilme riski vardır (bununla birlikte muayene uygulamasında rutin olarak takip edilen bir husus değildir). 2918 KTK Md.73/c (ve ilgili içerik): Araç kullanırken el telefonu tutmak yasak; el telsizi aynı kural kapsamında değerlendirilirse (ses iletişimi yapılan el cihazı) sürüş sırasında tutulması idari para cezasina yol açabilir — eller serbest kit (Bluetooth/hoparlör PTT) veya sabit montaj bu riski giderir. Kurumsal araçlar: İş veren yönetmeliğine, iş yerinin iç düzenlemesine ve araç şoför sözleşmesine bağlı.</w:t>
+            </w:r>
+          </w:p>
+        </w:tc>
+      </w:tr>
+    </w:tbl>
+    <w:tbl>
+      <w:tblPr>
+        <w:tblW w:w="9026" w:type="dxa"/>
+        <w:tblInd w:w="110" w:type="dxa"/>
+        <w:tblBorders>
+          <w:top w:val="single" w:sz="4" w:space="0" w:color="auto"/>
+          <w:left w:val="single" w:sz="4" w:space="0" w:color="auto"/>
+          <w:bottom w:val="single" w:sz="4" w:space="0" w:color="auto"/>
+          <w:right w:val="single" w:sz="4" w:space="0" w:color="auto"/>
+          <w:insideH w:val="single" w:sz="4" w:space="0" w:color="auto"/>
+          <w:insideV w:val="single" w:sz="4" w:space="0" w:color="auto"/>
+        </w:tblBorders>
+        <w:tblCellMar>
+          <w:left w:w="10" w:type="dxa"/>
+          <w:right w:w="10" w:type="dxa"/>
+        </w:tblCellMar>
+        <w:tblLook w:val="0000"/>
+      </w:tblPr>
+      <w:tblGrid>
+        <w:gridCol w:w="1400"/>
+        <w:gridCol w:w="7626"/>
+      </w:tblGrid>
+      <w:tr>
+        <w:tc>
+          <w:tcPr>
+            <w:tcW w:w="1400" w:type="dxa"/>
+            <w:tcBorders>
+              <w:top w:val="single" w:sz="1" w:space="0" w:color="2E75B6"/>
+              <w:left w:val="single" w:sz="1" w:space="0" w:color="2E75B6"/>
+              <w:bottom w:val="single" w:sz="1" w:space="0" w:color="2E75B6"/>
+              <w:right w:val="single" w:sz="1" w:space="0" w:color="2E75B6"/>
+            </w:tcBorders>
+            <w:shd w:val="clear" w:color="auto" w:fill="2E75B6"/>
+            <w:tcMar>
+              <w:top w:w="80" w:type="dxa"/>
+              <w:left w:w="120" w:type="dxa"/>
+              <w:bottom w:w="80" w:type="dxa"/>
+              <w:right w:w="120" w:type="dxa"/>
+            </w:tcMar>
+            <w:vAlign w:val="center"/>
+          </w:tcPr>
+          <w:p>
+            <w:r>
+              <w:rPr>
+                <w:b/>
+                <w:bCs/>
+                <w:color w:val="FFFFFF"/>
+                <w:sz w:val="17"/>
+                <w:szCs w:val="17"/>
+              </w:rPr>
+              <w:t>IARU / CEPT</w:t>
+            </w:r>
+          </w:p>
+        </w:tc>
+        <w:tc>
+          <w:tcPr>
+            <w:tcW w:w="7626" w:type="dxa"/>
+            <w:tcBorders>
+              <w:top w:val="single" w:sz="1" w:space="0" w:color="2E75B6"/>
+              <w:left w:val="single" w:sz="1" w:space="0" w:color="2E75B6"/>
+              <w:bottom w:val="single" w:sz="1" w:space="0" w:color="2E75B6"/>
+              <w:right w:val="single" w:sz="1" w:space="0" w:color="2E75B6"/>
+            </w:tcBorders>
+            <w:shd w:val="clear" w:color="auto" w:fill="E2EFDA"/>
+            <w:tcMar>
+              <w:top w:w="80" w:type="dxa"/>
+              <w:left w:w="160" w:type="dxa"/>
+              <w:bottom w:w="80" w:type="dxa"/>
+              <w:right w:w="120" w:type="dxa"/>
+            </w:tcMar>
+          </w:tcPr>
+          <w:p>
+            <w:r>
+              <w:rPr>
+                <w:i/>
+                <w:iCs/>
+                <w:sz w:val="18"/>
+                <w:szCs w:val="18"/>
+              </w:rPr>
+              <w:t>IARU R1 operasyonel rehberinde mobil/araç istasyonu kurulumuna ilişkin tavsiyeler mevcuttur. CEPT T/R 61-01: Ziyaretçi amatör lisansı (azami 3 ay geçici kullanım); T/R 61-02: HAREC (uzun süreli ikamet için sınav eşdeğerliği); araç tescili ile lisans taşıyan arasında eşleşmesi gereken bir düzenleme yoktur. Pratik uluslararası standart: araç anteni için mag-mount veya NMO flanşı yaygındir; kalıcı montaj tercih edilir.</w:t>
+            </w:r>
+          </w:p>
+        </w:tc>
+      </w:tr>
+    </w:tbl>
+    <w:tbl>
+      <w:tblPr>
+        <w:tblW w:w="9026" w:type="dxa"/>
+        <w:tblInd w:w="110" w:type="dxa"/>
+        <w:tblBorders>
+          <w:top w:val="single" w:sz="4" w:space="0" w:color="auto"/>
+          <w:left w:val="single" w:sz="4" w:space="0" w:color="auto"/>
+          <w:bottom w:val="single" w:sz="4" w:space="0" w:color="auto"/>
+          <w:right w:val="single" w:sz="4" w:space="0" w:color="auto"/>
+          <w:insideH w:val="single" w:sz="4" w:space="0" w:color="auto"/>
+          <w:insideV w:val="single" w:sz="4" w:space="0" w:color="auto"/>
+        </w:tblBorders>
+        <w:tblCellMar>
+          <w:left w:w="10" w:type="dxa"/>
+          <w:right w:w="10" w:type="dxa"/>
+        </w:tblCellMar>
+        <w:tblLook w:val="0000"/>
+      </w:tblPr>
+      <w:tblGrid>
+        <w:gridCol w:w="1400"/>
+        <w:gridCol w:w="7626"/>
+      </w:tblGrid>
+      <w:tr>
+        <w:tc>
+          <w:tcPr>
+            <w:tcW w:w="1400" w:type="dxa"/>
+            <w:tcBorders>
+              <w:top w:val="single" w:sz="1" w:space="0" w:color="2E75B6"/>
+              <w:left w:val="single" w:sz="1" w:space="0" w:color="2E75B6"/>
+              <w:bottom w:val="single" w:sz="1" w:space="0" w:color="2E75B6"/>
+              <w:right w:val="single" w:sz="1" w:space="0" w:color="2E75B6"/>
+            </w:tcBorders>
+            <w:shd w:val="clear" w:color="auto" w:fill="2E75B6"/>
+            <w:tcMar>
+              <w:top w:w="80" w:type="dxa"/>
+              <w:left w:w="120" w:type="dxa"/>
+              <w:bottom w:w="80" w:type="dxa"/>
+              <w:right w:w="120" w:type="dxa"/>
+            </w:tcMar>
+            <w:vAlign w:val="center"/>
+          </w:tcPr>
+          <w:p>
+            <w:r>
+              <w:rPr>
+                <w:b/>
+                <w:bCs/>
+                <w:color w:val="FFFFFF"/>
+                <w:sz w:val="17"/>
+                <w:szCs w:val="17"/>
+              </w:rPr>
+              <w:t>Diğer Ülkeler</w:t>
+            </w:r>
+          </w:p>
+        </w:tc>
+        <w:tc>
+          <w:tcPr>
+            <w:tcW w:w="7626" w:type="dxa"/>
+            <w:tcBorders>
+              <w:top w:val="single" w:sz="1" w:space="0" w:color="2E75B6"/>
+              <w:left w:val="single" w:sz="1" w:space="0" w:color="2E75B6"/>
+              <w:bottom w:val="single" w:sz="1" w:space="0" w:color="2E75B6"/>
+              <w:right w:val="single" w:sz="1" w:space="0" w:color="2E75B6"/>
+            </w:tcBorders>
+            <w:shd w:val="clear" w:color="auto" w:fill="FFFFFF"/>
+            <w:tcMar>
+              <w:top w:w="80" w:type="dxa"/>
+              <w:left w:w="160" w:type="dxa"/>
+              <w:bottom w:w="80" w:type="dxa"/>
+              <w:right w:w="120" w:type="dxa"/>
+            </w:tcMar>
+          </w:tcPr>
+          <w:p>
+            <w:r>
+              <w:rPr>
+                <w:i/>
+                <w:iCs/>
+                <w:sz w:val="18"/>
+                <w:szCs w:val="18"/>
+              </w:rPr>
+              <w:t>DE (AFuV): Sabit araç telsizi montajı için araç muayenesinde sınıflandırılmış değişiklik sayılmaz; araç ruhsatina işlenme zorunlu değil. GB (Ofcom): 'Mobile amateur station' lisans şartnamesi kapsamında; sürüş sırasında hands-free yasal zorunluluk. US (FCC Part 97): Mobil istasyon tanımlı, anten montajı araç muayenesine tabi değil. Genel kural: trafik kuralları hands-free yükümlülükleri her ülkede amatörleri de kapsar.</w:t>
+            </w:r>
+          </w:p>
+        </w:tc>
+      </w:tr>
+    </w:tbl>
+    <w:tbl>
+      <w:tblPr>
+        <w:tblW w:w="9026" w:type="dxa"/>
+        <w:tblInd w:w="110" w:type="dxa"/>
+        <w:tblBorders>
+          <w:top w:val="single" w:sz="4" w:space="0" w:color="auto"/>
+          <w:left w:val="single" w:sz="4" w:space="0" w:color="auto"/>
+          <w:bottom w:val="single" w:sz="4" w:space="0" w:color="auto"/>
+          <w:right w:val="single" w:sz="4" w:space="0" w:color="auto"/>
+          <w:insideH w:val="single" w:sz="4" w:space="0" w:color="auto"/>
+          <w:insideV w:val="single" w:sz="4" w:space="0" w:color="auto"/>
+        </w:tblBorders>
+        <w:tblCellMar>
+          <w:left w:w="10" w:type="dxa"/>
+          <w:right w:w="10" w:type="dxa"/>
+        </w:tblCellMar>
+        <w:tblLook w:val="0000"/>
+      </w:tblPr>
+      <w:tblGrid>
+        <w:gridCol w:w="1400"/>
+        <w:gridCol w:w="7626"/>
+      </w:tblGrid>
+      <w:tr>
+        <w:tc>
+          <w:tcPr>
+            <w:tcW w:w="1400" w:type="dxa"/>
+            <w:tcBorders>
+              <w:top w:val="single" w:sz="1" w:space="0" w:color="2E75B6"/>
+              <w:left w:val="single" w:sz="1" w:space="0" w:color="2E75B6"/>
+              <w:bottom w:val="single" w:sz="1" w:space="0" w:color="2E75B6"/>
+              <w:right w:val="single" w:sz="1" w:space="0" w:color="2E75B6"/>
+            </w:tcBorders>
+            <w:shd w:val="clear" w:color="auto" w:fill="2E75B6"/>
+            <w:tcMar>
+              <w:top w:w="80" w:type="dxa"/>
+              <w:left w:w="120" w:type="dxa"/>
+              <w:bottom w:w="80" w:type="dxa"/>
+              <w:right w:w="120" w:type="dxa"/>
+            </w:tcMar>
+            <w:vAlign w:val="center"/>
+          </w:tcPr>
+          <w:p>
+            <w:r>
+              <w:rPr>
+                <w:b/>
+                <w:bCs/>
+                <w:color w:val="FFFFFF"/>
+                <w:sz w:val="17"/>
+                <w:szCs w:val="17"/>
+              </w:rPr>
+              <w:t>Öneri / Pratik Çözüm</w:t>
+            </w:r>
+          </w:p>
+        </w:tc>
+        <w:tc>
+          <w:tcPr>
+            <w:tcW w:w="7626" w:type="dxa"/>
+            <w:tcBorders>
+              <w:top w:val="single" w:sz="1" w:space="0" w:color="2E75B6"/>
+              <w:left w:val="single" w:sz="1" w:space="0" w:color="2E75B6"/>
+              <w:bottom w:val="single" w:sz="1" w:space="0" w:color="2E75B6"/>
+              <w:right w:val="single" w:sz="1" w:space="0" w:color="2E75B6"/>
+            </w:tcBorders>
+            <w:shd w:val="clear" w:color="auto" w:fill="FCE4D6"/>
+            <w:tcMar>
+              <w:top w:w="80" w:type="dxa"/>
+              <w:left w:w="160" w:type="dxa"/>
+              <w:bottom w:w="80" w:type="dxa"/>
+              <w:right w:w="120" w:type="dxa"/>
+            </w:tcMar>
+          </w:tcPr>
+          <w:p>
+            <w:r>
+              <w:rPr>
+                <w:i/>
+                <w:iCs/>
+                <w:sz w:val="18"/>
+                <w:szCs w:val="18"/>
+              </w:rPr>
+              <w:t>(1) Anten montajı için mag-mount veya NMO flanşı tercih edilmeli; saç delme zorunlu ise yetkili araçciya yaptırmak ve araç bakım kaydına işletmek iyi uygulama. (2) Sürüş sırasında el telsizini elle tutmaktan kaçının; PTT pedal veya Bluetooth PTT kullanın. (3) BTK'dan Talep: Mobil amatör istasyon tanımı ve anten montajı konusunda net bir duyuru/kılavuz yayımlanması. Referans: 2918 KTK Md.29, Md.73/c; BTK FTM Teknik Ölçütler Tablo 25 (araçları içerir).</w:t>
+              <w:br/>
+              <w:t>── GA-POTA: Park ve Koru Aktivasyonunda Arazi Kullanım İzinleri ──</w:t>
+            </w:r>
+          </w:p>
+        </w:tc>
+      </w:tr>
+    </w:tbl>
     <w:p>
       <w:pPr>
         <w:pStyle w:val="Heading20"/>
@@ -8233,36 +9441,348 @@
         <w:t>Sorun: POTA (Parks on the Air) aktivasyonları amatör telsiz programı olarak giderek yaygınlaşmaktadır. FTM muafiyeti yalnızca frekans spektrumu kullanımını kapsar; araziye erişim, konaklama ve anten kurulumu için arazi sahibi kurumun izni ayrı bir hukuki meseledir. Hangi parkta, kime, ne için başvurulacağı netlik kazanmamıştır.</w:t>
       </w:r>
     </w:p>
-    <w:p>
-      <w:r>
-        <w:t>TR Mevzuatı: 2873 Sayılı Milli Parklar Kanunu: Milli park sınırları içinde ticari veya organizasyonel faaliyet Çevre, Şehircilik ve İklim Değişikliği Bakanlığı (CSIB) veya ilgili milli park müdürlüğü izni gerektirir; bireysel piknik nitelikli kısa süreli aktivasyon pratikte izin gerektirmez; yüksek anten (&gt; 3-5 m) veya tekrar ziyaret için yazılı bildirim/izin almak sağlıklı uygulama. 6831 Sayılı Orman Kanunu: Devlet orman arazilerinde faaliyet Orman Genel Müdürlüğü (OGM) / Orman Bölge Müdürlüğü onayına tâbidir; bireysel rekreasyon (yurüyüş, piknik) serbest bırakılmış alanlarda serbest; anten dikme veya ateş yakma yasak. 5216 / 5393 Sayılı Belediye Kanunları: Belediye parkları ve yeşil alanlar belediye park ve bahçeler müdürlüğünun yetki alanındadır; kısa süreli bireysel kullanım genellikle serbest; organizasyonel etkinlik veya sabit anten için izin gerekir. 3621 Sayılı Kıyı Kanunu: Kıyı şeridinde (ilk 10 m) her türlü yapılanma yasak; anten direğinin geçici de olsa kurulumu sorunludur. Tarihi koruma alanları: Kültürel Miras ve Müzeler Genel Müdürlüğü izni şart.</w:t>
-      </w:r>
-    </w:p>
-    <w:p>
-      <w:r>
-        <w:t xml:space="preserve">IARU / CEPT: IARU ETG (Emergency Telecommunications Guide): Sahada kurulum rehberi; bireysel aktivasyon izin gereksinimlerini ulusal mevzuata bırakmıştır. POTA.app: Uluslararası park aktivasyon </w:t>
-      </w:r>
-      <w:r>
-        <w:lastRenderedPageBreak/>
-        <w:t>programı, Türkiye'deki milli parkları ve orman alanlarını sisteme dahil etmiştir. IARU R1 Bölge 1 Türkiye üyesi (dernek ve kulüpler) bu konuda resmi rehber yayımlamamistir.</w:t>
-      </w:r>
-    </w:p>
-    <w:p>
-      <w:r>
-        <w:t>Diğer Ülkeler: GB: National Trust ve Natural England arazilerinde POTA aktivasyonu için önceden bildirim veya ücretsiz izin prosedürü uygulanmaktadır. US: National Park Service (NPS) 'special use permit' gerektirmekte; ancak kısa süreli, düşük etkili amatör operasyonlar çoğu zaman muaf tutulmaktadır. DE: Bundeswaldgesetz kapsamında ormanda yürüyüş serbest, anten kurulum prosedürü eyalete göre değişir. TR komşuları (GR, BG): Milli park sınırları içinde RF emisyonu için ayrı bir kural yok; genel doğal alan kullanım kuralları geçerli.</w:t>
-      </w:r>
-    </w:p>
-    <w:p>
-      <w:r>
-        <w:t>Öneri / Pratik Çözüm: (1) Bireysel, anten yüksekliği &lt; 3 m, 1 gün süreli POTA aktivasyonu için belediye parkları ve ormanlarda genellikle ek izin gerekmiyor (piknik muamelesi); ancak park görevlisi veya muhtarlığa önceden baskılı bilgi kartını göstermek iyidir. (2) Milli park sınırları içinde milli park müdürlüğüyle email/telefon ile önceden bilgi alınması önerilir. (3) BTK ve amatör telsiz dernek ve kulüpleri'dan Talep: POTA aktivasyonu için birleşik izin kılavuzu (hangi kurum tablosu) hazırlanması; yurt içi POTA referans listesi oluşturulması. Referans: 2873 Milli Parklar Kanunu; 6831 Orman Kanunu Md.17; 5393 Belediye Kanunu Md.14/15; 3621 Kıyı Kanunu; BTK FTM Teknik Ölçütler (spektrum kullanımı FTM muaf).</w:t>
-      </w:r>
-    </w:p>
-    <w:p/>
-    <w:p>
-      <w:r>
-        <w:t>-- GA-AREDN: AREDN ve Amatör Mesh Network --</w:t>
-      </w:r>
-    </w:p>
+    <w:tbl>
+      <w:tblPr>
+        <w:tblW w:w="9026" w:type="dxa"/>
+        <w:tblInd w:w="110" w:type="dxa"/>
+        <w:tblBorders>
+          <w:top w:val="single" w:sz="4" w:space="0" w:color="auto"/>
+          <w:left w:val="single" w:sz="4" w:space="0" w:color="auto"/>
+          <w:bottom w:val="single" w:sz="4" w:space="0" w:color="auto"/>
+          <w:right w:val="single" w:sz="4" w:space="0" w:color="auto"/>
+          <w:insideH w:val="single" w:sz="4" w:space="0" w:color="auto"/>
+          <w:insideV w:val="single" w:sz="4" w:space="0" w:color="auto"/>
+        </w:tblBorders>
+        <w:tblCellMar>
+          <w:left w:w="10" w:type="dxa"/>
+          <w:right w:w="10" w:type="dxa"/>
+        </w:tblCellMar>
+        <w:tblLook w:val="0000"/>
+      </w:tblPr>
+      <w:tblGrid>
+        <w:gridCol w:w="1400"/>
+        <w:gridCol w:w="7626"/>
+      </w:tblGrid>
+      <w:tr>
+        <w:tc>
+          <w:tcPr>
+            <w:tcW w:w="1400" w:type="dxa"/>
+            <w:tcBorders>
+              <w:top w:val="single" w:sz="1" w:space="0" w:color="2E75B6"/>
+              <w:left w:val="single" w:sz="1" w:space="0" w:color="2E75B6"/>
+              <w:bottom w:val="single" w:sz="1" w:space="0" w:color="2E75B6"/>
+              <w:right w:val="single" w:sz="1" w:space="0" w:color="2E75B6"/>
+            </w:tcBorders>
+            <w:shd w:val="clear" w:color="auto" w:fill="2E75B6"/>
+            <w:tcMar>
+              <w:top w:w="80" w:type="dxa"/>
+              <w:left w:w="120" w:type="dxa"/>
+              <w:bottom w:w="80" w:type="dxa"/>
+              <w:right w:w="120" w:type="dxa"/>
+            </w:tcMar>
+            <w:vAlign w:val="center"/>
+          </w:tcPr>
+          <w:p>
+            <w:r>
+              <w:rPr>
+                <w:b/>
+                <w:bCs/>
+                <w:color w:val="FFFFFF"/>
+                <w:sz w:val="17"/>
+                <w:szCs w:val="17"/>
+              </w:rPr>
+              <w:t>TR Mevzuatı</w:t>
+            </w:r>
+          </w:p>
+        </w:tc>
+        <w:tc>
+          <w:tcPr>
+            <w:tcW w:w="7626" w:type="dxa"/>
+            <w:tcBorders>
+              <w:top w:val="single" w:sz="1" w:space="0" w:color="2E75B6"/>
+              <w:left w:val="single" w:sz="1" w:space="0" w:color="2E75B6"/>
+              <w:bottom w:val="single" w:sz="1" w:space="0" w:color="2E75B6"/>
+              <w:right w:val="single" w:sz="1" w:space="0" w:color="2E75B6"/>
+            </w:tcBorders>
+            <w:shd w:val="clear" w:color="auto" w:fill="D6E4F0"/>
+            <w:tcMar>
+              <w:top w:w="80" w:type="dxa"/>
+              <w:left w:w="160" w:type="dxa"/>
+              <w:bottom w:w="80" w:type="dxa"/>
+              <w:right w:w="120" w:type="dxa"/>
+            </w:tcMar>
+          </w:tcPr>
+          <w:p>
+            <w:r>
+              <w:rPr>
+                <w:i/>
+                <w:iCs/>
+                <w:sz w:val="18"/>
+                <w:szCs w:val="18"/>
+              </w:rPr>
+              <w:t>2873 Sayılı Milli Parklar Kanunu: Milli park sınırları içinde ticari veya organizasyonel faaliyet Çevre, Şehircilik ve İklim Değişikliği Bakanlığı (CSIB) veya ilgili milli park müdürlüğü izni gerektirir; bireysel piknik nitelikli kısa süreli aktivasyon pratikte izin gerektirmez; yüksek anten (&gt; 3-5 m) veya tekrar ziyaret için yazılı bildirim/izin almak sağlıklı uygulama. 6831 Sayılı Orman Kanunu: Devlet orman arazilerinde faaliyet Orman Genel Müdürlüğü (OGM) / Orman Bölge Müdürlüğü onayına tâbidir; bireysel rekreasyon (yurüyüş, piknik) serbest bırakılmış alanlarda serbest; anten dikme veya ateş yakma yasak. 5216 / 5393 Sayılı Belediye Kanunları: Belediye parkları ve yeşil alanlar belediye park ve bahçeler müdürlüğünun yetki alanındadır; kısa süreli bireysel kullanım genellikle serbest; organizasyonel etkinlik veya sabit anten için izin gerekir. 3621 Sayılı Kıyı Kanunu: Kıyı şeridinde (ilk 10 m) her türlü yapılanma yasak; anten direğinin geçici de olsa kurulumu sorunludur. Tarihi koruma alanları: Kültürel Miras ve Müzeler Genel Müdürlüğü izni şart.</w:t>
+            </w:r>
+          </w:p>
+        </w:tc>
+      </w:tr>
+    </w:tbl>
+    <w:tbl>
+      <w:tblPr>
+        <w:tblW w:w="9026" w:type="dxa"/>
+        <w:tblInd w:w="110" w:type="dxa"/>
+        <w:tblBorders>
+          <w:top w:val="single" w:sz="4" w:space="0" w:color="auto"/>
+          <w:left w:val="single" w:sz="4" w:space="0" w:color="auto"/>
+          <w:bottom w:val="single" w:sz="4" w:space="0" w:color="auto"/>
+          <w:right w:val="single" w:sz="4" w:space="0" w:color="auto"/>
+          <w:insideH w:val="single" w:sz="4" w:space="0" w:color="auto"/>
+          <w:insideV w:val="single" w:sz="4" w:space="0" w:color="auto"/>
+        </w:tblBorders>
+        <w:tblCellMar>
+          <w:left w:w="10" w:type="dxa"/>
+          <w:right w:w="10" w:type="dxa"/>
+        </w:tblCellMar>
+        <w:tblLook w:val="0000"/>
+      </w:tblPr>
+      <w:tblGrid>
+        <w:gridCol w:w="1400"/>
+        <w:gridCol w:w="7626"/>
+      </w:tblGrid>
+      <w:tr>
+        <w:tc>
+          <w:tcPr>
+            <w:tcW w:w="1400" w:type="dxa"/>
+            <w:tcBorders>
+              <w:top w:val="single" w:sz="1" w:space="0" w:color="2E75B6"/>
+              <w:left w:val="single" w:sz="1" w:space="0" w:color="2E75B6"/>
+              <w:bottom w:val="single" w:sz="1" w:space="0" w:color="2E75B6"/>
+              <w:right w:val="single" w:sz="1" w:space="0" w:color="2E75B6"/>
+            </w:tcBorders>
+            <w:shd w:val="clear" w:color="auto" w:fill="2E75B6"/>
+            <w:tcMar>
+              <w:top w:w="80" w:type="dxa"/>
+              <w:left w:w="120" w:type="dxa"/>
+              <w:bottom w:w="80" w:type="dxa"/>
+              <w:right w:w="120" w:type="dxa"/>
+            </w:tcMar>
+            <w:vAlign w:val="center"/>
+          </w:tcPr>
+          <w:p>
+            <w:r>
+              <w:rPr>
+                <w:b/>
+                <w:bCs/>
+                <w:color w:val="FFFFFF"/>
+                <w:sz w:val="17"/>
+                <w:szCs w:val="17"/>
+              </w:rPr>
+              <w:t>IARU / CEPT</w:t>
+            </w:r>
+          </w:p>
+        </w:tc>
+        <w:tc>
+          <w:tcPr>
+            <w:tcW w:w="7626" w:type="dxa"/>
+            <w:tcBorders>
+              <w:top w:val="single" w:sz="1" w:space="0" w:color="2E75B6"/>
+              <w:left w:val="single" w:sz="1" w:space="0" w:color="2E75B6"/>
+              <w:bottom w:val="single" w:sz="1" w:space="0" w:color="2E75B6"/>
+              <w:right w:val="single" w:sz="1" w:space="0" w:color="2E75B6"/>
+            </w:tcBorders>
+            <w:shd w:val="clear" w:color="auto" w:fill="E2EFDA"/>
+            <w:tcMar>
+              <w:top w:w="80" w:type="dxa"/>
+              <w:left w:w="160" w:type="dxa"/>
+              <w:bottom w:w="80" w:type="dxa"/>
+              <w:right w:w="120" w:type="dxa"/>
+            </w:tcMar>
+          </w:tcPr>
+          <w:p>
+            <w:r>
+              <w:rPr>
+                <w:i/>
+                <w:iCs/>
+                <w:sz w:val="18"/>
+                <w:szCs w:val="18"/>
+              </w:rPr>
+              <w:t>IARU ETG (Emergency Telecommunications Guide): Sahada kurulum rehberi; bireysel aktivasyon izin gereksinimlerini ulusal mevzuata bırakmıştır. POTA.app: Uluslararası park aktivasyon programı, Türkiye'deki milli parkları ve orman alanlarını sisteme dahil etmiştir. IARU R1 Bölge 1 Türkiye üyesi (dernek ve kulüpler) bu konuda resmi rehber yayımlamamistir.</w:t>
+            </w:r>
+          </w:p>
+        </w:tc>
+      </w:tr>
+    </w:tbl>
+    <w:tbl>
+      <w:tblPr>
+        <w:tblW w:w="9026" w:type="dxa"/>
+        <w:tblInd w:w="110" w:type="dxa"/>
+        <w:tblBorders>
+          <w:top w:val="single" w:sz="4" w:space="0" w:color="auto"/>
+          <w:left w:val="single" w:sz="4" w:space="0" w:color="auto"/>
+          <w:bottom w:val="single" w:sz="4" w:space="0" w:color="auto"/>
+          <w:right w:val="single" w:sz="4" w:space="0" w:color="auto"/>
+          <w:insideH w:val="single" w:sz="4" w:space="0" w:color="auto"/>
+          <w:insideV w:val="single" w:sz="4" w:space="0" w:color="auto"/>
+        </w:tblBorders>
+        <w:tblCellMar>
+          <w:left w:w="10" w:type="dxa"/>
+          <w:right w:w="10" w:type="dxa"/>
+        </w:tblCellMar>
+        <w:tblLook w:val="0000"/>
+      </w:tblPr>
+      <w:tblGrid>
+        <w:gridCol w:w="1400"/>
+        <w:gridCol w:w="7626"/>
+      </w:tblGrid>
+      <w:tr>
+        <w:tc>
+          <w:tcPr>
+            <w:tcW w:w="1400" w:type="dxa"/>
+            <w:tcBorders>
+              <w:top w:val="single" w:sz="1" w:space="0" w:color="2E75B6"/>
+              <w:left w:val="single" w:sz="1" w:space="0" w:color="2E75B6"/>
+              <w:bottom w:val="single" w:sz="1" w:space="0" w:color="2E75B6"/>
+              <w:right w:val="single" w:sz="1" w:space="0" w:color="2E75B6"/>
+            </w:tcBorders>
+            <w:shd w:val="clear" w:color="auto" w:fill="2E75B6"/>
+            <w:tcMar>
+              <w:top w:w="80" w:type="dxa"/>
+              <w:left w:w="120" w:type="dxa"/>
+              <w:bottom w:w="80" w:type="dxa"/>
+              <w:right w:w="120" w:type="dxa"/>
+            </w:tcMar>
+            <w:vAlign w:val="center"/>
+          </w:tcPr>
+          <w:p>
+            <w:r>
+              <w:rPr>
+                <w:b/>
+                <w:bCs/>
+                <w:color w:val="FFFFFF"/>
+                <w:sz w:val="17"/>
+                <w:szCs w:val="17"/>
+              </w:rPr>
+              <w:t>Diğer Ülkeler</w:t>
+            </w:r>
+          </w:p>
+        </w:tc>
+        <w:tc>
+          <w:tcPr>
+            <w:tcW w:w="7626" w:type="dxa"/>
+            <w:tcBorders>
+              <w:top w:val="single" w:sz="1" w:space="0" w:color="2E75B6"/>
+              <w:left w:val="single" w:sz="1" w:space="0" w:color="2E75B6"/>
+              <w:bottom w:val="single" w:sz="1" w:space="0" w:color="2E75B6"/>
+              <w:right w:val="single" w:sz="1" w:space="0" w:color="2E75B6"/>
+            </w:tcBorders>
+            <w:shd w:val="clear" w:color="auto" w:fill="FFFFFF"/>
+            <w:tcMar>
+              <w:top w:w="80" w:type="dxa"/>
+              <w:left w:w="160" w:type="dxa"/>
+              <w:bottom w:w="80" w:type="dxa"/>
+              <w:right w:w="120" w:type="dxa"/>
+            </w:tcMar>
+          </w:tcPr>
+          <w:p>
+            <w:r>
+              <w:rPr>
+                <w:i/>
+                <w:iCs/>
+                <w:sz w:val="18"/>
+                <w:szCs w:val="18"/>
+              </w:rPr>
+              <w:t>GB: National Trust ve Natural England arazilerinde POTA aktivasyonu için önceden bildirim veya ücretsiz izin prosedürü uygulanmaktadır. US: National Park Service (NPS) 'special use permit' gerektirmekte; ancak kısa süreli, düşük etkili amatör operasyonlar çoğu zaman muaf tutulmaktadır. DE: Bundeswaldgesetz kapsamında ormanda yürüyüş serbest, anten kurulum prosedürü eyalete göre değişir. TR komşuları (GR, BG): Milli park sınırları içinde RF emisyonu için ayrı bir kural yok; genel doğal alan kullanım kuralları geçerli.</w:t>
+            </w:r>
+          </w:p>
+        </w:tc>
+      </w:tr>
+    </w:tbl>
+    <w:tbl>
+      <w:tblPr>
+        <w:tblW w:w="9026" w:type="dxa"/>
+        <w:tblInd w:w="110" w:type="dxa"/>
+        <w:tblBorders>
+          <w:top w:val="single" w:sz="4" w:space="0" w:color="auto"/>
+          <w:left w:val="single" w:sz="4" w:space="0" w:color="auto"/>
+          <w:bottom w:val="single" w:sz="4" w:space="0" w:color="auto"/>
+          <w:right w:val="single" w:sz="4" w:space="0" w:color="auto"/>
+          <w:insideH w:val="single" w:sz="4" w:space="0" w:color="auto"/>
+          <w:insideV w:val="single" w:sz="4" w:space="0" w:color="auto"/>
+        </w:tblBorders>
+        <w:tblCellMar>
+          <w:left w:w="10" w:type="dxa"/>
+          <w:right w:w="10" w:type="dxa"/>
+        </w:tblCellMar>
+        <w:tblLook w:val="0000"/>
+      </w:tblPr>
+      <w:tblGrid>
+        <w:gridCol w:w="1400"/>
+        <w:gridCol w:w="7626"/>
+      </w:tblGrid>
+      <w:tr>
+        <w:tc>
+          <w:tcPr>
+            <w:tcW w:w="1400" w:type="dxa"/>
+            <w:tcBorders>
+              <w:top w:val="single" w:sz="1" w:space="0" w:color="2E75B6"/>
+              <w:left w:val="single" w:sz="1" w:space="0" w:color="2E75B6"/>
+              <w:bottom w:val="single" w:sz="1" w:space="0" w:color="2E75B6"/>
+              <w:right w:val="single" w:sz="1" w:space="0" w:color="2E75B6"/>
+            </w:tcBorders>
+            <w:shd w:val="clear" w:color="auto" w:fill="2E75B6"/>
+            <w:tcMar>
+              <w:top w:w="80" w:type="dxa"/>
+              <w:left w:w="120" w:type="dxa"/>
+              <w:bottom w:w="80" w:type="dxa"/>
+              <w:right w:w="120" w:type="dxa"/>
+            </w:tcMar>
+            <w:vAlign w:val="center"/>
+          </w:tcPr>
+          <w:p>
+            <w:r>
+              <w:rPr>
+                <w:b/>
+                <w:bCs/>
+                <w:color w:val="FFFFFF"/>
+                <w:sz w:val="17"/>
+                <w:szCs w:val="17"/>
+              </w:rPr>
+              <w:t>Öneri / Pratik Çözüm</w:t>
+            </w:r>
+          </w:p>
+        </w:tc>
+        <w:tc>
+          <w:tcPr>
+            <w:tcW w:w="7626" w:type="dxa"/>
+            <w:tcBorders>
+              <w:top w:val="single" w:sz="1" w:space="0" w:color="2E75B6"/>
+              <w:left w:val="single" w:sz="1" w:space="0" w:color="2E75B6"/>
+              <w:bottom w:val="single" w:sz="1" w:space="0" w:color="2E75B6"/>
+              <w:right w:val="single" w:sz="1" w:space="0" w:color="2E75B6"/>
+            </w:tcBorders>
+            <w:shd w:val="clear" w:color="auto" w:fill="FCE4D6"/>
+            <w:tcMar>
+              <w:top w:w="80" w:type="dxa"/>
+              <w:left w:w="160" w:type="dxa"/>
+              <w:bottom w:w="80" w:type="dxa"/>
+              <w:right w:w="120" w:type="dxa"/>
+            </w:tcMar>
+          </w:tcPr>
+          <w:p>
+            <w:r>
+              <w:rPr>
+                <w:i/>
+                <w:iCs/>
+                <w:sz w:val="18"/>
+                <w:szCs w:val="18"/>
+              </w:rPr>
+              <w:t>(1) Bireysel, anten yüksekliği &lt; 3 m, 1 gün süreli POTA aktivasyonu için belediye parkları ve ormanlarda genellikle ek izin gerekmiyor (piknik muamelesi); ancak park görevlisi veya muhtarlığa önceden baskılı bilgi kartını göstermek iyidir. (2) Milli park sınırları içinde milli park müdürlüğüyle email/telefon ile önceden bilgi alınması önerilir. (3) BTK ve amatör telsiz dernek ve kulüpleri'dan Talep: POTA aktivasyonu için birleşik izin kılavuzu (hangi kurum tablosu) hazırlanması; yurt içi POTA referans listesi oluşturulması. Referans: 2873 Milli Parklar Kanunu; 6831 Orman Kanunu Md.17; 5393 Belediye Kanunu Md.14/15; 3621 Kıyı Kanunu; BTK FTM Teknik Ölçütler (spektrum kullanımı FTM muaf).</w:t>
+              <w:br/>
+              <w:t>-- GA-AREDN: AREDN ve Amatör Mesh Network --</w:t>
+            </w:r>
+          </w:p>
+        </w:tc>
+      </w:tr>
+    </w:tbl>
     <w:p>
       <w:pPr>
         <w:pStyle w:val="Heading20"/>
@@ -8276,32 +9796,348 @@
         <w:t>Sorun: AREDN (Amateur Radio Emergency Data Network), Ubiquiti ve benzeri WiFi donanımı için özel firmware kullanarak 2.4 GHz, 3.4 GHz ve 5.8 GHz amatör bantlarında 802.11n/ac protokolünde mesh ağ kurulmaktadır. TR'de bu frekansların bir kısmı BTK MFP'de ikincil amatör tahsislidir; ancak FTM Teknik Ölçütler Tablo 25, bu bantlar için teknik parametreleri eksik bırakmış, TAD 2021 ise yalnızca sınırlı kapsam içermektedir. Ek belirsizlik: AREDN donanımları, hem amatör lisans gerektiren bantlarda hem de FTM-muaf 2.4 GHz ISM frekanslarında (2400-2483.5 MHz) çalışabilmektedir.</w:t>
       </w:r>
     </w:p>
-    <w:p>
-      <w:r>
-        <w:t>TR Mevzuatı: BTK MFP: 2400-2450 MHz ikincil amatör tahsisli; 5830-5850 MHz ikincil amatör tahsisli. FTM Teknik Ölçütler Tablo 25: 5650-5670 MHz ve 5820-5850 MHz 'A ve B Sınıfı' olarak listeli; 2.4 GHz ve 3.4 GHz için spesifik amatör parametre yok. TAD 2021 TAD08-01-06: 1240-1300 MHz ve daha yükseğin A/B sınıfında kullanılabileceğini belirtir; mikrodalga bantları için TAD eksik. Çakışma: 2400-2483.5 MHz hem FTM-muaf (WiFi SRD, Tablo sıra 56+) hem amatör tahsisli -- hangi rejimin geçerli olduğu belirsiz; amatör lisanslı operasyon çalışan BTK kayıt/izni gerektiriyor mu? AREDN donanıminin 'kendi imalı cihaz' sayılıp sayılmayacağı da ayrı bir soru.</w:t>
-      </w:r>
-    </w:p>
-    <w:p>
-      <w:r>
-        <w:t>IARU / CEPT: IARU R1 VHF/UHF/SHF Bandplan: 2320-2450 MHz, 3400-3410 MHz, 5760-5790 MHz amatör bandplan segmentleri tanımlı. AREDN uluslararası topluluk projesi: aredn.org; US ARRL onaylı. CEPT ECC: Mikrodalgada amatör ikincil tahsis uygulamaları ülke bazlı. WRC-19: 2.4 GHz'i değiştirmedi.</w:t>
-      </w:r>
-    </w:p>
-    <w:p>
-      <w:r>
-        <w:t>Diğer Ülkeler: US: AREDN FCC Part 97 kapsamında yasal; 2.4/5.8 GHz amatör bantlarda aktif ağ. DE: BNetzA'ya göre 2.4 GHz amatör kullanım yasaldır, maksimum güç sınırlarına uyulması şart. GB: Ofcom NoV (Notice of Variation) ile Full lisans sahiplerine 2.4 GHz amatör kullanım açık.</w:t>
-      </w:r>
-    </w:p>
-    <w:p>
-      <w:r>
-        <w:t>Öneri / Talep: BTK + KEGM'den Talep: (1) 2.4 GHz ve 5.8 GHz amatör kullanımında teknik parametrelerin (max ERP, emisyon tipi, bant segmenti) TAD 2021'e eklenmesi. (2) AREDN ve benzeri mesh protokollerinin FTM-muaf WiFi donanımıyla amatör bantlarda kullanılıp kullanılmayacağının netleştirilmesi. (3) 'Kendi imali cihaz' tanımı: firmware değiştirilen ticari donanım bu kapsamda değerlendirilmeli. Referans: BTK FTM Tablo 25; BTK MFP; TAD 2021 TAD08-01-06; IARU R1 VHF/UHF/SHF Bandplan.</w:t>
-      </w:r>
-    </w:p>
-    <w:p/>
-    <w:p>
-      <w:r>
-        <w:t>-- GA-LORA: LoRa / Meshtastic / LoRa-APRS ve 433/868/915 MHz Durumu --</w:t>
-      </w:r>
-    </w:p>
+    <w:tbl>
+      <w:tblPr>
+        <w:tblW w:w="9026" w:type="dxa"/>
+        <w:tblInd w:w="110" w:type="dxa"/>
+        <w:tblBorders>
+          <w:top w:val="single" w:sz="4" w:space="0" w:color="auto"/>
+          <w:left w:val="single" w:sz="4" w:space="0" w:color="auto"/>
+          <w:bottom w:val="single" w:sz="4" w:space="0" w:color="auto"/>
+          <w:right w:val="single" w:sz="4" w:space="0" w:color="auto"/>
+          <w:insideH w:val="single" w:sz="4" w:space="0" w:color="auto"/>
+          <w:insideV w:val="single" w:sz="4" w:space="0" w:color="auto"/>
+        </w:tblBorders>
+        <w:tblCellMar>
+          <w:left w:w="10" w:type="dxa"/>
+          <w:right w:w="10" w:type="dxa"/>
+        </w:tblCellMar>
+        <w:tblLook w:val="0000"/>
+      </w:tblPr>
+      <w:tblGrid>
+        <w:gridCol w:w="1400"/>
+        <w:gridCol w:w="7626"/>
+      </w:tblGrid>
+      <w:tr>
+        <w:tc>
+          <w:tcPr>
+            <w:tcW w:w="1400" w:type="dxa"/>
+            <w:tcBorders>
+              <w:top w:val="single" w:sz="1" w:space="0" w:color="2E75B6"/>
+              <w:left w:val="single" w:sz="1" w:space="0" w:color="2E75B6"/>
+              <w:bottom w:val="single" w:sz="1" w:space="0" w:color="2E75B6"/>
+              <w:right w:val="single" w:sz="1" w:space="0" w:color="2E75B6"/>
+            </w:tcBorders>
+            <w:shd w:val="clear" w:color="auto" w:fill="2E75B6"/>
+            <w:tcMar>
+              <w:top w:w="80" w:type="dxa"/>
+              <w:left w:w="120" w:type="dxa"/>
+              <w:bottom w:w="80" w:type="dxa"/>
+              <w:right w:w="120" w:type="dxa"/>
+            </w:tcMar>
+            <w:vAlign w:val="center"/>
+          </w:tcPr>
+          <w:p>
+            <w:r>
+              <w:rPr>
+                <w:b/>
+                <w:bCs/>
+                <w:color w:val="FFFFFF"/>
+                <w:sz w:val="17"/>
+                <w:szCs w:val="17"/>
+              </w:rPr>
+              <w:t>TR Mevzuatı</w:t>
+            </w:r>
+          </w:p>
+        </w:tc>
+        <w:tc>
+          <w:tcPr>
+            <w:tcW w:w="7626" w:type="dxa"/>
+            <w:tcBorders>
+              <w:top w:val="single" w:sz="1" w:space="0" w:color="2E75B6"/>
+              <w:left w:val="single" w:sz="1" w:space="0" w:color="2E75B6"/>
+              <w:bottom w:val="single" w:sz="1" w:space="0" w:color="2E75B6"/>
+              <w:right w:val="single" w:sz="1" w:space="0" w:color="2E75B6"/>
+            </w:tcBorders>
+            <w:shd w:val="clear" w:color="auto" w:fill="D6E4F0"/>
+            <w:tcMar>
+              <w:top w:w="80" w:type="dxa"/>
+              <w:left w:w="160" w:type="dxa"/>
+              <w:bottom w:w="80" w:type="dxa"/>
+              <w:right w:w="120" w:type="dxa"/>
+            </w:tcMar>
+          </w:tcPr>
+          <w:p>
+            <w:r>
+              <w:rPr>
+                <w:i/>
+                <w:iCs/>
+                <w:sz w:val="18"/>
+                <w:szCs w:val="18"/>
+              </w:rPr>
+              <w:t>BTK MFP: 2400-2450 MHz ikincil amatör tahsisli; 5830-5850 MHz ikincil amatör tahsisli. FTM Teknik Ölçütler Tablo 25: 5650-5670 MHz ve 5820-5850 MHz 'A ve B Sınıfı' olarak listeli; 2.4 GHz ve 3.4 GHz için spesifik amatör parametre yok. TAD 2021 TAD08-01-06: 1240-1300 MHz ve daha yükseğin A/B sınıfında kullanılabileceğini belirtir; mikrodalga bantları için TAD eksik. Çakışma: 2400-2483.5 MHz hem FTM-muaf (WiFi SRD, Tablo sıra 56+) hem amatör tahsisli -- hangi rejimin geçerli olduğu belirsiz; amatör lisanslı operasyon çalışan BTK kayıt/izni gerektiriyor mu? AREDN donanıminin 'kendi imalı cihaz' sayılıp sayılmayacağı da ayrı bir soru.</w:t>
+            </w:r>
+          </w:p>
+        </w:tc>
+      </w:tr>
+    </w:tbl>
+    <w:tbl>
+      <w:tblPr>
+        <w:tblW w:w="9026" w:type="dxa"/>
+        <w:tblInd w:w="110" w:type="dxa"/>
+        <w:tblBorders>
+          <w:top w:val="single" w:sz="4" w:space="0" w:color="auto"/>
+          <w:left w:val="single" w:sz="4" w:space="0" w:color="auto"/>
+          <w:bottom w:val="single" w:sz="4" w:space="0" w:color="auto"/>
+          <w:right w:val="single" w:sz="4" w:space="0" w:color="auto"/>
+          <w:insideH w:val="single" w:sz="4" w:space="0" w:color="auto"/>
+          <w:insideV w:val="single" w:sz="4" w:space="0" w:color="auto"/>
+        </w:tblBorders>
+        <w:tblCellMar>
+          <w:left w:w="10" w:type="dxa"/>
+          <w:right w:w="10" w:type="dxa"/>
+        </w:tblCellMar>
+        <w:tblLook w:val="0000"/>
+      </w:tblPr>
+      <w:tblGrid>
+        <w:gridCol w:w="1400"/>
+        <w:gridCol w:w="7626"/>
+      </w:tblGrid>
+      <w:tr>
+        <w:tc>
+          <w:tcPr>
+            <w:tcW w:w="1400" w:type="dxa"/>
+            <w:tcBorders>
+              <w:top w:val="single" w:sz="1" w:space="0" w:color="2E75B6"/>
+              <w:left w:val="single" w:sz="1" w:space="0" w:color="2E75B6"/>
+              <w:bottom w:val="single" w:sz="1" w:space="0" w:color="2E75B6"/>
+              <w:right w:val="single" w:sz="1" w:space="0" w:color="2E75B6"/>
+            </w:tcBorders>
+            <w:shd w:val="clear" w:color="auto" w:fill="2E75B6"/>
+            <w:tcMar>
+              <w:top w:w="80" w:type="dxa"/>
+              <w:left w:w="120" w:type="dxa"/>
+              <w:bottom w:w="80" w:type="dxa"/>
+              <w:right w:w="120" w:type="dxa"/>
+            </w:tcMar>
+            <w:vAlign w:val="center"/>
+          </w:tcPr>
+          <w:p>
+            <w:r>
+              <w:rPr>
+                <w:b/>
+                <w:bCs/>
+                <w:color w:val="FFFFFF"/>
+                <w:sz w:val="17"/>
+                <w:szCs w:val="17"/>
+              </w:rPr>
+              <w:t>IARU / CEPT</w:t>
+            </w:r>
+          </w:p>
+        </w:tc>
+        <w:tc>
+          <w:tcPr>
+            <w:tcW w:w="7626" w:type="dxa"/>
+            <w:tcBorders>
+              <w:top w:val="single" w:sz="1" w:space="0" w:color="2E75B6"/>
+              <w:left w:val="single" w:sz="1" w:space="0" w:color="2E75B6"/>
+              <w:bottom w:val="single" w:sz="1" w:space="0" w:color="2E75B6"/>
+              <w:right w:val="single" w:sz="1" w:space="0" w:color="2E75B6"/>
+            </w:tcBorders>
+            <w:shd w:val="clear" w:color="auto" w:fill="E2EFDA"/>
+            <w:tcMar>
+              <w:top w:w="80" w:type="dxa"/>
+              <w:left w:w="160" w:type="dxa"/>
+              <w:bottom w:w="80" w:type="dxa"/>
+              <w:right w:w="120" w:type="dxa"/>
+            </w:tcMar>
+          </w:tcPr>
+          <w:p>
+            <w:r>
+              <w:rPr>
+                <w:i/>
+                <w:iCs/>
+                <w:sz w:val="18"/>
+                <w:szCs w:val="18"/>
+              </w:rPr>
+              <w:t>IARU R1 VHF/UHF/SHF Bandplan: 2320-2450 MHz, 3400-3410 MHz, 5760-5790 MHz amatör bandplan segmentleri tanımlı. AREDN uluslararası topluluk projesi: aredn.org; US ARRL onaylı. CEPT ECC: Mikrodalgada amatör ikincil tahsis uygulamaları ülke bazlı. WRC-19: 2.4 GHz'i değiştirmedi.</w:t>
+            </w:r>
+          </w:p>
+        </w:tc>
+      </w:tr>
+    </w:tbl>
+    <w:tbl>
+      <w:tblPr>
+        <w:tblW w:w="9026" w:type="dxa"/>
+        <w:tblInd w:w="110" w:type="dxa"/>
+        <w:tblBorders>
+          <w:top w:val="single" w:sz="4" w:space="0" w:color="auto"/>
+          <w:left w:val="single" w:sz="4" w:space="0" w:color="auto"/>
+          <w:bottom w:val="single" w:sz="4" w:space="0" w:color="auto"/>
+          <w:right w:val="single" w:sz="4" w:space="0" w:color="auto"/>
+          <w:insideH w:val="single" w:sz="4" w:space="0" w:color="auto"/>
+          <w:insideV w:val="single" w:sz="4" w:space="0" w:color="auto"/>
+        </w:tblBorders>
+        <w:tblCellMar>
+          <w:left w:w="10" w:type="dxa"/>
+          <w:right w:w="10" w:type="dxa"/>
+        </w:tblCellMar>
+        <w:tblLook w:val="0000"/>
+      </w:tblPr>
+      <w:tblGrid>
+        <w:gridCol w:w="1400"/>
+        <w:gridCol w:w="7626"/>
+      </w:tblGrid>
+      <w:tr>
+        <w:tc>
+          <w:tcPr>
+            <w:tcW w:w="1400" w:type="dxa"/>
+            <w:tcBorders>
+              <w:top w:val="single" w:sz="1" w:space="0" w:color="2E75B6"/>
+              <w:left w:val="single" w:sz="1" w:space="0" w:color="2E75B6"/>
+              <w:bottom w:val="single" w:sz="1" w:space="0" w:color="2E75B6"/>
+              <w:right w:val="single" w:sz="1" w:space="0" w:color="2E75B6"/>
+            </w:tcBorders>
+            <w:shd w:val="clear" w:color="auto" w:fill="2E75B6"/>
+            <w:tcMar>
+              <w:top w:w="80" w:type="dxa"/>
+              <w:left w:w="120" w:type="dxa"/>
+              <w:bottom w:w="80" w:type="dxa"/>
+              <w:right w:w="120" w:type="dxa"/>
+            </w:tcMar>
+            <w:vAlign w:val="center"/>
+          </w:tcPr>
+          <w:p>
+            <w:r>
+              <w:rPr>
+                <w:b/>
+                <w:bCs/>
+                <w:color w:val="FFFFFF"/>
+                <w:sz w:val="17"/>
+                <w:szCs w:val="17"/>
+              </w:rPr>
+              <w:t>Diğer Ülkeler</w:t>
+            </w:r>
+          </w:p>
+        </w:tc>
+        <w:tc>
+          <w:tcPr>
+            <w:tcW w:w="7626" w:type="dxa"/>
+            <w:tcBorders>
+              <w:top w:val="single" w:sz="1" w:space="0" w:color="2E75B6"/>
+              <w:left w:val="single" w:sz="1" w:space="0" w:color="2E75B6"/>
+              <w:bottom w:val="single" w:sz="1" w:space="0" w:color="2E75B6"/>
+              <w:right w:val="single" w:sz="1" w:space="0" w:color="2E75B6"/>
+            </w:tcBorders>
+            <w:shd w:val="clear" w:color="auto" w:fill="FFFFFF"/>
+            <w:tcMar>
+              <w:top w:w="80" w:type="dxa"/>
+              <w:left w:w="160" w:type="dxa"/>
+              <w:bottom w:w="80" w:type="dxa"/>
+              <w:right w:w="120" w:type="dxa"/>
+            </w:tcMar>
+          </w:tcPr>
+          <w:p>
+            <w:r>
+              <w:rPr>
+                <w:i/>
+                <w:iCs/>
+                <w:sz w:val="18"/>
+                <w:szCs w:val="18"/>
+              </w:rPr>
+              <w:t>US: AREDN FCC Part 97 kapsamında yasal; 2.4/5.8 GHz amatör bantlarda aktif ağ. DE: BNetzA'ya göre 2.4 GHz amatör kullanım yasaldır, maksimum güç sınırlarına uyulması şart. GB: Ofcom NoV (Notice of Variation) ile Full lisans sahiplerine 2.4 GHz amatör kullanım açık.</w:t>
+            </w:r>
+          </w:p>
+        </w:tc>
+      </w:tr>
+    </w:tbl>
+    <w:tbl>
+      <w:tblPr>
+        <w:tblW w:w="9026" w:type="dxa"/>
+        <w:tblInd w:w="110" w:type="dxa"/>
+        <w:tblBorders>
+          <w:top w:val="single" w:sz="4" w:space="0" w:color="auto"/>
+          <w:left w:val="single" w:sz="4" w:space="0" w:color="auto"/>
+          <w:bottom w:val="single" w:sz="4" w:space="0" w:color="auto"/>
+          <w:right w:val="single" w:sz="4" w:space="0" w:color="auto"/>
+          <w:insideH w:val="single" w:sz="4" w:space="0" w:color="auto"/>
+          <w:insideV w:val="single" w:sz="4" w:space="0" w:color="auto"/>
+        </w:tblBorders>
+        <w:tblCellMar>
+          <w:left w:w="10" w:type="dxa"/>
+          <w:right w:w="10" w:type="dxa"/>
+        </w:tblCellMar>
+        <w:tblLook w:val="0000"/>
+      </w:tblPr>
+      <w:tblGrid>
+        <w:gridCol w:w="1400"/>
+        <w:gridCol w:w="7626"/>
+      </w:tblGrid>
+      <w:tr>
+        <w:tc>
+          <w:tcPr>
+            <w:tcW w:w="1400" w:type="dxa"/>
+            <w:tcBorders>
+              <w:top w:val="single" w:sz="1" w:space="0" w:color="2E75B6"/>
+              <w:left w:val="single" w:sz="1" w:space="0" w:color="2E75B6"/>
+              <w:bottom w:val="single" w:sz="1" w:space="0" w:color="2E75B6"/>
+              <w:right w:val="single" w:sz="1" w:space="0" w:color="2E75B6"/>
+            </w:tcBorders>
+            <w:shd w:val="clear" w:color="auto" w:fill="2E75B6"/>
+            <w:tcMar>
+              <w:top w:w="80" w:type="dxa"/>
+              <w:left w:w="120" w:type="dxa"/>
+              <w:bottom w:w="80" w:type="dxa"/>
+              <w:right w:w="120" w:type="dxa"/>
+            </w:tcMar>
+            <w:vAlign w:val="center"/>
+          </w:tcPr>
+          <w:p>
+            <w:r>
+              <w:rPr>
+                <w:b/>
+                <w:bCs/>
+                <w:color w:val="FFFFFF"/>
+                <w:sz w:val="17"/>
+                <w:szCs w:val="17"/>
+              </w:rPr>
+              <w:t>Öneri / Talep</w:t>
+            </w:r>
+          </w:p>
+        </w:tc>
+        <w:tc>
+          <w:tcPr>
+            <w:tcW w:w="7626" w:type="dxa"/>
+            <w:tcBorders>
+              <w:top w:val="single" w:sz="1" w:space="0" w:color="2E75B6"/>
+              <w:left w:val="single" w:sz="1" w:space="0" w:color="2E75B6"/>
+              <w:bottom w:val="single" w:sz="1" w:space="0" w:color="2E75B6"/>
+              <w:right w:val="single" w:sz="1" w:space="0" w:color="2E75B6"/>
+            </w:tcBorders>
+            <w:shd w:val="clear" w:color="auto" w:fill="FCE4D6"/>
+            <w:tcMar>
+              <w:top w:w="80" w:type="dxa"/>
+              <w:left w:w="160" w:type="dxa"/>
+              <w:bottom w:w="80" w:type="dxa"/>
+              <w:right w:w="120" w:type="dxa"/>
+            </w:tcMar>
+          </w:tcPr>
+          <w:p>
+            <w:r>
+              <w:rPr>
+                <w:i/>
+                <w:iCs/>
+                <w:sz w:val="18"/>
+                <w:szCs w:val="18"/>
+              </w:rPr>
+              <w:t>BTK + KEGM'den Talep: (1) 2.4 GHz ve 5.8 GHz amatör kullanımında teknik parametrelerin (max ERP, emisyon tipi, bant segmenti) TAD 2021'e eklenmesi. (2) AREDN ve benzeri mesh protokollerinin FTM-muaf WiFi donanımıyla amatör bantlarda kullanılıp kullanılmayacağının netleştirilmesi. (3) 'Kendi imali cihaz' tanımı: firmware değiştirilen ticari donanım bu kapsamda değerlendirilmeli. Referans: BTK FTM Tablo 25; BTK MFP; TAD 2021 TAD08-01-06; IARU R1 VHF/UHF/SHF Bandplan.</w:t>
+              <w:br/>
+              <w:t>-- GA-LORA: LoRa / Meshtastic / LoRa-APRS ve 433/868/915 MHz Durumu --</w:t>
+            </w:r>
+          </w:p>
+        </w:tc>
+      </w:tr>
+    </w:tbl>
     <w:p>
       <w:pPr>
         <w:pStyle w:val="Heading20"/>
@@ -8315,32 +10151,348 @@
         <w:t>Sorun: LoRa (Long Range) RF modülasyon teknolojisi ve bu teknolojiyi kullanan Meshtastic mesh paging sistemi ile LoRa-APRS, birçok frekans bandında çalışabilmektedir. Türkiye'de hangi frekansin lisanssız (FTM-muaf SRD), hangisinin amatör lisansı gerektirdiği, 915 MHz'in yasal olmadığı ve amatör çağrı işareti ile yapılan iletişimin SRD cihaz rejiminden çıkıp amatör rejime girip girmeyeceği konularında belirsizlik vardır.</w:t>
       </w:r>
     </w:p>
-    <w:p>
-      <w:r>
-        <w:t>TR Mevzuatı -- Frekans Bazlı Analiz: (a) 433.05-434.79 MHz: BTK FTM 2022 Taslak Tablo, Sıra 15a: 10 mW e.r.p., görev çevrimi &lt;%10, analog ses/video uygulamaları hariç -- LoRa/Meshtastic EU 433 MHz preset bu kapsamda FTM-muaf, lisanssız kullanılabilir. ANCAK: 430-440 MHz amatör bandındadır; amatör amacıyla (çağrı işareti ile) kullanılırsa FTM-muaf SRD rejimi yerine amatör lisansı rejimi geçerlidir ve güç 75W'a kadar çıkar. (b) 868 MHz (863-870 MHz): BTK FTM Tablo, Sıra 18a-d / 19-22: 25 mW e.r.p., duty cycle/LBT kuralları -- LoRa/Meshtastic EU 868 MHz preset bu kapsamda FTM-muaf, lisanssız yasal. Türkiye için BIRINCIL LoRa frekans seçimidir. 869.4-869.65 MHz: 500 mW e.r.p.'a kadar izin. (c) 915 MHz: Türkiye'de FTM tablosunda yer almaz. 900-960 MHz bandı GSM-900/LTE Band 8 hücresel spektrumdur. 915 MHz Meshtastic firmware preset ile cihaz kullanmak bu bantta YASA DIŞIDIR; hücresel altyapıya girişim riski vardır ve BTK tarafından işlem yapılabilir. İthal edilen birçok LoRa/Meshtastic cihaz 915 MHz için üretilmiştir -- Türkiye'de kullanilmadan önce firmware ile 868 MHz'e alınmalıdır.</w:t>
-      </w:r>
-    </w:p>
-    <w:p>
-      <w:r>
-        <w:lastRenderedPageBreak/>
-        <w:t>LoRa-APRS Frekansları: (1) 144.800 MHz: Avrupa standart APRS frekans -- amatör bandı, amatör lisansı gerektirir; LoRa modunda kullanım teknik olarak mümkündür ancak 144 MHz'de LoRa emisyonu bandplan ile uyumlu olup olmadığı IARU R1'de tartışılıyor. (2) 433.775 MHz: LoRa-APRS için Avrupa amatör toplulukça yaygın kullanılan frekans (OE5BPA projesi gibi). 433 MHz SRD sınırlarında (10 mW, %10 DC): lisanssız FTM-muaf olarak çalışabilir. Ancak APRS iletişimlerinde çağrı işareti gönderimi amatör operasyon sayılır, bu durumda lisans gerekir. Gri alan: sadece konum (no callsign) = SRD; callsign ile = amatör. (3) 868 MHz LoRa-APRS: SRD bandında, lisanssız I-gate (RX-only) kurulumu mümkündür; TX (beacon gönderimi callsign ile) amatör lisansı gerektirir.</w:t>
-      </w:r>
-    </w:p>
-    <w:p>
-      <w:r>
-        <w:t>IARU / CEPT: IARU R1: LoRa-APRS için resmi bandplan kararı yok; 433.775 MHz topluluk uygulaması. APRS Foundation: 144.800 MHz standart; LoRa-APRS paralel gelişim. ERC/ECC: 863-870 MHz SRD harmonizasyonu TS EN 300 220 standardı -- Türkiye dahil.</w:t>
-      </w:r>
-    </w:p>
-    <w:p>
-      <w:r>
-        <w:t>Diğer Ülkeler: DE/AT/NL: Meshtastic 868 MHz FTM-muaf, yaygın kullanım, dernek rehberleri mevcut. GB: LoRa 868 MHz lisanssız; 433 MHz LoRa SRD kapsamında. US: 915 MHz ISM bandında, lisanssız yasal -- Türkiye ile UYUMSUZ. AU/NZ: 915 MHz; Asya'da bazı ülkeler 923 MHz -- ülke spesifik.</w:t>
-      </w:r>
-    </w:p>
-    <w:p>
-      <w:r>
-        <w:t>Öneri / Pratik Çözüm: (1) Meshtastic kullanıcıları: Firmware'i mutlaka EU 868 MHz preset'e alın; 915 MHz Türkiye'de yasadışı. 433 MHz EU preset: lisanssız SRD olarak kullanılabilir, amatör callsign eklenmemeli ya da amatör lisansı ile kullanılmalı. (2) LoRa-APRS: 433.775 MHz veya 868 MHz I-gate (RX-only): lisanssız; TX beacon (callsign ile) için amatör lisansı gerekir. (3) AREDN: 2.4/5.8 GHz amatör bantlarda -- amatör lisansı zorunlu, çağrı işareti yayını sart. (4) BTK'dan Talep: 433 MHz SRD ve amatör bant çaprazlaşması için net sınır belirlenmesi; 915 MHz kullanan ithal cihazlar hakkında tüketici uyarısı; LoRa-APRS TX durumunun amatör mi SRD mi sayılacağının açıklanması. Referans: BTK FTM 2022 Taslak Tablo Sıra 15a (433 MHz), 18a-d/19 (868 MHz); BTK MFP 900-960 MHz tahsis (hücresel); IARU R1 Bandplan; TS EN 300 220.</w:t>
-      </w:r>
-    </w:p>
+    <w:tbl>
+      <w:tblPr>
+        <w:tblW w:w="9026" w:type="dxa"/>
+        <w:tblInd w:w="110" w:type="dxa"/>
+        <w:tblBorders>
+          <w:top w:val="single" w:sz="4" w:space="0" w:color="auto"/>
+          <w:left w:val="single" w:sz="4" w:space="0" w:color="auto"/>
+          <w:bottom w:val="single" w:sz="4" w:space="0" w:color="auto"/>
+          <w:right w:val="single" w:sz="4" w:space="0" w:color="auto"/>
+          <w:insideH w:val="single" w:sz="4" w:space="0" w:color="auto"/>
+          <w:insideV w:val="single" w:sz="4" w:space="0" w:color="auto"/>
+        </w:tblBorders>
+        <w:tblCellMar>
+          <w:left w:w="10" w:type="dxa"/>
+          <w:right w:w="10" w:type="dxa"/>
+        </w:tblCellMar>
+        <w:tblLook w:val="0000"/>
+      </w:tblPr>
+      <w:tblGrid>
+        <w:gridCol w:w="1400"/>
+        <w:gridCol w:w="7626"/>
+      </w:tblGrid>
+      <w:tr>
+        <w:tc>
+          <w:tcPr>
+            <w:tcW w:w="1400" w:type="dxa"/>
+            <w:tcBorders>
+              <w:top w:val="single" w:sz="1" w:space="0" w:color="2E75B6"/>
+              <w:left w:val="single" w:sz="1" w:space="0" w:color="2E75B6"/>
+              <w:bottom w:val="single" w:sz="1" w:space="0" w:color="2E75B6"/>
+              <w:right w:val="single" w:sz="1" w:space="0" w:color="2E75B6"/>
+            </w:tcBorders>
+            <w:shd w:val="clear" w:color="auto" w:fill="2E75B6"/>
+            <w:tcMar>
+              <w:top w:w="80" w:type="dxa"/>
+              <w:left w:w="120" w:type="dxa"/>
+              <w:bottom w:w="80" w:type="dxa"/>
+              <w:right w:w="120" w:type="dxa"/>
+            </w:tcMar>
+            <w:vAlign w:val="center"/>
+          </w:tcPr>
+          <w:p>
+            <w:r>
+              <w:rPr>
+                <w:b/>
+                <w:bCs/>
+                <w:color w:val="FFFFFF"/>
+                <w:sz w:val="17"/>
+                <w:szCs w:val="17"/>
+              </w:rPr>
+              <w:t>TR Mevzuatı -- Frekans Bazlı Analiz</w:t>
+            </w:r>
+          </w:p>
+        </w:tc>
+        <w:tc>
+          <w:tcPr>
+            <w:tcW w:w="7626" w:type="dxa"/>
+            <w:tcBorders>
+              <w:top w:val="single" w:sz="1" w:space="0" w:color="2E75B6"/>
+              <w:left w:val="single" w:sz="1" w:space="0" w:color="2E75B6"/>
+              <w:bottom w:val="single" w:sz="1" w:space="0" w:color="2E75B6"/>
+              <w:right w:val="single" w:sz="1" w:space="0" w:color="2E75B6"/>
+            </w:tcBorders>
+            <w:shd w:val="clear" w:color="auto" w:fill="D6E4F0"/>
+            <w:tcMar>
+              <w:top w:w="80" w:type="dxa"/>
+              <w:left w:w="160" w:type="dxa"/>
+              <w:bottom w:w="80" w:type="dxa"/>
+              <w:right w:w="120" w:type="dxa"/>
+            </w:tcMar>
+          </w:tcPr>
+          <w:p>
+            <w:r>
+              <w:rPr>
+                <w:i/>
+                <w:iCs/>
+                <w:sz w:val="18"/>
+                <w:szCs w:val="18"/>
+              </w:rPr>
+              <w:t>(a) 433.05-434.79 MHz: BTK FTM 2022 Taslak Tablo, Sıra 15a: 10 mW e.r.p., görev çevrimi &lt;%10, analog ses/video uygulamaları hariç -- LoRa/Meshtastic EU 433 MHz preset bu kapsamda FTM-muaf, lisanssız kullanılabilir. ANCAK: 430-440 MHz amatör bandındadır; amatör amacıyla (çağrı işareti ile) kullanılırsa FTM-muaf SRD rejimi yerine amatör lisansı rejimi geçerlidir ve güç 75W'a kadar çıkar. (b) 868 MHz (863-870 MHz): BTK FTM Tablo, Sıra 18a-d / 19-22: 25 mW e.r.p., duty cycle/LBT kuralları -- LoRa/Meshtastic EU 868 MHz preset bu kapsamda FTM-muaf, lisanssız yasal. Türkiye için BIRINCIL LoRa frekans seçimidir. 869.4-869.65 MHz: 500 mW e.r.p.'a kadar izin. (c) 915 MHz: Türkiye'de FTM tablosunda yer almaz. 900-960 MHz bandı GSM-900/LTE Band 8 hücresel spektrumdur. 915 MHz Meshtastic firmware preset ile cihaz kullanmak bu bantta YASA DIŞIDIR; hücresel altyapıya girişim riski vardır ve BTK tarafından işlem yapılabilir. İthal edilen birçok LoRa/Meshtastic cihaz 915 MHz için üretilmiştir -- Türkiye'de kullanilmadan önce firmware ile 868 MHz'e alınmalıdır.</w:t>
+              <w:br/>
+              <w:t>LoRa-APRS Frekansları: (1) 144.800 MHz: Avrupa standart APRS frekans -- amatör bandı, amatör lisansı gerektirir; LoRa modunda kullanım teknik olarak mümkündür ancak 144 MHz'de LoRa emisyonu bandplan ile uyumlu olup olmadığı IARU R1'de tartışılıyor. (2) 433.775 MHz: LoRa-APRS için Avrupa amatör toplulukça yaygın kullanılan frekans (OE5BPA projesi gibi). 433 MHz SRD sınırlarında (10 mW, %10 DC): lisanssız FTM-muaf olarak çalışabilir. Ancak APRS iletişimlerinde çağrı işareti gönderimi amatör operasyon sayılır, bu durumda lisans gerekir. Gri alan: sadece konum (no callsign) = SRD; callsign ile = amatör. (3) 868 MHz LoRa-APRS: SRD bandında, lisanssız I-gate (RX-only) kurulumu mümkündür; TX (beacon gönderimi callsign ile) amatör lisansı gerektirir.</w:t>
+            </w:r>
+          </w:p>
+        </w:tc>
+      </w:tr>
+    </w:tbl>
+    <w:tbl>
+      <w:tblPr>
+        <w:tblW w:w="9026" w:type="dxa"/>
+        <w:tblInd w:w="110" w:type="dxa"/>
+        <w:tblBorders>
+          <w:top w:val="single" w:sz="4" w:space="0" w:color="auto"/>
+          <w:left w:val="single" w:sz="4" w:space="0" w:color="auto"/>
+          <w:bottom w:val="single" w:sz="4" w:space="0" w:color="auto"/>
+          <w:right w:val="single" w:sz="4" w:space="0" w:color="auto"/>
+          <w:insideH w:val="single" w:sz="4" w:space="0" w:color="auto"/>
+          <w:insideV w:val="single" w:sz="4" w:space="0" w:color="auto"/>
+        </w:tblBorders>
+        <w:tblCellMar>
+          <w:left w:w="10" w:type="dxa"/>
+          <w:right w:w="10" w:type="dxa"/>
+        </w:tblCellMar>
+        <w:tblLook w:val="0000"/>
+      </w:tblPr>
+      <w:tblGrid>
+        <w:gridCol w:w="1400"/>
+        <w:gridCol w:w="7626"/>
+      </w:tblGrid>
+      <w:tr>
+        <w:tc>
+          <w:tcPr>
+            <w:tcW w:w="1400" w:type="dxa"/>
+            <w:tcBorders>
+              <w:top w:val="single" w:sz="1" w:space="0" w:color="2E75B6"/>
+              <w:left w:val="single" w:sz="1" w:space="0" w:color="2E75B6"/>
+              <w:bottom w:val="single" w:sz="1" w:space="0" w:color="2E75B6"/>
+              <w:right w:val="single" w:sz="1" w:space="0" w:color="2E75B6"/>
+            </w:tcBorders>
+            <w:shd w:val="clear" w:color="auto" w:fill="2E75B6"/>
+            <w:tcMar>
+              <w:top w:w="80" w:type="dxa"/>
+              <w:left w:w="120" w:type="dxa"/>
+              <w:bottom w:w="80" w:type="dxa"/>
+              <w:right w:w="120" w:type="dxa"/>
+            </w:tcMar>
+            <w:vAlign w:val="center"/>
+          </w:tcPr>
+          <w:p>
+            <w:r>
+              <w:rPr>
+                <w:b/>
+                <w:bCs/>
+                <w:color w:val="FFFFFF"/>
+                <w:sz w:val="17"/>
+                <w:szCs w:val="17"/>
+              </w:rPr>
+              <w:t>IARU / CEPT</w:t>
+            </w:r>
+          </w:p>
+        </w:tc>
+        <w:tc>
+          <w:tcPr>
+            <w:tcW w:w="7626" w:type="dxa"/>
+            <w:tcBorders>
+              <w:top w:val="single" w:sz="1" w:space="0" w:color="2E75B6"/>
+              <w:left w:val="single" w:sz="1" w:space="0" w:color="2E75B6"/>
+              <w:bottom w:val="single" w:sz="1" w:space="0" w:color="2E75B6"/>
+              <w:right w:val="single" w:sz="1" w:space="0" w:color="2E75B6"/>
+            </w:tcBorders>
+            <w:shd w:val="clear" w:color="auto" w:fill="E2EFDA"/>
+            <w:tcMar>
+              <w:top w:w="80" w:type="dxa"/>
+              <w:left w:w="160" w:type="dxa"/>
+              <w:bottom w:w="80" w:type="dxa"/>
+              <w:right w:w="120" w:type="dxa"/>
+            </w:tcMar>
+          </w:tcPr>
+          <w:p>
+            <w:r>
+              <w:rPr>
+                <w:i/>
+                <w:iCs/>
+                <w:sz w:val="18"/>
+                <w:szCs w:val="18"/>
+              </w:rPr>
+              <w:t>IARU R1: LoRa-APRS için resmi bandplan kararı yok; 433.775 MHz topluluk uygulaması. APRS Foundation: 144.800 MHz standart; LoRa-APRS paralel gelişim. ERC/ECC: 863-870 MHz SRD harmonizasyonu TS EN 300 220 standardı -- Türkiye dahil.</w:t>
+            </w:r>
+          </w:p>
+        </w:tc>
+      </w:tr>
+    </w:tbl>
+    <w:tbl>
+      <w:tblPr>
+        <w:tblW w:w="9026" w:type="dxa"/>
+        <w:tblInd w:w="110" w:type="dxa"/>
+        <w:tblBorders>
+          <w:top w:val="single" w:sz="4" w:space="0" w:color="auto"/>
+          <w:left w:val="single" w:sz="4" w:space="0" w:color="auto"/>
+          <w:bottom w:val="single" w:sz="4" w:space="0" w:color="auto"/>
+          <w:right w:val="single" w:sz="4" w:space="0" w:color="auto"/>
+          <w:insideH w:val="single" w:sz="4" w:space="0" w:color="auto"/>
+          <w:insideV w:val="single" w:sz="4" w:space="0" w:color="auto"/>
+        </w:tblBorders>
+        <w:tblCellMar>
+          <w:left w:w="10" w:type="dxa"/>
+          <w:right w:w="10" w:type="dxa"/>
+        </w:tblCellMar>
+        <w:tblLook w:val="0000"/>
+      </w:tblPr>
+      <w:tblGrid>
+        <w:gridCol w:w="1400"/>
+        <w:gridCol w:w="7626"/>
+      </w:tblGrid>
+      <w:tr>
+        <w:tc>
+          <w:tcPr>
+            <w:tcW w:w="1400" w:type="dxa"/>
+            <w:tcBorders>
+              <w:top w:val="single" w:sz="1" w:space="0" w:color="2E75B6"/>
+              <w:left w:val="single" w:sz="1" w:space="0" w:color="2E75B6"/>
+              <w:bottom w:val="single" w:sz="1" w:space="0" w:color="2E75B6"/>
+              <w:right w:val="single" w:sz="1" w:space="0" w:color="2E75B6"/>
+            </w:tcBorders>
+            <w:shd w:val="clear" w:color="auto" w:fill="2E75B6"/>
+            <w:tcMar>
+              <w:top w:w="80" w:type="dxa"/>
+              <w:left w:w="120" w:type="dxa"/>
+              <w:bottom w:w="80" w:type="dxa"/>
+              <w:right w:w="120" w:type="dxa"/>
+            </w:tcMar>
+            <w:vAlign w:val="center"/>
+          </w:tcPr>
+          <w:p>
+            <w:r>
+              <w:rPr>
+                <w:b/>
+                <w:bCs/>
+                <w:color w:val="FFFFFF"/>
+                <w:sz w:val="17"/>
+                <w:szCs w:val="17"/>
+              </w:rPr>
+              <w:t>Diğer Ülkeler</w:t>
+            </w:r>
+          </w:p>
+        </w:tc>
+        <w:tc>
+          <w:tcPr>
+            <w:tcW w:w="7626" w:type="dxa"/>
+            <w:tcBorders>
+              <w:top w:val="single" w:sz="1" w:space="0" w:color="2E75B6"/>
+              <w:left w:val="single" w:sz="1" w:space="0" w:color="2E75B6"/>
+              <w:bottom w:val="single" w:sz="1" w:space="0" w:color="2E75B6"/>
+              <w:right w:val="single" w:sz="1" w:space="0" w:color="2E75B6"/>
+            </w:tcBorders>
+            <w:shd w:val="clear" w:color="auto" w:fill="FFFFFF"/>
+            <w:tcMar>
+              <w:top w:w="80" w:type="dxa"/>
+              <w:left w:w="160" w:type="dxa"/>
+              <w:bottom w:w="80" w:type="dxa"/>
+              <w:right w:w="120" w:type="dxa"/>
+            </w:tcMar>
+          </w:tcPr>
+          <w:p>
+            <w:r>
+              <w:rPr>
+                <w:i/>
+                <w:iCs/>
+                <w:sz w:val="18"/>
+                <w:szCs w:val="18"/>
+              </w:rPr>
+              <w:t>DE/AT/NL: Meshtastic 868 MHz FTM-muaf, yaygın kullanım, dernek rehberleri mevcut. GB: LoRa 868 MHz lisanssız; 433 MHz LoRa SRD kapsamında. US: 915 MHz ISM bandında, lisanssız yasal -- Türkiye ile UYUMSUZ. AU/NZ: 915 MHz; Asya'da bazı ülkeler 923 MHz -- ülke spesifik.</w:t>
+            </w:r>
+          </w:p>
+        </w:tc>
+      </w:tr>
+    </w:tbl>
+    <w:tbl>
+      <w:tblPr>
+        <w:tblW w:w="9026" w:type="dxa"/>
+        <w:tblInd w:w="110" w:type="dxa"/>
+        <w:tblBorders>
+          <w:top w:val="single" w:sz="4" w:space="0" w:color="auto"/>
+          <w:left w:val="single" w:sz="4" w:space="0" w:color="auto"/>
+          <w:bottom w:val="single" w:sz="4" w:space="0" w:color="auto"/>
+          <w:right w:val="single" w:sz="4" w:space="0" w:color="auto"/>
+          <w:insideH w:val="single" w:sz="4" w:space="0" w:color="auto"/>
+          <w:insideV w:val="single" w:sz="4" w:space="0" w:color="auto"/>
+        </w:tblBorders>
+        <w:tblCellMar>
+          <w:left w:w="10" w:type="dxa"/>
+          <w:right w:w="10" w:type="dxa"/>
+        </w:tblCellMar>
+        <w:tblLook w:val="0000"/>
+      </w:tblPr>
+      <w:tblGrid>
+        <w:gridCol w:w="1400"/>
+        <w:gridCol w:w="7626"/>
+      </w:tblGrid>
+      <w:tr>
+        <w:tc>
+          <w:tcPr>
+            <w:tcW w:w="1400" w:type="dxa"/>
+            <w:tcBorders>
+              <w:top w:val="single" w:sz="1" w:space="0" w:color="2E75B6"/>
+              <w:left w:val="single" w:sz="1" w:space="0" w:color="2E75B6"/>
+              <w:bottom w:val="single" w:sz="1" w:space="0" w:color="2E75B6"/>
+              <w:right w:val="single" w:sz="1" w:space="0" w:color="2E75B6"/>
+            </w:tcBorders>
+            <w:shd w:val="clear" w:color="auto" w:fill="2E75B6"/>
+            <w:tcMar>
+              <w:top w:w="80" w:type="dxa"/>
+              <w:left w:w="120" w:type="dxa"/>
+              <w:bottom w:w="80" w:type="dxa"/>
+              <w:right w:w="120" w:type="dxa"/>
+            </w:tcMar>
+            <w:vAlign w:val="center"/>
+          </w:tcPr>
+          <w:p>
+            <w:r>
+              <w:rPr>
+                <w:b/>
+                <w:bCs/>
+                <w:color w:val="FFFFFF"/>
+                <w:sz w:val="17"/>
+                <w:szCs w:val="17"/>
+              </w:rPr>
+              <w:t>Öneri / Pratik Çözüm</w:t>
+            </w:r>
+          </w:p>
+        </w:tc>
+        <w:tc>
+          <w:tcPr>
+            <w:tcW w:w="7626" w:type="dxa"/>
+            <w:tcBorders>
+              <w:top w:val="single" w:sz="1" w:space="0" w:color="2E75B6"/>
+              <w:left w:val="single" w:sz="1" w:space="0" w:color="2E75B6"/>
+              <w:bottom w:val="single" w:sz="1" w:space="0" w:color="2E75B6"/>
+              <w:right w:val="single" w:sz="1" w:space="0" w:color="2E75B6"/>
+            </w:tcBorders>
+            <w:shd w:val="clear" w:color="auto" w:fill="FCE4D6"/>
+            <w:tcMar>
+              <w:top w:w="80" w:type="dxa"/>
+              <w:left w:w="160" w:type="dxa"/>
+              <w:bottom w:w="80" w:type="dxa"/>
+              <w:right w:w="120" w:type="dxa"/>
+            </w:tcMar>
+          </w:tcPr>
+          <w:p>
+            <w:r>
+              <w:rPr>
+                <w:i/>
+                <w:iCs/>
+                <w:sz w:val="18"/>
+                <w:szCs w:val="18"/>
+              </w:rPr>
+              <w:t>(1) Meshtastic kullanıcıları: Firmware'i mutlaka EU 868 MHz preset'e alın; 915 MHz Türkiye'de yasadışı. 433 MHz EU preset: lisanssız SRD olarak kullanılabilir, amatör callsign eklenmemeli ya da amatör lisansı ile kullanılmalı. (2) LoRa-APRS: 433.775 MHz veya 868 MHz I-gate (RX-only): lisanssız; TX beacon (callsign ile) için amatör lisansı gerekir. (3) AREDN: 2.4/5.8 GHz amatör bantlarda -- amatör lisansı zorunlu, çağrı işareti yayını sart. (4) BTK'dan Talep: 433 MHz SRD ve amatör bant çaprazlaşması için net sınır belirlenmesi; 915 MHz kullanan ithal cihazlar hakkında tüketici uyarısı; LoRa-APRS TX durumunun amatör mi SRD mi sayılacağının açıklanması. Referans: BTK FTM 2022 Taslak Tablo Sıra 15a (433 MHz), 18a-d/19 (868 MHz); BTK MFP 900-960 MHz tahsis (hücresel); IARU R1 Bandplan; TS EN 300 220.</w:t>
+            </w:r>
+          </w:p>
+        </w:tc>
+      </w:tr>
+    </w:tbl>
     <w:p>
       <w:r>
         <w:rPr>
@@ -8358,46 +10510,346 @@
       </w:r>
       <w:r/>
     </w:p>
-    <w:p>
-      <w:r>
-        <w:rPr>
-          <w:b/>
-        </w:rPr>
-        <w:t>TR Mevzuatı: KEGM Sınav ve Belgelendirme Yönetmeliği (RG 27482) Md.7/1 (10 yıl bekletme; vefat hariç) ve Md.7/2 (vefat/vesayette şartlı varis/vasi tahsisi).</w:t>
-      </w:r>
-      <w:r/>
-    </w:p>
-    <w:p>
-      <w:r>
-        <w:rPr>
-          <w:b/>
-        </w:rPr>
-        <w:t xml:space="preserve">IARU / CEPT: </w:t>
-      </w:r>
-      <w:r>
-        <w:t>Uluslararası 'Silent Key' geleneği yerleşik; bazı idarelerde aileye/kulübe in-memoriam tahsis mümkün. Bağlayıcı IARU politikası yok.</w:t>
-      </w:r>
-    </w:p>
-    <w:p>
-      <w:r>
-        <w:rPr>
-          <w:b/>
-        </w:rPr>
-        <w:t xml:space="preserve">Diğer Ülkeler: </w:t>
-      </w:r>
-      <w:r>
-        <w:t>US (FCC): SK çağrı işareti aileye/kulübe 'vanity' ile tahsis edilebilir. DE/GB: anıt/kulüp tahsisi uygulamaları var.</w:t>
-      </w:r>
-    </w:p>
-    <w:p>
-      <w:r>
-        <w:rPr>
-          <w:b/>
-        </w:rPr>
-        <w:t>Öneri / Talep: KEGM'den: (1) Md.7/2'nin belge süresi sonrası akıbetinin netleştirilmesi; (2) 'eşdeğer belge sahibi olma' şartının aile üyeleri için esnetilip esnetilemeyeceğinin değerlendirilmesi; (3) bu mekanizmanın topluluğa rehberle duyurulması; (4) kalıcı 'anıt' statüsü gibi ek seçeneklerin değerlendirilmesi.</w:t>
-      </w:r>
-      <w:r/>
-    </w:p>
+    <w:tbl>
+      <w:tblPr>
+        <w:tblW w:w="9026" w:type="dxa"/>
+        <w:tblInd w:w="110" w:type="dxa"/>
+        <w:tblBorders>
+          <w:top w:val="single" w:sz="4" w:space="0" w:color="auto"/>
+          <w:left w:val="single" w:sz="4" w:space="0" w:color="auto"/>
+          <w:bottom w:val="single" w:sz="4" w:space="0" w:color="auto"/>
+          <w:right w:val="single" w:sz="4" w:space="0" w:color="auto"/>
+          <w:insideH w:val="single" w:sz="4" w:space="0" w:color="auto"/>
+          <w:insideV w:val="single" w:sz="4" w:space="0" w:color="auto"/>
+        </w:tblBorders>
+        <w:tblCellMar>
+          <w:left w:w="10" w:type="dxa"/>
+          <w:right w:w="10" w:type="dxa"/>
+        </w:tblCellMar>
+        <w:tblLook w:val="0000"/>
+      </w:tblPr>
+      <w:tblGrid>
+        <w:gridCol w:w="1400"/>
+        <w:gridCol w:w="7626"/>
+      </w:tblGrid>
+      <w:tr>
+        <w:tc>
+          <w:tcPr>
+            <w:tcW w:w="1400" w:type="dxa"/>
+            <w:tcBorders>
+              <w:top w:val="single" w:sz="1" w:space="0" w:color="2E75B6"/>
+              <w:left w:val="single" w:sz="1" w:space="0" w:color="2E75B6"/>
+              <w:bottom w:val="single" w:sz="1" w:space="0" w:color="2E75B6"/>
+              <w:right w:val="single" w:sz="1" w:space="0" w:color="2E75B6"/>
+            </w:tcBorders>
+            <w:shd w:val="clear" w:color="auto" w:fill="2E75B6"/>
+            <w:tcMar>
+              <w:top w:w="80" w:type="dxa"/>
+              <w:left w:w="120" w:type="dxa"/>
+              <w:bottom w:w="80" w:type="dxa"/>
+              <w:right w:w="120" w:type="dxa"/>
+            </w:tcMar>
+            <w:vAlign w:val="center"/>
+          </w:tcPr>
+          <w:p>
+            <w:r>
+              <w:rPr>
+                <w:b/>
+                <w:bCs/>
+                <w:color w:val="FFFFFF"/>
+                <w:sz w:val="17"/>
+                <w:szCs w:val="17"/>
+              </w:rPr>
+              <w:t>TR Mevzuatı</w:t>
+            </w:r>
+          </w:p>
+        </w:tc>
+        <w:tc>
+          <w:tcPr>
+            <w:tcW w:w="7626" w:type="dxa"/>
+            <w:tcBorders>
+              <w:top w:val="single" w:sz="1" w:space="0" w:color="2E75B6"/>
+              <w:left w:val="single" w:sz="1" w:space="0" w:color="2E75B6"/>
+              <w:bottom w:val="single" w:sz="1" w:space="0" w:color="2E75B6"/>
+              <w:right w:val="single" w:sz="1" w:space="0" w:color="2E75B6"/>
+            </w:tcBorders>
+            <w:shd w:val="clear" w:color="auto" w:fill="D6E4F0"/>
+            <w:tcMar>
+              <w:top w:w="80" w:type="dxa"/>
+              <w:left w:w="160" w:type="dxa"/>
+              <w:bottom w:w="80" w:type="dxa"/>
+              <w:right w:w="120" w:type="dxa"/>
+            </w:tcMar>
+          </w:tcPr>
+          <w:p>
+            <w:r>
+              <w:rPr>
+                <w:i/>
+                <w:iCs/>
+                <w:sz w:val="18"/>
+                <w:szCs w:val="18"/>
+              </w:rPr>
+              <w:t>KEGM Sınav ve Belgelendirme Yönetmeliği (RG 27482) Md.7/1 (10 yıl bekletme; vefat hariç) ve Md.7/2 (vefat/vesayette şartlı varis/vasi tahsisi).</w:t>
+            </w:r>
+          </w:p>
+        </w:tc>
+      </w:tr>
+    </w:tbl>
+    <w:tbl>
+      <w:tblPr>
+        <w:tblW w:w="9026" w:type="dxa"/>
+        <w:tblInd w:w="110" w:type="dxa"/>
+        <w:tblBorders>
+          <w:top w:val="single" w:sz="4" w:space="0" w:color="auto"/>
+          <w:left w:val="single" w:sz="4" w:space="0" w:color="auto"/>
+          <w:bottom w:val="single" w:sz="4" w:space="0" w:color="auto"/>
+          <w:right w:val="single" w:sz="4" w:space="0" w:color="auto"/>
+          <w:insideH w:val="single" w:sz="4" w:space="0" w:color="auto"/>
+          <w:insideV w:val="single" w:sz="4" w:space="0" w:color="auto"/>
+        </w:tblBorders>
+        <w:tblCellMar>
+          <w:left w:w="10" w:type="dxa"/>
+          <w:right w:w="10" w:type="dxa"/>
+        </w:tblCellMar>
+        <w:tblLook w:val="0000"/>
+      </w:tblPr>
+      <w:tblGrid>
+        <w:gridCol w:w="1400"/>
+        <w:gridCol w:w="7626"/>
+      </w:tblGrid>
+      <w:tr>
+        <w:tc>
+          <w:tcPr>
+            <w:tcW w:w="1400" w:type="dxa"/>
+            <w:tcBorders>
+              <w:top w:val="single" w:sz="1" w:space="0" w:color="2E75B6"/>
+              <w:left w:val="single" w:sz="1" w:space="0" w:color="2E75B6"/>
+              <w:bottom w:val="single" w:sz="1" w:space="0" w:color="2E75B6"/>
+              <w:right w:val="single" w:sz="1" w:space="0" w:color="2E75B6"/>
+            </w:tcBorders>
+            <w:shd w:val="clear" w:color="auto" w:fill="2E75B6"/>
+            <w:tcMar>
+              <w:top w:w="80" w:type="dxa"/>
+              <w:left w:w="120" w:type="dxa"/>
+              <w:bottom w:w="80" w:type="dxa"/>
+              <w:right w:w="120" w:type="dxa"/>
+            </w:tcMar>
+            <w:vAlign w:val="center"/>
+          </w:tcPr>
+          <w:p>
+            <w:r>
+              <w:rPr>
+                <w:b/>
+                <w:bCs/>
+                <w:color w:val="FFFFFF"/>
+                <w:sz w:val="17"/>
+                <w:szCs w:val="17"/>
+              </w:rPr>
+              <w:t>IARU / CEPT</w:t>
+            </w:r>
+          </w:p>
+        </w:tc>
+        <w:tc>
+          <w:tcPr>
+            <w:tcW w:w="7626" w:type="dxa"/>
+            <w:tcBorders>
+              <w:top w:val="single" w:sz="1" w:space="0" w:color="2E75B6"/>
+              <w:left w:val="single" w:sz="1" w:space="0" w:color="2E75B6"/>
+              <w:bottom w:val="single" w:sz="1" w:space="0" w:color="2E75B6"/>
+              <w:right w:val="single" w:sz="1" w:space="0" w:color="2E75B6"/>
+            </w:tcBorders>
+            <w:shd w:val="clear" w:color="auto" w:fill="E2EFDA"/>
+            <w:tcMar>
+              <w:top w:w="80" w:type="dxa"/>
+              <w:left w:w="160" w:type="dxa"/>
+              <w:bottom w:w="80" w:type="dxa"/>
+              <w:right w:w="120" w:type="dxa"/>
+            </w:tcMar>
+          </w:tcPr>
+          <w:p>
+            <w:r>
+              <w:rPr>
+                <w:i/>
+                <w:iCs/>
+                <w:sz w:val="18"/>
+                <w:szCs w:val="18"/>
+              </w:rPr>
+              <w:t>Uluslararası 'Silent Key' geleneği yerleşik; bazı idarelerde aileye/kulübe in-memoriam tahsis mümkün. Bağlayıcı IARU politikası yok.</w:t>
+            </w:r>
+          </w:p>
+        </w:tc>
+      </w:tr>
+    </w:tbl>
+    <w:tbl>
+      <w:tblPr>
+        <w:tblW w:w="9026" w:type="dxa"/>
+        <w:tblInd w:w="110" w:type="dxa"/>
+        <w:tblBorders>
+          <w:top w:val="single" w:sz="4" w:space="0" w:color="auto"/>
+          <w:left w:val="single" w:sz="4" w:space="0" w:color="auto"/>
+          <w:bottom w:val="single" w:sz="4" w:space="0" w:color="auto"/>
+          <w:right w:val="single" w:sz="4" w:space="0" w:color="auto"/>
+          <w:insideH w:val="single" w:sz="4" w:space="0" w:color="auto"/>
+          <w:insideV w:val="single" w:sz="4" w:space="0" w:color="auto"/>
+        </w:tblBorders>
+        <w:tblCellMar>
+          <w:left w:w="10" w:type="dxa"/>
+          <w:right w:w="10" w:type="dxa"/>
+        </w:tblCellMar>
+        <w:tblLook w:val="0000"/>
+      </w:tblPr>
+      <w:tblGrid>
+        <w:gridCol w:w="1400"/>
+        <w:gridCol w:w="7626"/>
+      </w:tblGrid>
+      <w:tr>
+        <w:tc>
+          <w:tcPr>
+            <w:tcW w:w="1400" w:type="dxa"/>
+            <w:tcBorders>
+              <w:top w:val="single" w:sz="1" w:space="0" w:color="2E75B6"/>
+              <w:left w:val="single" w:sz="1" w:space="0" w:color="2E75B6"/>
+              <w:bottom w:val="single" w:sz="1" w:space="0" w:color="2E75B6"/>
+              <w:right w:val="single" w:sz="1" w:space="0" w:color="2E75B6"/>
+            </w:tcBorders>
+            <w:shd w:val="clear" w:color="auto" w:fill="2E75B6"/>
+            <w:tcMar>
+              <w:top w:w="80" w:type="dxa"/>
+              <w:left w:w="120" w:type="dxa"/>
+              <w:bottom w:w="80" w:type="dxa"/>
+              <w:right w:w="120" w:type="dxa"/>
+            </w:tcMar>
+            <w:vAlign w:val="center"/>
+          </w:tcPr>
+          <w:p>
+            <w:r>
+              <w:rPr>
+                <w:b/>
+                <w:bCs/>
+                <w:color w:val="FFFFFF"/>
+                <w:sz w:val="17"/>
+                <w:szCs w:val="17"/>
+              </w:rPr>
+              <w:t>Diğer Ülkeler</w:t>
+            </w:r>
+          </w:p>
+        </w:tc>
+        <w:tc>
+          <w:tcPr>
+            <w:tcW w:w="7626" w:type="dxa"/>
+            <w:tcBorders>
+              <w:top w:val="single" w:sz="1" w:space="0" w:color="2E75B6"/>
+              <w:left w:val="single" w:sz="1" w:space="0" w:color="2E75B6"/>
+              <w:bottom w:val="single" w:sz="1" w:space="0" w:color="2E75B6"/>
+              <w:right w:val="single" w:sz="1" w:space="0" w:color="2E75B6"/>
+            </w:tcBorders>
+            <w:shd w:val="clear" w:color="auto" w:fill="FFFFFF"/>
+            <w:tcMar>
+              <w:top w:w="80" w:type="dxa"/>
+              <w:left w:w="160" w:type="dxa"/>
+              <w:bottom w:w="80" w:type="dxa"/>
+              <w:right w:w="120" w:type="dxa"/>
+            </w:tcMar>
+          </w:tcPr>
+          <w:p>
+            <w:r>
+              <w:rPr>
+                <w:i/>
+                <w:iCs/>
+                <w:sz w:val="18"/>
+                <w:szCs w:val="18"/>
+              </w:rPr>
+              <w:t>US (FCC): SK çağrı işareti aileye/kulübe 'vanity' ile tahsis edilebilir. DE/GB: anıt/kulüp tahsisi uygulamaları var.</w:t>
+            </w:r>
+          </w:p>
+        </w:tc>
+      </w:tr>
+    </w:tbl>
+    <w:tbl>
+      <w:tblPr>
+        <w:tblW w:w="9026" w:type="dxa"/>
+        <w:tblInd w:w="110" w:type="dxa"/>
+        <w:tblBorders>
+          <w:top w:val="single" w:sz="4" w:space="0" w:color="auto"/>
+          <w:left w:val="single" w:sz="4" w:space="0" w:color="auto"/>
+          <w:bottom w:val="single" w:sz="4" w:space="0" w:color="auto"/>
+          <w:right w:val="single" w:sz="4" w:space="0" w:color="auto"/>
+          <w:insideH w:val="single" w:sz="4" w:space="0" w:color="auto"/>
+          <w:insideV w:val="single" w:sz="4" w:space="0" w:color="auto"/>
+        </w:tblBorders>
+        <w:tblCellMar>
+          <w:left w:w="10" w:type="dxa"/>
+          <w:right w:w="10" w:type="dxa"/>
+        </w:tblCellMar>
+        <w:tblLook w:val="0000"/>
+      </w:tblPr>
+      <w:tblGrid>
+        <w:gridCol w:w="1400"/>
+        <w:gridCol w:w="7626"/>
+      </w:tblGrid>
+      <w:tr>
+        <w:tc>
+          <w:tcPr>
+            <w:tcW w:w="1400" w:type="dxa"/>
+            <w:tcBorders>
+              <w:top w:val="single" w:sz="1" w:space="0" w:color="2E75B6"/>
+              <w:left w:val="single" w:sz="1" w:space="0" w:color="2E75B6"/>
+              <w:bottom w:val="single" w:sz="1" w:space="0" w:color="2E75B6"/>
+              <w:right w:val="single" w:sz="1" w:space="0" w:color="2E75B6"/>
+            </w:tcBorders>
+            <w:shd w:val="clear" w:color="auto" w:fill="2E75B6"/>
+            <w:tcMar>
+              <w:top w:w="80" w:type="dxa"/>
+              <w:left w:w="120" w:type="dxa"/>
+              <w:bottom w:w="80" w:type="dxa"/>
+              <w:right w:w="120" w:type="dxa"/>
+            </w:tcMar>
+            <w:vAlign w:val="center"/>
+          </w:tcPr>
+          <w:p>
+            <w:r>
+              <w:rPr>
+                <w:b/>
+                <w:bCs/>
+                <w:color w:val="FFFFFF"/>
+                <w:sz w:val="17"/>
+                <w:szCs w:val="17"/>
+              </w:rPr>
+              <w:t>Öneri / Talep</w:t>
+            </w:r>
+          </w:p>
+        </w:tc>
+        <w:tc>
+          <w:tcPr>
+            <w:tcW w:w="7626" w:type="dxa"/>
+            <w:tcBorders>
+              <w:top w:val="single" w:sz="1" w:space="0" w:color="2E75B6"/>
+              <w:left w:val="single" w:sz="1" w:space="0" w:color="2E75B6"/>
+              <w:bottom w:val="single" w:sz="1" w:space="0" w:color="2E75B6"/>
+              <w:right w:val="single" w:sz="1" w:space="0" w:color="2E75B6"/>
+            </w:tcBorders>
+            <w:shd w:val="clear" w:color="auto" w:fill="FCE4D6"/>
+            <w:tcMar>
+              <w:top w:w="80" w:type="dxa"/>
+              <w:left w:w="160" w:type="dxa"/>
+              <w:bottom w:w="80" w:type="dxa"/>
+              <w:right w:w="120" w:type="dxa"/>
+            </w:tcMar>
+          </w:tcPr>
+          <w:p>
+            <w:r>
+              <w:rPr>
+                <w:i/>
+                <w:iCs/>
+                <w:sz w:val="18"/>
+                <w:szCs w:val="18"/>
+              </w:rPr>
+              <w:t>KEGM'den: (1) Md.7/2'nin belge süresi sonrası akıbetinin netleştirilmesi; (2) 'eşdeğer belge sahibi olma' şartının aile üyeleri için esnetilip esnetilemeyeceğinin değerlendirilmesi; (3) bu mekanizmanın topluluğa rehberle duyurulması; (4) kalıcı 'anıt' statüsü gibi ek seçeneklerin değerlendirilmesi.</w:t>
+            </w:r>
+          </w:p>
+        </w:tc>
+      </w:tr>
+    </w:tbl>
     <w:p>
       <w:r>
         <w:rPr>
@@ -8417,50 +10869,346 @@
         <w:t>İkamet farklı bölgeye taşınınca 3 ay içinde başvuru zorunlu; operatör ya yeni çağrı işareti alır ya da KEGM'e bildirerek mevcut işaretini '/(bölge)' ile korur (ör. TA3A/4). 3 aylık başvuru yükü, '/bölge' korumasının kalıcı ikamette süresiz kabulünün belirsizliği ve afet göçleri kuralı fiilen işlemez kılmaktadır.</w:t>
       </w:r>
     </w:p>
-    <w:p>
-      <w:r>
-        <w:rPr>
-          <w:b/>
-        </w:rPr>
-        <w:t xml:space="preserve">TR Mevzuatı: </w:t>
-      </w:r>
-      <w:r>
-        <w:t>KEGM Sınav ve Belgelendirme Yönetmeliği (RG 27482): bölge değişiminde 3 ay içinde başvuru; mevcut çağrı işareti '/(bölge)' eklenerek korunabilir — tam farklı işarete geçiş zorunlu değildir.</w:t>
-      </w:r>
-    </w:p>
-    <w:p>
-      <w:r>
-        <w:rPr>
-          <w:b/>
-        </w:rPr>
-        <w:t xml:space="preserve">IARU / CEPT: </w:t>
-      </w:r>
-      <w:r>
-        <w:t>Çoğu idarede çağrı işareti ülke genelinde taşınabilir; bölge tabanlı zorunlu güncelleme yaygın değil.</w:t>
-      </w:r>
-    </w:p>
-    <w:p>
-      <w:r>
-        <w:rPr>
-          <w:b/>
-        </w:rPr>
-        <w:t xml:space="preserve">Diğer Ülkeler: </w:t>
-      </w:r>
-      <w:r>
-        <w:t>US/DE/GB: taşınmada çağrı işareti değişmez, ülke genelinde taşınabilir.</w:t>
-      </w:r>
-    </w:p>
-    <w:p>
-      <w:r>
-        <w:rPr>
-          <w:b/>
-        </w:rPr>
-        <w:t xml:space="preserve">Öneri / Talep: </w:t>
-      </w:r>
-      <w:r>
-        <w:t>KEGM'den '/bölge' ile kalıcı korumanın süresiz kabulü, 3 ay başvuru yükünün hafifletilmesi, afet göçünde muafiyet ve çağrı işaretinin ülke genelinde taşınabilir kılınması.</w:t>
-      </w:r>
-    </w:p>
+    <w:tbl>
+      <w:tblPr>
+        <w:tblW w:w="9026" w:type="dxa"/>
+        <w:tblInd w:w="110" w:type="dxa"/>
+        <w:tblBorders>
+          <w:top w:val="single" w:sz="4" w:space="0" w:color="auto"/>
+          <w:left w:val="single" w:sz="4" w:space="0" w:color="auto"/>
+          <w:bottom w:val="single" w:sz="4" w:space="0" w:color="auto"/>
+          <w:right w:val="single" w:sz="4" w:space="0" w:color="auto"/>
+          <w:insideH w:val="single" w:sz="4" w:space="0" w:color="auto"/>
+          <w:insideV w:val="single" w:sz="4" w:space="0" w:color="auto"/>
+        </w:tblBorders>
+        <w:tblCellMar>
+          <w:left w:w="10" w:type="dxa"/>
+          <w:right w:w="10" w:type="dxa"/>
+        </w:tblCellMar>
+        <w:tblLook w:val="0000"/>
+      </w:tblPr>
+      <w:tblGrid>
+        <w:gridCol w:w="1400"/>
+        <w:gridCol w:w="7626"/>
+      </w:tblGrid>
+      <w:tr>
+        <w:tc>
+          <w:tcPr>
+            <w:tcW w:w="1400" w:type="dxa"/>
+            <w:tcBorders>
+              <w:top w:val="single" w:sz="1" w:space="0" w:color="2E75B6"/>
+              <w:left w:val="single" w:sz="1" w:space="0" w:color="2E75B6"/>
+              <w:bottom w:val="single" w:sz="1" w:space="0" w:color="2E75B6"/>
+              <w:right w:val="single" w:sz="1" w:space="0" w:color="2E75B6"/>
+            </w:tcBorders>
+            <w:shd w:val="clear" w:color="auto" w:fill="2E75B6"/>
+            <w:tcMar>
+              <w:top w:w="80" w:type="dxa"/>
+              <w:left w:w="120" w:type="dxa"/>
+              <w:bottom w:w="80" w:type="dxa"/>
+              <w:right w:w="120" w:type="dxa"/>
+            </w:tcMar>
+            <w:vAlign w:val="center"/>
+          </w:tcPr>
+          <w:p>
+            <w:r>
+              <w:rPr>
+                <w:b/>
+                <w:bCs/>
+                <w:color w:val="FFFFFF"/>
+                <w:sz w:val="17"/>
+                <w:szCs w:val="17"/>
+              </w:rPr>
+              <w:t>TR Mevzuatı</w:t>
+            </w:r>
+          </w:p>
+        </w:tc>
+        <w:tc>
+          <w:tcPr>
+            <w:tcW w:w="7626" w:type="dxa"/>
+            <w:tcBorders>
+              <w:top w:val="single" w:sz="1" w:space="0" w:color="2E75B6"/>
+              <w:left w:val="single" w:sz="1" w:space="0" w:color="2E75B6"/>
+              <w:bottom w:val="single" w:sz="1" w:space="0" w:color="2E75B6"/>
+              <w:right w:val="single" w:sz="1" w:space="0" w:color="2E75B6"/>
+            </w:tcBorders>
+            <w:shd w:val="clear" w:color="auto" w:fill="D6E4F0"/>
+            <w:tcMar>
+              <w:top w:w="80" w:type="dxa"/>
+              <w:left w:w="160" w:type="dxa"/>
+              <w:bottom w:w="80" w:type="dxa"/>
+              <w:right w:w="120" w:type="dxa"/>
+            </w:tcMar>
+          </w:tcPr>
+          <w:p>
+            <w:r>
+              <w:rPr>
+                <w:i/>
+                <w:iCs/>
+                <w:sz w:val="18"/>
+                <w:szCs w:val="18"/>
+              </w:rPr>
+              <w:t>KEGM Sınav ve Belgelendirme Yönetmeliği (RG 27482): bölge değişiminde 3 ay içinde başvuru; mevcut çağrı işareti '/(bölge)' eklenerek korunabilir — tam farklı işarete geçiş zorunlu değildir.</w:t>
+            </w:r>
+          </w:p>
+        </w:tc>
+      </w:tr>
+    </w:tbl>
+    <w:tbl>
+      <w:tblPr>
+        <w:tblW w:w="9026" w:type="dxa"/>
+        <w:tblInd w:w="110" w:type="dxa"/>
+        <w:tblBorders>
+          <w:top w:val="single" w:sz="4" w:space="0" w:color="auto"/>
+          <w:left w:val="single" w:sz="4" w:space="0" w:color="auto"/>
+          <w:bottom w:val="single" w:sz="4" w:space="0" w:color="auto"/>
+          <w:right w:val="single" w:sz="4" w:space="0" w:color="auto"/>
+          <w:insideH w:val="single" w:sz="4" w:space="0" w:color="auto"/>
+          <w:insideV w:val="single" w:sz="4" w:space="0" w:color="auto"/>
+        </w:tblBorders>
+        <w:tblCellMar>
+          <w:left w:w="10" w:type="dxa"/>
+          <w:right w:w="10" w:type="dxa"/>
+        </w:tblCellMar>
+        <w:tblLook w:val="0000"/>
+      </w:tblPr>
+      <w:tblGrid>
+        <w:gridCol w:w="1400"/>
+        <w:gridCol w:w="7626"/>
+      </w:tblGrid>
+      <w:tr>
+        <w:tc>
+          <w:tcPr>
+            <w:tcW w:w="1400" w:type="dxa"/>
+            <w:tcBorders>
+              <w:top w:val="single" w:sz="1" w:space="0" w:color="2E75B6"/>
+              <w:left w:val="single" w:sz="1" w:space="0" w:color="2E75B6"/>
+              <w:bottom w:val="single" w:sz="1" w:space="0" w:color="2E75B6"/>
+              <w:right w:val="single" w:sz="1" w:space="0" w:color="2E75B6"/>
+            </w:tcBorders>
+            <w:shd w:val="clear" w:color="auto" w:fill="2E75B6"/>
+            <w:tcMar>
+              <w:top w:w="80" w:type="dxa"/>
+              <w:left w:w="120" w:type="dxa"/>
+              <w:bottom w:w="80" w:type="dxa"/>
+              <w:right w:w="120" w:type="dxa"/>
+            </w:tcMar>
+            <w:vAlign w:val="center"/>
+          </w:tcPr>
+          <w:p>
+            <w:r>
+              <w:rPr>
+                <w:b/>
+                <w:bCs/>
+                <w:color w:val="FFFFFF"/>
+                <w:sz w:val="17"/>
+                <w:szCs w:val="17"/>
+              </w:rPr>
+              <w:t>IARU / CEPT</w:t>
+            </w:r>
+          </w:p>
+        </w:tc>
+        <w:tc>
+          <w:tcPr>
+            <w:tcW w:w="7626" w:type="dxa"/>
+            <w:tcBorders>
+              <w:top w:val="single" w:sz="1" w:space="0" w:color="2E75B6"/>
+              <w:left w:val="single" w:sz="1" w:space="0" w:color="2E75B6"/>
+              <w:bottom w:val="single" w:sz="1" w:space="0" w:color="2E75B6"/>
+              <w:right w:val="single" w:sz="1" w:space="0" w:color="2E75B6"/>
+            </w:tcBorders>
+            <w:shd w:val="clear" w:color="auto" w:fill="E2EFDA"/>
+            <w:tcMar>
+              <w:top w:w="80" w:type="dxa"/>
+              <w:left w:w="160" w:type="dxa"/>
+              <w:bottom w:w="80" w:type="dxa"/>
+              <w:right w:w="120" w:type="dxa"/>
+            </w:tcMar>
+          </w:tcPr>
+          <w:p>
+            <w:r>
+              <w:rPr>
+                <w:i/>
+                <w:iCs/>
+                <w:sz w:val="18"/>
+                <w:szCs w:val="18"/>
+              </w:rPr>
+              <w:t>Çoğu idarede çağrı işareti ülke genelinde taşınabilir; bölge tabanlı zorunlu güncelleme yaygın değil.</w:t>
+            </w:r>
+          </w:p>
+        </w:tc>
+      </w:tr>
+    </w:tbl>
+    <w:tbl>
+      <w:tblPr>
+        <w:tblW w:w="9026" w:type="dxa"/>
+        <w:tblInd w:w="110" w:type="dxa"/>
+        <w:tblBorders>
+          <w:top w:val="single" w:sz="4" w:space="0" w:color="auto"/>
+          <w:left w:val="single" w:sz="4" w:space="0" w:color="auto"/>
+          <w:bottom w:val="single" w:sz="4" w:space="0" w:color="auto"/>
+          <w:right w:val="single" w:sz="4" w:space="0" w:color="auto"/>
+          <w:insideH w:val="single" w:sz="4" w:space="0" w:color="auto"/>
+          <w:insideV w:val="single" w:sz="4" w:space="0" w:color="auto"/>
+        </w:tblBorders>
+        <w:tblCellMar>
+          <w:left w:w="10" w:type="dxa"/>
+          <w:right w:w="10" w:type="dxa"/>
+        </w:tblCellMar>
+        <w:tblLook w:val="0000"/>
+      </w:tblPr>
+      <w:tblGrid>
+        <w:gridCol w:w="1400"/>
+        <w:gridCol w:w="7626"/>
+      </w:tblGrid>
+      <w:tr>
+        <w:tc>
+          <w:tcPr>
+            <w:tcW w:w="1400" w:type="dxa"/>
+            <w:tcBorders>
+              <w:top w:val="single" w:sz="1" w:space="0" w:color="2E75B6"/>
+              <w:left w:val="single" w:sz="1" w:space="0" w:color="2E75B6"/>
+              <w:bottom w:val="single" w:sz="1" w:space="0" w:color="2E75B6"/>
+              <w:right w:val="single" w:sz="1" w:space="0" w:color="2E75B6"/>
+            </w:tcBorders>
+            <w:shd w:val="clear" w:color="auto" w:fill="2E75B6"/>
+            <w:tcMar>
+              <w:top w:w="80" w:type="dxa"/>
+              <w:left w:w="120" w:type="dxa"/>
+              <w:bottom w:w="80" w:type="dxa"/>
+              <w:right w:w="120" w:type="dxa"/>
+            </w:tcMar>
+            <w:vAlign w:val="center"/>
+          </w:tcPr>
+          <w:p>
+            <w:r>
+              <w:rPr>
+                <w:b/>
+                <w:bCs/>
+                <w:color w:val="FFFFFF"/>
+                <w:sz w:val="17"/>
+                <w:szCs w:val="17"/>
+              </w:rPr>
+              <w:t>Diğer Ülkeler</w:t>
+            </w:r>
+          </w:p>
+        </w:tc>
+        <w:tc>
+          <w:tcPr>
+            <w:tcW w:w="7626" w:type="dxa"/>
+            <w:tcBorders>
+              <w:top w:val="single" w:sz="1" w:space="0" w:color="2E75B6"/>
+              <w:left w:val="single" w:sz="1" w:space="0" w:color="2E75B6"/>
+              <w:bottom w:val="single" w:sz="1" w:space="0" w:color="2E75B6"/>
+              <w:right w:val="single" w:sz="1" w:space="0" w:color="2E75B6"/>
+            </w:tcBorders>
+            <w:shd w:val="clear" w:color="auto" w:fill="FFFFFF"/>
+            <w:tcMar>
+              <w:top w:w="80" w:type="dxa"/>
+              <w:left w:w="160" w:type="dxa"/>
+              <w:bottom w:w="80" w:type="dxa"/>
+              <w:right w:w="120" w:type="dxa"/>
+            </w:tcMar>
+          </w:tcPr>
+          <w:p>
+            <w:r>
+              <w:rPr>
+                <w:i/>
+                <w:iCs/>
+                <w:sz w:val="18"/>
+                <w:szCs w:val="18"/>
+              </w:rPr>
+              <w:t>US/DE/GB: taşınmada çağrı işareti değişmez, ülke genelinde taşınabilir.</w:t>
+            </w:r>
+          </w:p>
+        </w:tc>
+      </w:tr>
+    </w:tbl>
+    <w:tbl>
+      <w:tblPr>
+        <w:tblW w:w="9026" w:type="dxa"/>
+        <w:tblInd w:w="110" w:type="dxa"/>
+        <w:tblBorders>
+          <w:top w:val="single" w:sz="4" w:space="0" w:color="auto"/>
+          <w:left w:val="single" w:sz="4" w:space="0" w:color="auto"/>
+          <w:bottom w:val="single" w:sz="4" w:space="0" w:color="auto"/>
+          <w:right w:val="single" w:sz="4" w:space="0" w:color="auto"/>
+          <w:insideH w:val="single" w:sz="4" w:space="0" w:color="auto"/>
+          <w:insideV w:val="single" w:sz="4" w:space="0" w:color="auto"/>
+        </w:tblBorders>
+        <w:tblCellMar>
+          <w:left w:w="10" w:type="dxa"/>
+          <w:right w:w="10" w:type="dxa"/>
+        </w:tblCellMar>
+        <w:tblLook w:val="0000"/>
+      </w:tblPr>
+      <w:tblGrid>
+        <w:gridCol w:w="1400"/>
+        <w:gridCol w:w="7626"/>
+      </w:tblGrid>
+      <w:tr>
+        <w:tc>
+          <w:tcPr>
+            <w:tcW w:w="1400" w:type="dxa"/>
+            <w:tcBorders>
+              <w:top w:val="single" w:sz="1" w:space="0" w:color="2E75B6"/>
+              <w:left w:val="single" w:sz="1" w:space="0" w:color="2E75B6"/>
+              <w:bottom w:val="single" w:sz="1" w:space="0" w:color="2E75B6"/>
+              <w:right w:val="single" w:sz="1" w:space="0" w:color="2E75B6"/>
+            </w:tcBorders>
+            <w:shd w:val="clear" w:color="auto" w:fill="2E75B6"/>
+            <w:tcMar>
+              <w:top w:w="80" w:type="dxa"/>
+              <w:left w:w="120" w:type="dxa"/>
+              <w:bottom w:w="80" w:type="dxa"/>
+              <w:right w:w="120" w:type="dxa"/>
+            </w:tcMar>
+            <w:vAlign w:val="center"/>
+          </w:tcPr>
+          <w:p>
+            <w:r>
+              <w:rPr>
+                <w:b/>
+                <w:bCs/>
+                <w:color w:val="FFFFFF"/>
+                <w:sz w:val="17"/>
+                <w:szCs w:val="17"/>
+              </w:rPr>
+              <w:t>Öneri / Talep</w:t>
+            </w:r>
+          </w:p>
+        </w:tc>
+        <w:tc>
+          <w:tcPr>
+            <w:tcW w:w="7626" w:type="dxa"/>
+            <w:tcBorders>
+              <w:top w:val="single" w:sz="1" w:space="0" w:color="2E75B6"/>
+              <w:left w:val="single" w:sz="1" w:space="0" w:color="2E75B6"/>
+              <w:bottom w:val="single" w:sz="1" w:space="0" w:color="2E75B6"/>
+              <w:right w:val="single" w:sz="1" w:space="0" w:color="2E75B6"/>
+            </w:tcBorders>
+            <w:shd w:val="clear" w:color="auto" w:fill="FCE4D6"/>
+            <w:tcMar>
+              <w:top w:w="80" w:type="dxa"/>
+              <w:left w:w="160" w:type="dxa"/>
+              <w:bottom w:w="80" w:type="dxa"/>
+              <w:right w:w="120" w:type="dxa"/>
+            </w:tcMar>
+          </w:tcPr>
+          <w:p>
+            <w:r>
+              <w:rPr>
+                <w:i/>
+                <w:iCs/>
+                <w:sz w:val="18"/>
+                <w:szCs w:val="18"/>
+              </w:rPr>
+              <w:t>KEGM'den '/bölge' ile kalıcı korumanın süresiz kabulü, 3 ay başvuru yükünün hafifletilmesi, afet göçünde muafiyet ve çağrı işaretinin ülke genelinde taşınabilir kılınması.</w:t>
+            </w:r>
+          </w:p>
+        </w:tc>
+      </w:tr>
+    </w:tbl>
     <w:p>
       <w:r>
         <w:rPr>
@@ -8483,54 +11231,355 @@
         <w:t xml:space="preserve"> Amatör bantlarda verici olarak çalışan el telsizleri, e-ticaret platformlarında amatör telsizcilik belgesi sorulmaksızın satılmaktadır. TTTE Yönetmeliği (2014/53/AB RED uyumu) rejiminde piyasaya arz üretici/ithalatçı uygunluk beyanına dayanır; ön tip onayı yoktur ve denetim piyasa gözetimiyle yapılır. Bu rejimde istenmeyen (spurious) emisyon limitlerini karşılamayan düşük maliyetli cihazlar piyasada dolaşmaktadır: ARRL laboratuvar testlerinde bu sınıftaki cihazların yalnızca yaklaşık %5-9'u limitleri karşılamıştır. BTK, Aralık 2019'da aralarında Baofeng UV-5R'ın da bulunduğu cihazları güvensiz ilan ederek satış yasağı ve toplatma kararı vermiştir; buna rağmen benzer cihazların satışı sürmektedir. Ayrıca cihaz devrinde basit bir bildirim usulü bulunmadığından el değiştiren cihazların izlenebilirliği zayıftır; SDR kartlarında (ör. ADALM-Pluto) çift kullanım (dual-use) ve son kullanıcı taahhüdü (EUC) koşulları belirsizdir.</w:t>
       </w:r>
     </w:p>
+    <w:tbl>
+      <w:tblPr>
+        <w:tblW w:w="9026" w:type="dxa"/>
+        <w:tblInd w:w="110" w:type="dxa"/>
+        <w:tblBorders>
+          <w:top w:val="single" w:sz="4" w:space="0" w:color="auto"/>
+          <w:left w:val="single" w:sz="4" w:space="0" w:color="auto"/>
+          <w:bottom w:val="single" w:sz="4" w:space="0" w:color="auto"/>
+          <w:right w:val="single" w:sz="4" w:space="0" w:color="auto"/>
+          <w:insideH w:val="single" w:sz="4" w:space="0" w:color="auto"/>
+          <w:insideV w:val="single" w:sz="4" w:space="0" w:color="auto"/>
+        </w:tblBorders>
+        <w:tblCellMar>
+          <w:left w:w="10" w:type="dxa"/>
+          <w:right w:w="10" w:type="dxa"/>
+        </w:tblCellMar>
+        <w:tblLook w:val="0000"/>
+      </w:tblPr>
+      <w:tblGrid>
+        <w:gridCol w:w="1400"/>
+        <w:gridCol w:w="7626"/>
+      </w:tblGrid>
+      <w:tr>
+        <w:tc>
+          <w:tcPr>
+            <w:tcW w:w="1400" w:type="dxa"/>
+            <w:tcBorders>
+              <w:top w:val="single" w:sz="1" w:space="0" w:color="2E75B6"/>
+              <w:left w:val="single" w:sz="1" w:space="0" w:color="2E75B6"/>
+              <w:bottom w:val="single" w:sz="1" w:space="0" w:color="2E75B6"/>
+              <w:right w:val="single" w:sz="1" w:space="0" w:color="2E75B6"/>
+            </w:tcBorders>
+            <w:shd w:val="clear" w:color="auto" w:fill="2E75B6"/>
+            <w:tcMar>
+              <w:top w:w="80" w:type="dxa"/>
+              <w:left w:w="120" w:type="dxa"/>
+              <w:bottom w:w="80" w:type="dxa"/>
+              <w:right w:w="120" w:type="dxa"/>
+            </w:tcMar>
+            <w:vAlign w:val="center"/>
+          </w:tcPr>
+          <w:p>
+            <w:r>
+              <w:rPr>
+                <w:b/>
+                <w:bCs/>
+                <w:color w:val="FFFFFF"/>
+                <w:sz w:val="17"/>
+                <w:szCs w:val="17"/>
+              </w:rPr>
+              <w:t>TR Mevzuatı</w:t>
+            </w:r>
+          </w:p>
+        </w:tc>
+        <w:tc>
+          <w:tcPr>
+            <w:tcW w:w="7626" w:type="dxa"/>
+            <w:tcBorders>
+              <w:top w:val="single" w:sz="1" w:space="0" w:color="2E75B6"/>
+              <w:left w:val="single" w:sz="1" w:space="0" w:color="2E75B6"/>
+              <w:bottom w:val="single" w:sz="1" w:space="0" w:color="2E75B6"/>
+              <w:right w:val="single" w:sz="1" w:space="0" w:color="2E75B6"/>
+            </w:tcBorders>
+            <w:shd w:val="clear" w:color="auto" w:fill="D6E4F0"/>
+            <w:tcMar>
+              <w:top w:w="80" w:type="dxa"/>
+              <w:left w:w="160" w:type="dxa"/>
+              <w:bottom w:w="80" w:type="dxa"/>
+              <w:right w:w="120" w:type="dxa"/>
+            </w:tcMar>
+          </w:tcPr>
+          <w:p>
+            <w:r>
+              <w:rPr>
+                <w:i/>
+                <w:iCs/>
+                <w:sz w:val="18"/>
+                <w:szCs w:val="18"/>
+              </w:rPr>
+              <w:t>TTTE Yönetmeliği (RED 2014/53/AB uyumu): uygunluk beyanı + CE işareti; BTK piyasa gözetimi ve denetimi (Aralık 2019 güvensiz cihaz kararı); Telsiz Yönetmeliği Md.2/4: muafiyet 'ilgili teknik düzenlemelere uygunluk' şartına bağlı; 5809 EHK Md.37/3: 'Kurumca onaylı cihaz' ifadesi (belirsizliği Envanter'de not edilmiştir).</w:t>
+            </w:r>
+          </w:p>
+        </w:tc>
+      </w:tr>
+    </w:tbl>
+    <w:tbl>
+      <w:tblPr>
+        <w:tblW w:w="9026" w:type="dxa"/>
+        <w:tblInd w:w="110" w:type="dxa"/>
+        <w:tblBorders>
+          <w:top w:val="single" w:sz="4" w:space="0" w:color="auto"/>
+          <w:left w:val="single" w:sz="4" w:space="0" w:color="auto"/>
+          <w:bottom w:val="single" w:sz="4" w:space="0" w:color="auto"/>
+          <w:right w:val="single" w:sz="4" w:space="0" w:color="auto"/>
+          <w:insideH w:val="single" w:sz="4" w:space="0" w:color="auto"/>
+          <w:insideV w:val="single" w:sz="4" w:space="0" w:color="auto"/>
+        </w:tblBorders>
+        <w:tblCellMar>
+          <w:left w:w="10" w:type="dxa"/>
+          <w:right w:w="10" w:type="dxa"/>
+        </w:tblCellMar>
+        <w:tblLook w:val="0000"/>
+      </w:tblPr>
+      <w:tblGrid>
+        <w:gridCol w:w="1400"/>
+        <w:gridCol w:w="7626"/>
+      </w:tblGrid>
+      <w:tr>
+        <w:tc>
+          <w:tcPr>
+            <w:tcW w:w="1400" w:type="dxa"/>
+            <w:tcBorders>
+              <w:top w:val="single" w:sz="1" w:space="0" w:color="2E75B6"/>
+              <w:left w:val="single" w:sz="1" w:space="0" w:color="2E75B6"/>
+              <w:bottom w:val="single" w:sz="1" w:space="0" w:color="2E75B6"/>
+              <w:right w:val="single" w:sz="1" w:space="0" w:color="2E75B6"/>
+            </w:tcBorders>
+            <w:shd w:val="clear" w:color="auto" w:fill="2E75B6"/>
+            <w:tcMar>
+              <w:top w:w="80" w:type="dxa"/>
+              <w:left w:w="120" w:type="dxa"/>
+              <w:bottom w:w="80" w:type="dxa"/>
+              <w:right w:w="120" w:type="dxa"/>
+            </w:tcMar>
+            <w:vAlign w:val="center"/>
+          </w:tcPr>
+          <w:p>
+            <w:r>
+              <w:rPr>
+                <w:b/>
+                <w:bCs/>
+                <w:color w:val="FFFFFF"/>
+                <w:sz w:val="17"/>
+                <w:szCs w:val="17"/>
+              </w:rPr>
+              <w:t>IARU / CEPT / Karşılaştırma</w:t>
+            </w:r>
+          </w:p>
+        </w:tc>
+        <w:tc>
+          <w:tcPr>
+            <w:tcW w:w="7626" w:type="dxa"/>
+            <w:tcBorders>
+              <w:top w:val="single" w:sz="1" w:space="0" w:color="2E75B6"/>
+              <w:left w:val="single" w:sz="1" w:space="0" w:color="2E75B6"/>
+              <w:bottom w:val="single" w:sz="1" w:space="0" w:color="2E75B6"/>
+              <w:right w:val="single" w:sz="1" w:space="0" w:color="2E75B6"/>
+            </w:tcBorders>
+            <w:shd w:val="clear" w:color="auto" w:fill="E2EFDA"/>
+            <w:tcMar>
+              <w:top w:w="80" w:type="dxa"/>
+              <w:left w:w="160" w:type="dxa"/>
+              <w:bottom w:w="80" w:type="dxa"/>
+              <w:right w:w="120" w:type="dxa"/>
+            </w:tcMar>
+          </w:tcPr>
+          <w:p>
+            <w:r>
+              <w:rPr>
+                <w:i/>
+                <w:iCs/>
+                <w:sz w:val="18"/>
+                <w:szCs w:val="18"/>
+              </w:rPr>
+              <w:t>ETSI EN 300 086 vb. standartlarda istenmeyen emisyon limitleri; US karşılaştırması: FCC Part 97 -40 dBc (Part 90'ın -20 dBc limitinden 100 kat sıkı); FCC 2018 uygulama duyurusu sertifikasız cihaz satışına yöneliktir.</w:t>
+            </w:r>
+          </w:p>
+        </w:tc>
+      </w:tr>
+    </w:tbl>
+    <w:tbl>
+      <w:tblPr>
+        <w:tblW w:w="9026" w:type="dxa"/>
+        <w:tblInd w:w="110" w:type="dxa"/>
+        <w:tblBorders>
+          <w:top w:val="single" w:sz="4" w:space="0" w:color="auto"/>
+          <w:left w:val="single" w:sz="4" w:space="0" w:color="auto"/>
+          <w:bottom w:val="single" w:sz="4" w:space="0" w:color="auto"/>
+          <w:right w:val="single" w:sz="4" w:space="0" w:color="auto"/>
+          <w:insideH w:val="single" w:sz="4" w:space="0" w:color="auto"/>
+          <w:insideV w:val="single" w:sz="4" w:space="0" w:color="auto"/>
+        </w:tblBorders>
+        <w:tblCellMar>
+          <w:left w:w="10" w:type="dxa"/>
+          <w:right w:w="10" w:type="dxa"/>
+        </w:tblCellMar>
+        <w:tblLook w:val="0000"/>
+      </w:tblPr>
+      <w:tblGrid>
+        <w:gridCol w:w="1400"/>
+        <w:gridCol w:w="7626"/>
+      </w:tblGrid>
+      <w:tr>
+        <w:tc>
+          <w:tcPr>
+            <w:tcW w:w="1400" w:type="dxa"/>
+            <w:tcBorders>
+              <w:top w:val="single" w:sz="1" w:space="0" w:color="2E75B6"/>
+              <w:left w:val="single" w:sz="1" w:space="0" w:color="2E75B6"/>
+              <w:bottom w:val="single" w:sz="1" w:space="0" w:color="2E75B6"/>
+              <w:right w:val="single" w:sz="1" w:space="0" w:color="2E75B6"/>
+            </w:tcBorders>
+            <w:shd w:val="clear" w:color="auto" w:fill="2E75B6"/>
+            <w:tcMar>
+              <w:top w:w="80" w:type="dxa"/>
+              <w:left w:w="120" w:type="dxa"/>
+              <w:bottom w:w="80" w:type="dxa"/>
+              <w:right w:w="120" w:type="dxa"/>
+            </w:tcMar>
+            <w:vAlign w:val="center"/>
+          </w:tcPr>
+          <w:p>
+            <w:r>
+              <w:rPr>
+                <w:b/>
+                <w:bCs/>
+                <w:color w:val="FFFFFF"/>
+                <w:sz w:val="17"/>
+                <w:szCs w:val="17"/>
+              </w:rPr>
+              <w:t>Öneri / Talep</w:t>
+            </w:r>
+          </w:p>
+        </w:tc>
+        <w:tc>
+          <w:tcPr>
+            <w:tcW w:w="7626" w:type="dxa"/>
+            <w:tcBorders>
+              <w:top w:val="single" w:sz="1" w:space="0" w:color="2E75B6"/>
+              <w:left w:val="single" w:sz="1" w:space="0" w:color="2E75B6"/>
+              <w:bottom w:val="single" w:sz="1" w:space="0" w:color="2E75B6"/>
+              <w:right w:val="single" w:sz="1" w:space="0" w:color="2E75B6"/>
+            </w:tcBorders>
+            <w:shd w:val="clear" w:color="auto" w:fill="FCE4D6"/>
+            <w:tcMar>
+              <w:top w:w="80" w:type="dxa"/>
+              <w:left w:w="160" w:type="dxa"/>
+              <w:bottom w:w="80" w:type="dxa"/>
+              <w:right w:w="120" w:type="dxa"/>
+            </w:tcMar>
+          </w:tcPr>
+          <w:p>
+            <w:r>
+              <w:rPr>
+                <w:i/>
+                <w:iCs/>
+                <w:sz w:val="18"/>
+                <w:szCs w:val="18"/>
+              </w:rPr>
+              <w:t>BTK + Ticaret Bakanlığı'ndan Talep: (1) Amatör bantlarda çalışan verici cihazların e-ticaret satışında belge kontrolü; (2) spurious emisyon denetimlerinin sıklaştırılması ve güvensiz ürün listelerinin güncel tutulması; (3) ikinci el cihaz devrinde basit bildirim usulü; (4) SDR kartlarının eğitim/hobi statüsü ile dual-use koşullarının rehberle açıklanması.</w:t>
+            </w:r>
+          </w:p>
+        </w:tc>
+      </w:tr>
+    </w:tbl>
+    <w:tbl>
+      <w:tblPr>
+        <w:tblW w:w="9026" w:type="dxa"/>
+        <w:tblInd w:w="110" w:type="dxa"/>
+        <w:tblBorders>
+          <w:top w:val="single" w:sz="4" w:space="0" w:color="auto"/>
+          <w:left w:val="single" w:sz="4" w:space="0" w:color="auto"/>
+          <w:bottom w:val="single" w:sz="4" w:space="0" w:color="auto"/>
+          <w:right w:val="single" w:sz="4" w:space="0" w:color="auto"/>
+          <w:insideH w:val="single" w:sz="4" w:space="0" w:color="auto"/>
+          <w:insideV w:val="single" w:sz="4" w:space="0" w:color="auto"/>
+        </w:tblBorders>
+        <w:tblCellMar>
+          <w:left w:w="10" w:type="dxa"/>
+          <w:right w:w="10" w:type="dxa"/>
+        </w:tblCellMar>
+        <w:tblLook w:val="0000"/>
+      </w:tblPr>
+      <w:tblGrid>
+        <w:gridCol w:w="1400"/>
+        <w:gridCol w:w="7626"/>
+      </w:tblGrid>
+      <w:tr>
+        <w:tc>
+          <w:tcPr>
+            <w:tcW w:w="1400" w:type="dxa"/>
+            <w:tcBorders>
+              <w:top w:val="single" w:sz="1" w:space="0" w:color="2E75B6"/>
+              <w:left w:val="single" w:sz="1" w:space="0" w:color="2E75B6"/>
+              <w:bottom w:val="single" w:sz="1" w:space="0" w:color="2E75B6"/>
+              <w:right w:val="single" w:sz="1" w:space="0" w:color="2E75B6"/>
+            </w:tcBorders>
+            <w:shd w:val="clear" w:color="auto" w:fill="2E75B6"/>
+            <w:tcMar>
+              <w:top w:w="80" w:type="dxa"/>
+              <w:left w:w="120" w:type="dxa"/>
+              <w:bottom w:w="80" w:type="dxa"/>
+              <w:right w:w="120" w:type="dxa"/>
+            </w:tcMar>
+            <w:vAlign w:val="center"/>
+          </w:tcPr>
+          <w:p>
+            <w:r>
+              <w:rPr>
+                <w:b/>
+                <w:bCs/>
+                <w:color w:val="FFFFFF"/>
+                <w:sz w:val="17"/>
+                <w:szCs w:val="17"/>
+              </w:rPr>
+              <w:t>Strateji Notu</w:t>
+            </w:r>
+          </w:p>
+        </w:tc>
+        <w:tc>
+          <w:tcPr>
+            <w:tcW w:w="7626" w:type="dxa"/>
+            <w:tcBorders>
+              <w:top w:val="single" w:sz="1" w:space="0" w:color="2E75B6"/>
+              <w:left w:val="single" w:sz="1" w:space="0" w:color="2E75B6"/>
+              <w:bottom w:val="single" w:sz="1" w:space="0" w:color="2E75B6"/>
+              <w:right w:val="single" w:sz="1" w:space="0" w:color="2E75B6"/>
+            </w:tcBorders>
+            <w:shd w:val="clear" w:color="auto" w:fill="FFF2CC"/>
+            <w:tcMar>
+              <w:top w:w="80" w:type="dxa"/>
+              <w:left w:w="160" w:type="dxa"/>
+              <w:bottom w:w="80" w:type="dxa"/>
+              <w:right w:w="120" w:type="dxa"/>
+            </w:tcMar>
+          </w:tcPr>
+          <w:p>
+            <w:r>
+              <w:rPr>
+                <w:i/>
+                <w:iCs/>
+                <w:sz w:val="18"/>
+                <w:szCs w:val="18"/>
+              </w:rPr>
+              <w:t>Bu başlık, 'amatörler tehlike üretiyor' söylemini 'denetimsiz piyasa tehlike üretiyor; belgeli amatör çözüm ortağıdır' çerçevesine taşır. Toplu yasak kaygısına karşı ana savunma hattıdır.</w:t>
+            </w:r>
+          </w:p>
+        </w:tc>
+      </w:tr>
+    </w:tbl>
     <w:p>
       <w:r>
         <w:rPr>
           <w:b/>
         </w:rPr>
-        <w:t>TR Mevzuatı:</w:t>
-      </w:r>
-      <w:r>
-        <w:t xml:space="preserve"> TTTE Yönetmeliği (RED 2014/53/AB uyumu): uygunluk beyanı + CE işareti; BTK piyasa gözetimi ve denetimi (Aralık 2019 güvensiz cihaz kararı); Telsiz Yönetmeliği Md.2/4: muafiyet 'ilgili teknik düzenlemelere uygunluk' şartına bağlı; 5809 EHK Md.37/3: 'Kurumca onaylı cihaz' ifadesi (belirsizliği Envanter'de not edilmiştir).</w:t>
-      </w:r>
-    </w:p>
-    <w:p>
-      <w:r>
-        <w:rPr>
-          <w:b/>
-        </w:rPr>
-        <w:t>IARU / CEPT / Karşılaştırma:</w:t>
-      </w:r>
-      <w:r>
-        <w:t xml:space="preserve"> ETSI EN 300 086 vb. standartlarda istenmeyen emisyon limitleri; US karşılaştırması: FCC Part 97 -40 dBc (Part 90'ın -20 dBc limitinden 100 kat sıkı); FCC 2018 uygulama duyurusu sertifikasız cihaz satışına yöneliktir.</w:t>
-      </w:r>
-    </w:p>
-    <w:p>
-      <w:r>
-        <w:rPr>
-          <w:b/>
-        </w:rPr>
-        <w:lastRenderedPageBreak/>
-        <w:t>Öneri / Talep:</w:t>
-      </w:r>
-      <w:r>
-        <w:t xml:space="preserve"> BTK + Ticaret Bakanlığı'ndan Talep: (1) Amatör bantlarda çalışan verici cihazların e-ticaret satışında belge kontrolü; (2) spurious emisyon denetimlerinin sıklaştırılması ve güvensiz ürün listelerinin güncel tutulması; (3) ikinci el cihaz devrinde basit bildirim usulü; (4) SDR kartlarının eğitim/hobi statüsü ile dual-use koşullarının rehberle açıklanması.</w:t>
-      </w:r>
-    </w:p>
-    <w:p>
-      <w:r>
-        <w:rPr>
-          <w:b/>
-        </w:rPr>
-        <w:t>Strateji Notu:</w:t>
-      </w:r>
-      <w:r>
-        <w:t xml:space="preserve"> Bu başlık, 'amatörler tehlike üretiyor' söylemini 'denetimsiz piyasa tehlike üretiyor; belgeli amatör çözüm ortağıdır' çerçevesine taşır. Toplu yasak kaygısına karşı ana savunma hattıdır.</w:t>
-      </w:r>
-    </w:p>
-    <w:p>
-      <w:r>
-        <w:t>Kaynak: BTK güvensiz cihaz duyurusu: btk.gov.tr/duyurular/kamuoyuna-duyurulur-guvensiz-oldugu-tespit-edilen-cihazlar; ARRL Lab spurious testleri: kb6nu.com/did-the-fcc-just-make-baofengs-illegal-short-answer-no</w:t>
+        <w:t xml:space="preserve">Kaynak: </w:t>
+      </w:r>
+      <w:r>
+        <w:t xml:space="preserve">BTK güvensiz cihaz duyurusu: btk.gov.tr/duyurular/kamuoyuna-duyurulur-guvensiz-oldugu-tespit-edilen-cihazlar; ARRL Lab spurious testleri: kb6nu.com/did-the-fcc-just-make-baofengs-illegal-short-answer-no</w:t>
       </w:r>
     </w:p>
     <w:p>
@@ -8555,53 +11604,355 @@
         <w:t xml:space="preserve"> KEGM Sınav Yönetmeliği Md.4/1e amatör istasyonun amaçları arasında afet ve acil durum haberleşmesini sayar; ancak AFAD veya diğer ulusal afet kurumlarıyla amatörleri kapsayan resmî bir protokol (MOU) yoktur. Geçmiş afetlerdeki fiilî katkılar plansız ve kayıt dışı kalmakta; bu boşluk hem kapasitenin verimsiz kullanımına hem de 'depremde lazım olur' söyleminin kural ihlallerine kılıf yapılmasına zemin hazırlamaktadır. Amatörlüğün kamu yararı kurumsal kayda bağlanmamıştır.</w:t>
       </w:r>
     </w:p>
+    <w:tbl>
+      <w:tblPr>
+        <w:tblW w:w="9026" w:type="dxa"/>
+        <w:tblInd w:w="110" w:type="dxa"/>
+        <w:tblBorders>
+          <w:top w:val="single" w:sz="4" w:space="0" w:color="auto"/>
+          <w:left w:val="single" w:sz="4" w:space="0" w:color="auto"/>
+          <w:bottom w:val="single" w:sz="4" w:space="0" w:color="auto"/>
+          <w:right w:val="single" w:sz="4" w:space="0" w:color="auto"/>
+          <w:insideH w:val="single" w:sz="4" w:space="0" w:color="auto"/>
+          <w:insideV w:val="single" w:sz="4" w:space="0" w:color="auto"/>
+        </w:tblBorders>
+        <w:tblCellMar>
+          <w:left w:w="10" w:type="dxa"/>
+          <w:right w:w="10" w:type="dxa"/>
+        </w:tblCellMar>
+        <w:tblLook w:val="0000"/>
+      </w:tblPr>
+      <w:tblGrid>
+        <w:gridCol w:w="1400"/>
+        <w:gridCol w:w="7626"/>
+      </w:tblGrid>
+      <w:tr>
+        <w:tc>
+          <w:tcPr>
+            <w:tcW w:w="1400" w:type="dxa"/>
+            <w:tcBorders>
+              <w:top w:val="single" w:sz="1" w:space="0" w:color="2E75B6"/>
+              <w:left w:val="single" w:sz="1" w:space="0" w:color="2E75B6"/>
+              <w:bottom w:val="single" w:sz="1" w:space="0" w:color="2E75B6"/>
+              <w:right w:val="single" w:sz="1" w:space="0" w:color="2E75B6"/>
+            </w:tcBorders>
+            <w:shd w:val="clear" w:color="auto" w:fill="2E75B6"/>
+            <w:tcMar>
+              <w:top w:w="80" w:type="dxa"/>
+              <w:left w:w="120" w:type="dxa"/>
+              <w:bottom w:w="80" w:type="dxa"/>
+              <w:right w:w="120" w:type="dxa"/>
+            </w:tcMar>
+            <w:vAlign w:val="center"/>
+          </w:tcPr>
+          <w:p>
+            <w:r>
+              <w:rPr>
+                <w:b/>
+                <w:bCs/>
+                <w:color w:val="FFFFFF"/>
+                <w:sz w:val="17"/>
+                <w:szCs w:val="17"/>
+              </w:rPr>
+              <w:t>TR Mevzuatı</w:t>
+            </w:r>
+          </w:p>
+        </w:tc>
+        <w:tc>
+          <w:tcPr>
+            <w:tcW w:w="7626" w:type="dxa"/>
+            <w:tcBorders>
+              <w:top w:val="single" w:sz="1" w:space="0" w:color="2E75B6"/>
+              <w:left w:val="single" w:sz="1" w:space="0" w:color="2E75B6"/>
+              <w:bottom w:val="single" w:sz="1" w:space="0" w:color="2E75B6"/>
+              <w:right w:val="single" w:sz="1" w:space="0" w:color="2E75B6"/>
+            </w:tcBorders>
+            <w:shd w:val="clear" w:color="auto" w:fill="D6E4F0"/>
+            <w:tcMar>
+              <w:top w:w="80" w:type="dxa"/>
+              <w:left w:w="160" w:type="dxa"/>
+              <w:bottom w:w="80" w:type="dxa"/>
+              <w:right w:w="120" w:type="dxa"/>
+            </w:tcMar>
+          </w:tcPr>
+          <w:p>
+            <w:r>
+              <w:rPr>
+                <w:i/>
+                <w:iCs/>
+                <w:sz w:val="18"/>
+                <w:szCs w:val="18"/>
+              </w:rPr>
+              <w:t>KEGM Sınav Yönetmeliği Md.4/1e (RG 27482); AFAD mevzuatında (7269 sayılı Kanun ve ilgili yönetmelikler) amatör telsiz rolü tanımsız.</w:t>
+            </w:r>
+          </w:p>
+        </w:tc>
+      </w:tr>
+    </w:tbl>
+    <w:tbl>
+      <w:tblPr>
+        <w:tblW w:w="9026" w:type="dxa"/>
+        <w:tblInd w:w="110" w:type="dxa"/>
+        <w:tblBorders>
+          <w:top w:val="single" w:sz="4" w:space="0" w:color="auto"/>
+          <w:left w:val="single" w:sz="4" w:space="0" w:color="auto"/>
+          <w:bottom w:val="single" w:sz="4" w:space="0" w:color="auto"/>
+          <w:right w:val="single" w:sz="4" w:space="0" w:color="auto"/>
+          <w:insideH w:val="single" w:sz="4" w:space="0" w:color="auto"/>
+          <w:insideV w:val="single" w:sz="4" w:space="0" w:color="auto"/>
+        </w:tblBorders>
+        <w:tblCellMar>
+          <w:left w:w="10" w:type="dxa"/>
+          <w:right w:w="10" w:type="dxa"/>
+        </w:tblCellMar>
+        <w:tblLook w:val="0000"/>
+      </w:tblPr>
+      <w:tblGrid>
+        <w:gridCol w:w="1400"/>
+        <w:gridCol w:w="7626"/>
+      </w:tblGrid>
+      <w:tr>
+        <w:tc>
+          <w:tcPr>
+            <w:tcW w:w="1400" w:type="dxa"/>
+            <w:tcBorders>
+              <w:top w:val="single" w:sz="1" w:space="0" w:color="2E75B6"/>
+              <w:left w:val="single" w:sz="1" w:space="0" w:color="2E75B6"/>
+              <w:bottom w:val="single" w:sz="1" w:space="0" w:color="2E75B6"/>
+              <w:right w:val="single" w:sz="1" w:space="0" w:color="2E75B6"/>
+            </w:tcBorders>
+            <w:shd w:val="clear" w:color="auto" w:fill="2E75B6"/>
+            <w:tcMar>
+              <w:top w:w="80" w:type="dxa"/>
+              <w:left w:w="120" w:type="dxa"/>
+              <w:bottom w:w="80" w:type="dxa"/>
+              <w:right w:w="120" w:type="dxa"/>
+            </w:tcMar>
+            <w:vAlign w:val="center"/>
+          </w:tcPr>
+          <w:p>
+            <w:r>
+              <w:rPr>
+                <w:b/>
+                <w:bCs/>
+                <w:color w:val="FFFFFF"/>
+                <w:sz w:val="17"/>
+                <w:szCs w:val="17"/>
+              </w:rPr>
+              <w:t>IARU / CEPT ve Diğer Ülkeler</w:t>
+            </w:r>
+          </w:p>
+        </w:tc>
+        <w:tc>
+          <w:tcPr>
+            <w:tcW w:w="7626" w:type="dxa"/>
+            <w:tcBorders>
+              <w:top w:val="single" w:sz="1" w:space="0" w:color="2E75B6"/>
+              <w:left w:val="single" w:sz="1" w:space="0" w:color="2E75B6"/>
+              <w:bottom w:val="single" w:sz="1" w:space="0" w:color="2E75B6"/>
+              <w:right w:val="single" w:sz="1" w:space="0" w:color="2E75B6"/>
+            </w:tcBorders>
+            <w:shd w:val="clear" w:color="auto" w:fill="E2EFDA"/>
+            <w:tcMar>
+              <w:top w:w="80" w:type="dxa"/>
+              <w:left w:w="160" w:type="dxa"/>
+              <w:bottom w:w="80" w:type="dxa"/>
+              <w:right w:w="120" w:type="dxa"/>
+            </w:tcMar>
+          </w:tcPr>
+          <w:p>
+            <w:r>
+              <w:rPr>
+                <w:i/>
+                <w:iCs/>
+                <w:sz w:val="18"/>
+                <w:szCs w:val="18"/>
+              </w:rPr>
+              <w:t>IARU ETG (Emergency Telecommunications Guide — Türkçe baskısı mevcut): ulusal afet kurumlarıyla MOU çerçevesi önerir. DE: DARC-BBK işbirliği; AT: benzer model; US: ARES/RACES-FEMA ilişkisi.</w:t>
+            </w:r>
+          </w:p>
+        </w:tc>
+      </w:tr>
+    </w:tbl>
+    <w:tbl>
+      <w:tblPr>
+        <w:tblW w:w="9026" w:type="dxa"/>
+        <w:tblInd w:w="110" w:type="dxa"/>
+        <w:tblBorders>
+          <w:top w:val="single" w:sz="4" w:space="0" w:color="auto"/>
+          <w:left w:val="single" w:sz="4" w:space="0" w:color="auto"/>
+          <w:bottom w:val="single" w:sz="4" w:space="0" w:color="auto"/>
+          <w:right w:val="single" w:sz="4" w:space="0" w:color="auto"/>
+          <w:insideH w:val="single" w:sz="4" w:space="0" w:color="auto"/>
+          <w:insideV w:val="single" w:sz="4" w:space="0" w:color="auto"/>
+        </w:tblBorders>
+        <w:tblCellMar>
+          <w:left w:w="10" w:type="dxa"/>
+          <w:right w:w="10" w:type="dxa"/>
+        </w:tblCellMar>
+        <w:tblLook w:val="0000"/>
+      </w:tblPr>
+      <w:tblGrid>
+        <w:gridCol w:w="1400"/>
+        <w:gridCol w:w="7626"/>
+      </w:tblGrid>
+      <w:tr>
+        <w:tc>
+          <w:tcPr>
+            <w:tcW w:w="1400" w:type="dxa"/>
+            <w:tcBorders>
+              <w:top w:val="single" w:sz="1" w:space="0" w:color="2E75B6"/>
+              <w:left w:val="single" w:sz="1" w:space="0" w:color="2E75B6"/>
+              <w:bottom w:val="single" w:sz="1" w:space="0" w:color="2E75B6"/>
+              <w:right w:val="single" w:sz="1" w:space="0" w:color="2E75B6"/>
+            </w:tcBorders>
+            <w:shd w:val="clear" w:color="auto" w:fill="2E75B6"/>
+            <w:tcMar>
+              <w:top w:w="80" w:type="dxa"/>
+              <w:left w:w="120" w:type="dxa"/>
+              <w:bottom w:w="80" w:type="dxa"/>
+              <w:right w:w="120" w:type="dxa"/>
+            </w:tcMar>
+            <w:vAlign w:val="center"/>
+          </w:tcPr>
+          <w:p>
+            <w:r>
+              <w:rPr>
+                <w:b/>
+                <w:bCs/>
+                <w:color w:val="FFFFFF"/>
+                <w:sz w:val="17"/>
+                <w:szCs w:val="17"/>
+              </w:rPr>
+              <w:t>Öneri / Talep</w:t>
+            </w:r>
+          </w:p>
+        </w:tc>
+        <w:tc>
+          <w:tcPr>
+            <w:tcW w:w="7626" w:type="dxa"/>
+            <w:tcBorders>
+              <w:top w:val="single" w:sz="1" w:space="0" w:color="2E75B6"/>
+              <w:left w:val="single" w:sz="1" w:space="0" w:color="2E75B6"/>
+              <w:bottom w:val="single" w:sz="1" w:space="0" w:color="2E75B6"/>
+              <w:right w:val="single" w:sz="1" w:space="0" w:color="2E75B6"/>
+            </w:tcBorders>
+            <w:shd w:val="clear" w:color="auto" w:fill="FCE4D6"/>
+            <w:tcMar>
+              <w:top w:w="80" w:type="dxa"/>
+              <w:left w:w="160" w:type="dxa"/>
+              <w:bottom w:w="80" w:type="dxa"/>
+              <w:right w:w="120" w:type="dxa"/>
+            </w:tcMar>
+          </w:tcPr>
+          <w:p>
+            <w:r>
+              <w:rPr>
+                <w:i/>
+                <w:iCs/>
+                <w:sz w:val="18"/>
+                <w:szCs w:val="18"/>
+              </w:rPr>
+              <w:t>AFAD + KEGM/BTK'dan Talep: (1) Amatör telsiz dernek ve kulüplerini kapsayan ulusal afet haberleşme protokolü (MOU); (2) il AFAD müdürlükleri ile kulüpler arasında eşleşme ve ortak tatbikat usulü; (3) afet planlarında amatör frekans ve rollerinin tanımlanması.</w:t>
+            </w:r>
+          </w:p>
+        </w:tc>
+      </w:tr>
+    </w:tbl>
+    <w:tbl>
+      <w:tblPr>
+        <w:tblW w:w="9026" w:type="dxa"/>
+        <w:tblInd w:w="110" w:type="dxa"/>
+        <w:tblBorders>
+          <w:top w:val="single" w:sz="4" w:space="0" w:color="auto"/>
+          <w:left w:val="single" w:sz="4" w:space="0" w:color="auto"/>
+          <w:bottom w:val="single" w:sz="4" w:space="0" w:color="auto"/>
+          <w:right w:val="single" w:sz="4" w:space="0" w:color="auto"/>
+          <w:insideH w:val="single" w:sz="4" w:space="0" w:color="auto"/>
+          <w:insideV w:val="single" w:sz="4" w:space="0" w:color="auto"/>
+        </w:tblBorders>
+        <w:tblCellMar>
+          <w:left w:w="10" w:type="dxa"/>
+          <w:right w:w="10" w:type="dxa"/>
+        </w:tblCellMar>
+        <w:tblLook w:val="0000"/>
+      </w:tblPr>
+      <w:tblGrid>
+        <w:gridCol w:w="1400"/>
+        <w:gridCol w:w="7626"/>
+      </w:tblGrid>
+      <w:tr>
+        <w:tc>
+          <w:tcPr>
+            <w:tcW w:w="1400" w:type="dxa"/>
+            <w:tcBorders>
+              <w:top w:val="single" w:sz="1" w:space="0" w:color="2E75B6"/>
+              <w:left w:val="single" w:sz="1" w:space="0" w:color="2E75B6"/>
+              <w:bottom w:val="single" w:sz="1" w:space="0" w:color="2E75B6"/>
+              <w:right w:val="single" w:sz="1" w:space="0" w:color="2E75B6"/>
+            </w:tcBorders>
+            <w:shd w:val="clear" w:color="auto" w:fill="2E75B6"/>
+            <w:tcMar>
+              <w:top w:w="80" w:type="dxa"/>
+              <w:left w:w="120" w:type="dxa"/>
+              <w:bottom w:w="80" w:type="dxa"/>
+              <w:right w:w="120" w:type="dxa"/>
+            </w:tcMar>
+            <w:vAlign w:val="center"/>
+          </w:tcPr>
+          <w:p>
+            <w:r>
+              <w:rPr>
+                <w:b/>
+                <w:bCs/>
+                <w:color w:val="FFFFFF"/>
+                <w:sz w:val="17"/>
+                <w:szCs w:val="17"/>
+              </w:rPr>
+              <w:t>Strateji Notu</w:t>
+            </w:r>
+          </w:p>
+        </w:tc>
+        <w:tc>
+          <w:tcPr>
+            <w:tcW w:w="7626" w:type="dxa"/>
+            <w:tcBorders>
+              <w:top w:val="single" w:sz="1" w:space="0" w:color="2E75B6"/>
+              <w:left w:val="single" w:sz="1" w:space="0" w:color="2E75B6"/>
+              <w:bottom w:val="single" w:sz="1" w:space="0" w:color="2E75B6"/>
+              <w:right w:val="single" w:sz="1" w:space="0" w:color="2E75B6"/>
+            </w:tcBorders>
+            <w:shd w:val="clear" w:color="auto" w:fill="FFF2CC"/>
+            <w:tcMar>
+              <w:top w:w="80" w:type="dxa"/>
+              <w:left w:w="160" w:type="dxa"/>
+              <w:bottom w:w="80" w:type="dxa"/>
+              <w:right w:w="120" w:type="dxa"/>
+            </w:tcMar>
+          </w:tcPr>
+          <w:p>
+            <w:r>
+              <w:rPr>
+                <w:i/>
+                <w:iCs/>
+                <w:sz w:val="18"/>
+                <w:szCs w:val="18"/>
+              </w:rPr>
+              <w:t>'Amatörlük yasaklanır' kaygısına karşı en güçlü pozitif dosya: kamu yararının resmîleştirilmesi. Afet rolü bahane değil, protokole bağlanması gereken gerçek bir kapasitedir.</w:t>
+            </w:r>
+          </w:p>
+        </w:tc>
+      </w:tr>
+    </w:tbl>
     <w:p>
       <w:r>
         <w:rPr>
           <w:b/>
         </w:rPr>
-        <w:t>TR Mevzuatı:</w:t>
-      </w:r>
-      <w:r>
-        <w:t xml:space="preserve"> KEGM Sınav Yönetmeliği Md.4/1e (RG 27482); AFAD mevzuatında (7269 sayılı Kanun ve ilgili yönetmelikler) amatör telsiz rolü tanımsız.</w:t>
-      </w:r>
-    </w:p>
-    <w:p>
-      <w:r>
-        <w:rPr>
-          <w:b/>
-        </w:rPr>
-        <w:t>IARU / CEPT ve Diğer Ülkeler:</w:t>
-      </w:r>
-      <w:r>
-        <w:t xml:space="preserve"> IARU ETG (Emergency Telecommunications Guide — Türkçe baskısı mevcut): ulusal afet kurumlarıyla MOU çerçevesi önerir. DE: DARC-BBK işbirliği; AT: benzer model; US: ARES/RACES-FEMA ilişkisi.</w:t>
-      </w:r>
-    </w:p>
-    <w:p>
-      <w:r>
-        <w:rPr>
-          <w:b/>
-        </w:rPr>
-        <w:t>Öneri / Talep:</w:t>
-      </w:r>
-      <w:r>
-        <w:t xml:space="preserve"> AFAD + KEGM/BTK'dan Talep: (1) Amatör telsiz dernek ve kulüplerini kapsayan ulusal afet haberleşme protokolü (MOU); (2) il AFAD müdürlükleri ile kulüpler arasında eşleşme ve ortak tatbikat usulü; (3) afet planlarında amatör frekans ve rollerinin tanımlanması.</w:t>
-      </w:r>
-    </w:p>
-    <w:p>
-      <w:r>
-        <w:rPr>
-          <w:b/>
-        </w:rPr>
-        <w:t>Strateji Notu:</w:t>
-      </w:r>
-      <w:r>
-        <w:t xml:space="preserve"> 'Amatörlük yasaklanır' kaygısına karşı en güçlü pozitif dosya: kamu yararının resmîleştirilmesi. Afet rolü bahane değil, protokole bağlanması gereken gerçek bir kapasitedir.</w:t>
-      </w:r>
-    </w:p>
-    <w:p>
-      <w:r>
-        <w:t>Kaynak: IARU ETG: iaru-r1.org/on-the-air/emergency-communications/</w:t>
+        <w:t xml:space="preserve">Kaynak: </w:t>
+      </w:r>
+      <w:r>
+        <w:t xml:space="preserve">IARU ETG: iaru-r1.org/on-the-air/emergency-communications/</w:t>
       </w:r>
     </w:p>
     <w:p>

</xml_diff>